<commit_message>
allow export without powerkey
+ suppress errors
</commit_message>
<xml_diff>
--- a/Changelog.docx
+++ b/Changelog.docx
@@ -60,7 +60,7 @@
         <w:rPr>
           <w:lang w:val="en-US"/>
         </w:rPr>
-        <w:t>1</w:t>
+        <w:t>3</w:t>
       </w:r>
       <w:r>
         <w:rPr>
@@ -78,13 +78,19 @@
         <w:rPr>
           <w:lang w:val="en-US"/>
         </w:rPr>
-        <w:t>27</w:t>
-      </w:r>
-      <w:r>
-        <w:rPr>
-          <w:lang w:val="en-US"/>
-        </w:rPr>
-        <w:t>.11.2025</w:t>
+        <w:t>9</w:t>
+      </w:r>
+      <w:r>
+        <w:rPr>
+          <w:lang w:val="en-US"/>
+        </w:rPr>
+        <w:t>.1.202</w:t>
+      </w:r>
+      <w:r>
+        <w:rPr>
+          <w:lang w:val="en-US"/>
+        </w:rPr>
+        <w:t>6</w:t>
       </w:r>
     </w:p>
     <w:p>
@@ -144,19 +150,367 @@
           <w:lang w:val="en-US"/>
         </w:rPr>
       </w:pPr>
-      <w:proofErr w:type="gramStart"/>
-      <w:r>
-        <w:rPr>
-          <w:lang w:val="en-US"/>
-        </w:rPr>
-        <w:t>System.Runtime.InteropServices.COMException</w:t>
-      </w:r>
-      <w:proofErr w:type="gramEnd"/>
-      <w:r>
-        <w:rPr>
-          <w:lang w:val="en-US"/>
-        </w:rPr>
-        <w:t xml:space="preserve"> (0x80080005): Provádění serveru selhalo (0x80080005 (CO_E_SERVER_EXEC_FAILURE))</w:t>
+      <w:r>
+        <w:rPr>
+          <w:lang w:val="en-US"/>
+        </w:rPr>
+        <w:t>Export lze provádět i bez PowerKey – údaje budou nastaveny na nulové hodnoty</w:t>
+      </w:r>
+    </w:p>
+    <w:p>
+      <w:pPr>
+        <w:pStyle w:val="Nadpis3"/>
+        <w:rPr>
+          <w:lang w:val="en-US"/>
+        </w:rPr>
+      </w:pPr>
+      <w:r>
+        <w:rPr>
+          <w:lang w:val="en-US"/>
+        </w:rPr>
+        <w:t>Změněno</w:t>
+      </w:r>
+    </w:p>
+    <w:p>
+      <w:pPr>
+        <w:pStyle w:val="Odstavecseseznamem"/>
+        <w:numPr>
+          <w:ilvl w:val="0"/>
+          <w:numId w:val="7"/>
+        </w:numPr>
+        <w:rPr>
+          <w:lang w:val="en-US"/>
+        </w:rPr>
+      </w:pPr>
+      <w:r>
+        <w:t>Dočasně umlčeny chybové hlášky (připojení k PowerKey stále nebylo opraveno)</w:t>
+      </w:r>
+    </w:p>
+    <w:p>
+      <w:pPr>
+        <w:pStyle w:val="Nadpis3"/>
+        <w:rPr>
+          <w:lang w:val="en-US"/>
+        </w:rPr>
+      </w:pPr>
+      <w:r>
+        <w:rPr>
+          <w:lang w:val="en-US"/>
+        </w:rPr>
+        <w:t>Odebráno</w:t>
+      </w:r>
+    </w:p>
+    <w:p>
+      <w:pPr>
+        <w:pStyle w:val="Odstavecseseznamem"/>
+        <w:numPr>
+          <w:ilvl w:val="0"/>
+          <w:numId w:val="7"/>
+        </w:numPr>
+        <w:rPr>
+          <w:lang w:val="en-US"/>
+        </w:rPr>
+      </w:pPr>
+    </w:p>
+    <w:p>
+      <w:pPr>
+        <w:rPr>
+          <w:rFonts w:eastAsiaTheme="majorEastAsia" w:cstheme="majorBidi"/>
+          <w:color w:val="0F4761" w:themeColor="accent1" w:themeShade="BF"/>
+          <w:sz w:val="28"/>
+          <w:szCs w:val="28"/>
+          <w:lang w:val="en-US"/>
+        </w:rPr>
+      </w:pPr>
+      <w:r>
+        <w:rPr>
+          <w:lang w:val="en-US"/>
+        </w:rPr>
+        <w:br w:type="page"/>
+      </w:r>
+    </w:p>
+    <w:p>
+      <w:pPr>
+        <w:pStyle w:val="Nadpis2"/>
+        <w:rPr>
+          <w:lang w:val="en-US"/>
+        </w:rPr>
+      </w:pPr>
+      <w:r>
+        <w:rPr>
+          <w:lang w:val="en-US"/>
+        </w:rPr>
+        <w:lastRenderedPageBreak/>
+        <w:t>Verze 1.</w:t>
+      </w:r>
+      <w:r>
+        <w:rPr>
+          <w:lang w:val="en-US"/>
+        </w:rPr>
+        <w:t>4</w:t>
+      </w:r>
+      <w:r>
+        <w:rPr>
+          <w:lang w:val="en-US"/>
+        </w:rPr>
+        <w:t>.</w:t>
+      </w:r>
+      <w:r>
+        <w:rPr>
+          <w:lang w:val="en-US"/>
+        </w:rPr>
+        <w:t>0.2</w:t>
+      </w:r>
+      <w:r>
+        <w:rPr>
+          <w:lang w:val="en-US"/>
+        </w:rPr>
+        <w:t xml:space="preserve"> </w:t>
+      </w:r>
+      <w:r>
+        <w:rPr>
+          <w:lang w:val="en-US"/>
+        </w:rPr>
+        <w:t>– 15.12.2025</w:t>
+      </w:r>
+    </w:p>
+    <w:p>
+      <w:pPr>
+        <w:pStyle w:val="Nadpis3"/>
+        <w:rPr>
+          <w:lang w:val="en-US"/>
+        </w:rPr>
+      </w:pPr>
+      <w:r>
+        <w:rPr>
+          <w:lang w:val="en-US"/>
+        </w:rPr>
+        <w:t>Přidáno</w:t>
+      </w:r>
+    </w:p>
+    <w:p>
+      <w:pPr>
+        <w:pStyle w:val="Odstavecseseznamem"/>
+        <w:numPr>
+          <w:ilvl w:val="0"/>
+          <w:numId w:val="8"/>
+        </w:numPr>
+        <w:rPr>
+          <w:lang w:val="en-US"/>
+        </w:rPr>
+      </w:pPr>
+    </w:p>
+    <w:p>
+      <w:pPr>
+        <w:pStyle w:val="Nadpis3"/>
+        <w:rPr>
+          <w:lang w:val="en-US"/>
+        </w:rPr>
+      </w:pPr>
+      <w:r>
+        <w:rPr>
+          <w:lang w:val="en-US"/>
+        </w:rPr>
+        <w:t>Opraveno</w:t>
+      </w:r>
+      <w:r>
+        <w:rPr>
+          <w:lang w:val="en-US"/>
+        </w:rPr>
+        <w:t xml:space="preserve"> </w:t>
+      </w:r>
+    </w:p>
+    <w:p>
+      <w:pPr>
+        <w:pStyle w:val="Odstavecseseznamem"/>
+        <w:numPr>
+          <w:ilvl w:val="0"/>
+          <w:numId w:val="7"/>
+        </w:numPr>
+        <w:rPr>
+          <w:lang w:val="en-US"/>
+        </w:rPr>
+      </w:pPr>
+    </w:p>
+    <w:p>
+      <w:pPr>
+        <w:pStyle w:val="Nadpis3"/>
+        <w:rPr>
+          <w:lang w:val="en-US"/>
+        </w:rPr>
+      </w:pPr>
+      <w:r>
+        <w:rPr>
+          <w:lang w:val="en-US"/>
+        </w:rPr>
+        <w:t>Změněno</w:t>
+      </w:r>
+    </w:p>
+    <w:p>
+      <w:pPr>
+        <w:pStyle w:val="Odstavecseseznamem"/>
+        <w:numPr>
+          <w:ilvl w:val="0"/>
+          <w:numId w:val="7"/>
+        </w:numPr>
+        <w:rPr>
+          <w:lang w:val="en-US"/>
+        </w:rPr>
+      </w:pPr>
+      <w:r>
+        <w:t>Dočasná úprava, aby šlo zapisovat hodiny i bez načtených příchodů a odchodů, než ajťáci opraví powerkey.</w:t>
+      </w:r>
+    </w:p>
+    <w:p>
+      <w:pPr>
+        <w:pStyle w:val="Nadpis3"/>
+        <w:rPr>
+          <w:lang w:val="en-US"/>
+        </w:rPr>
+      </w:pPr>
+      <w:r>
+        <w:rPr>
+          <w:lang w:val="en-US"/>
+        </w:rPr>
+        <w:t>Odebráno</w:t>
+      </w:r>
+    </w:p>
+    <w:p>
+      <w:pPr>
+        <w:pStyle w:val="Odstavecseseznamem"/>
+        <w:numPr>
+          <w:ilvl w:val="0"/>
+          <w:numId w:val="7"/>
+        </w:numPr>
+        <w:rPr>
+          <w:lang w:val="en-US"/>
+        </w:rPr>
+      </w:pPr>
+    </w:p>
+    <w:p>
+      <w:pPr>
+        <w:rPr>
+          <w:rFonts w:eastAsiaTheme="majorEastAsia" w:cstheme="majorBidi"/>
+          <w:color w:val="0F4761" w:themeColor="accent1" w:themeShade="BF"/>
+          <w:sz w:val="28"/>
+          <w:szCs w:val="28"/>
+          <w:lang w:val="en-US"/>
+        </w:rPr>
+      </w:pPr>
+      <w:r>
+        <w:rPr>
+          <w:lang w:val="en-US"/>
+        </w:rPr>
+        <w:br w:type="page"/>
+      </w:r>
+    </w:p>
+    <w:p>
+      <w:pPr>
+        <w:pStyle w:val="Nadpis2"/>
+        <w:rPr>
+          <w:lang w:val="en-US"/>
+        </w:rPr>
+      </w:pPr>
+      <w:r>
+        <w:rPr>
+          <w:lang w:val="en-US"/>
+        </w:rPr>
+        <w:lastRenderedPageBreak/>
+        <w:t>Verze 1.</w:t>
+      </w:r>
+      <w:r>
+        <w:rPr>
+          <w:lang w:val="en-US"/>
+        </w:rPr>
+        <w:t>4</w:t>
+      </w:r>
+      <w:r>
+        <w:rPr>
+          <w:lang w:val="en-US"/>
+        </w:rPr>
+        <w:t>.</w:t>
+      </w:r>
+      <w:r>
+        <w:rPr>
+          <w:lang w:val="en-US"/>
+        </w:rPr>
+        <w:t>0.1</w:t>
+      </w:r>
+      <w:r>
+        <w:rPr>
+          <w:lang w:val="en-US"/>
+        </w:rPr>
+        <w:t xml:space="preserve"> </w:t>
+      </w:r>
+      <w:r>
+        <w:rPr>
+          <w:lang w:val="en-US"/>
+        </w:rPr>
+        <w:t>– 27.11.2025</w:t>
+      </w:r>
+    </w:p>
+    <w:p>
+      <w:pPr>
+        <w:pStyle w:val="Nadpis3"/>
+        <w:rPr>
+          <w:lang w:val="en-US"/>
+        </w:rPr>
+      </w:pPr>
+      <w:r>
+        <w:rPr>
+          <w:lang w:val="en-US"/>
+        </w:rPr>
+        <w:t>Přidáno</w:t>
+      </w:r>
+    </w:p>
+    <w:p>
+      <w:pPr>
+        <w:pStyle w:val="Odstavecseseznamem"/>
+        <w:numPr>
+          <w:ilvl w:val="0"/>
+          <w:numId w:val="8"/>
+        </w:numPr>
+        <w:rPr>
+          <w:lang w:val="en-US"/>
+        </w:rPr>
+      </w:pPr>
+    </w:p>
+    <w:p>
+      <w:pPr>
+        <w:pStyle w:val="Nadpis3"/>
+        <w:rPr>
+          <w:lang w:val="en-US"/>
+        </w:rPr>
+      </w:pPr>
+      <w:r>
+        <w:rPr>
+          <w:lang w:val="en-US"/>
+        </w:rPr>
+        <w:t>Opraveno</w:t>
+      </w:r>
+      <w:r>
+        <w:rPr>
+          <w:lang w:val="en-US"/>
+        </w:rPr>
+        <w:t xml:space="preserve"> </w:t>
+      </w:r>
+    </w:p>
+    <w:p>
+      <w:pPr>
+        <w:pStyle w:val="Odstavecseseznamem"/>
+        <w:numPr>
+          <w:ilvl w:val="0"/>
+          <w:numId w:val="7"/>
+        </w:numPr>
+        <w:rPr>
+          <w:lang w:val="en-US"/>
+        </w:rPr>
+      </w:pPr>
+      <w:r>
+        <w:rPr>
+          <w:lang w:val="en-US"/>
+        </w:rPr>
+        <w:t>System.Runtime.InteropServices.COMException (0x80080005): Provádění serveru selhalo (0x80080005 (CO_E_SERVER_EXEC_FAILURE))</w:t>
       </w:r>
     </w:p>
     <w:p>
@@ -1598,21 +1952,7 @@
           <w:lang w:val="en-US"/>
         </w:rPr>
         <w:br/>
-        <w:t xml:space="preserve">Jedná se pouze o tuto část vizualizace, na zapsané hodiny, ani indikátory příchodu </w:t>
-      </w:r>
-      <w:proofErr w:type="gramStart"/>
-      <w:r>
-        <w:rPr>
-          <w:lang w:val="en-US"/>
-        </w:rPr>
-        <w:t>a</w:t>
-      </w:r>
-      <w:proofErr w:type="gramEnd"/>
-      <w:r>
-        <w:rPr>
-          <w:lang w:val="en-US"/>
-        </w:rPr>
-        <w:t xml:space="preserve"> odchodu to nemá vliv.</w:t>
+        <w:t>Jedná se pouze o tuto část vizualizace, na zapsané hodiny, ani indikátory příchodu a odchodu to nemá vliv.</w:t>
       </w:r>
       <w:r>
         <w:rPr>
@@ -4585,14 +4925,7 @@
         <w:rPr>
           <w:lang w:val="en-US"/>
         </w:rPr>
-        <w:t>V nastaveni (horní lišta =</w:t>
-      </w:r>
-      <w:proofErr w:type="gramStart"/>
-      <w:r>
-        <w:rPr>
-          <w:lang w:val="en-US"/>
-        </w:rPr>
-        <w:t xml:space="preserve">&gt; </w:t>
+        <w:t xml:space="preserve">V nastaveni (horní lišta =&gt; </w:t>
       </w:r>
       <w:r>
         <w:rPr>
@@ -4602,7 +4935,6 @@
         </w:rPr>
         <w:t>?</w:t>
       </w:r>
-      <w:proofErr w:type="gramEnd"/>
       <w:r>
         <w:rPr>
           <w:lang w:val="en-US"/>
@@ -4844,14 +5176,7 @@
         <w:rPr>
           <w:lang w:val="en-US"/>
         </w:rPr>
-        <w:t>V nastavení (horní lišta =</w:t>
-      </w:r>
-      <w:proofErr w:type="gramStart"/>
-      <w:r>
-        <w:rPr>
-          <w:lang w:val="en-US"/>
-        </w:rPr>
-        <w:t xml:space="preserve">&gt; </w:t>
+        <w:t xml:space="preserve">V nastavení (horní lišta =&gt; </w:t>
       </w:r>
       <w:r>
         <w:rPr>
@@ -4861,7 +5186,6 @@
         </w:rPr>
         <w:t>?</w:t>
       </w:r>
-      <w:proofErr w:type="gramEnd"/>
       <w:r>
         <w:rPr>
           <w:lang w:val="en-US"/>
@@ -10689,6 +11013,7 @@
   <w:style w:type="character" w:default="1" w:styleId="Standardnpsmoodstavce">
     <w:name w:val="Default Paragraph Font"/>
     <w:uiPriority w:val="1"/>
+    <w:semiHidden/>
     <w:unhideWhenUsed/>
   </w:style>
   <w:style w:type="table" w:default="1" w:styleId="Normlntabulka">

</xml_diff>

<commit_message>
revert temp error suppress due to powerkey malfunc
+ started a different way to count total hours per user for export
</commit_message>
<xml_diff>
--- a/Changelog.docx
+++ b/Changelog.docx
@@ -60,7 +60,215 @@
         <w:rPr>
           <w:lang w:val="en-US"/>
         </w:rPr>
+        <w:t>5</w:t>
+      </w:r>
+      <w:r>
+        <w:rPr>
+          <w:lang w:val="en-US"/>
+        </w:rPr>
+        <w:t xml:space="preserve"> </w:t>
+      </w:r>
+      <w:r>
+        <w:rPr>
+          <w:lang w:val="en-US"/>
+        </w:rPr>
+        <w:t>– 9.1.2026</w:t>
+      </w:r>
+    </w:p>
+    <w:p>
+      <w:pPr>
+        <w:pStyle w:val="Nadpis3"/>
+        <w:rPr>
+          <w:lang w:val="en-US"/>
+        </w:rPr>
+      </w:pPr>
+      <w:r>
+        <w:rPr>
+          <w:lang w:val="en-US"/>
+        </w:rPr>
+        <w:t>Přidáno</w:t>
+      </w:r>
+    </w:p>
+    <w:p>
+      <w:pPr>
+        <w:pStyle w:val="Odstavecseseznamem"/>
+        <w:numPr>
+          <w:ilvl w:val="0"/>
+          <w:numId w:val="8"/>
+        </w:numPr>
+        <w:rPr>
+          <w:lang w:val="en-US"/>
+        </w:rPr>
+      </w:pPr>
+    </w:p>
+    <w:p>
+      <w:pPr>
+        <w:pStyle w:val="Nadpis3"/>
+        <w:rPr>
+          <w:lang w:val="en-US"/>
+        </w:rPr>
+      </w:pPr>
+      <w:r>
+        <w:rPr>
+          <w:lang w:val="en-US"/>
+        </w:rPr>
+        <w:t>Opraveno</w:t>
+      </w:r>
+      <w:r>
+        <w:rPr>
+          <w:lang w:val="en-US"/>
+        </w:rPr>
+        <w:t xml:space="preserve"> </w:t>
+      </w:r>
+    </w:p>
+    <w:p>
+      <w:pPr>
+        <w:pStyle w:val="Odstavecseseznamem"/>
+        <w:numPr>
+          <w:ilvl w:val="0"/>
+          <w:numId w:val="7"/>
+        </w:numPr>
+        <w:rPr>
+          <w:lang w:val="en-US"/>
+        </w:rPr>
+      </w:pPr>
+    </w:p>
+    <w:p>
+      <w:pPr>
+        <w:pStyle w:val="Nadpis3"/>
+        <w:rPr>
+          <w:lang w:val="en-US"/>
+        </w:rPr>
+      </w:pPr>
+      <w:r>
+        <w:rPr>
+          <w:lang w:val="en-US"/>
+        </w:rPr>
+        <w:t>Změněno</w:t>
+      </w:r>
+    </w:p>
+    <w:p>
+      <w:pPr>
+        <w:pStyle w:val="Odstavecseseznamem"/>
+        <w:numPr>
+          <w:ilvl w:val="0"/>
+          <w:numId w:val="7"/>
+        </w:numPr>
+        <w:rPr>
+          <w:lang w:val="en-US"/>
+        </w:rPr>
+      </w:pPr>
+      <w:r>
+        <w:rPr>
+          <w:lang w:val="en-US"/>
+        </w:rPr>
+        <w:t xml:space="preserve">Zprovozněna funkcionalita </w:t>
+      </w:r>
+      <w:r>
+        <w:rPr>
+          <w:lang w:val="en-US"/>
+        </w:rPr>
+        <w:t>powerkey (</w:t>
+      </w:r>
+      <w:r>
+        <w:rPr>
+          <w:lang w:val="en-US"/>
+        </w:rPr>
+        <w:t>ukazatel</w:t>
+      </w:r>
+      <w:r>
+        <w:rPr>
+          <w:lang w:val="en-US"/>
+        </w:rPr>
+        <w:t>e</w:t>
+      </w:r>
+      <w:r>
+        <w:rPr>
+          <w:lang w:val="en-US"/>
+        </w:rPr>
+        <w:t xml:space="preserve"> příchodů a odchodů</w:t>
+      </w:r>
+      <w:r>
+        <w:rPr>
+          <w:lang w:val="en-US"/>
+        </w:rPr>
+        <w:t xml:space="preserve"> atd)</w:t>
+      </w:r>
+    </w:p>
+    <w:p>
+      <w:pPr>
+        <w:pStyle w:val="Nadpis3"/>
+        <w:rPr>
+          <w:lang w:val="en-US"/>
+        </w:rPr>
+      </w:pPr>
+      <w:r>
+        <w:rPr>
+          <w:lang w:val="en-US"/>
+        </w:rPr>
+        <w:t>Odebráno</w:t>
+      </w:r>
+    </w:p>
+    <w:p>
+      <w:pPr>
+        <w:pStyle w:val="Odstavecseseznamem"/>
+        <w:numPr>
+          <w:ilvl w:val="0"/>
+          <w:numId w:val="7"/>
+        </w:numPr>
+        <w:rPr>
+          <w:lang w:val="en-US"/>
+        </w:rPr>
+      </w:pPr>
+    </w:p>
+    <w:p>
+      <w:pPr>
+        <w:rPr>
+          <w:rFonts w:asciiTheme="majorHAnsi" w:eastAsiaTheme="majorEastAsia" w:hAnsiTheme="majorHAnsi" w:cstheme="majorBidi"/>
+          <w:color w:val="0F4761" w:themeColor="accent1" w:themeShade="BF"/>
+          <w:sz w:val="32"/>
+          <w:szCs w:val="32"/>
+          <w:lang w:val="en-US"/>
+        </w:rPr>
+      </w:pPr>
+      <w:r>
+        <w:rPr>
+          <w:lang w:val="en-US"/>
+        </w:rPr>
+        <w:br w:type="page"/>
+      </w:r>
+    </w:p>
+    <w:p>
+      <w:pPr>
+        <w:pStyle w:val="Nadpis2"/>
+        <w:rPr>
+          <w:lang w:val="en-US"/>
+        </w:rPr>
+      </w:pPr>
+      <w:r>
+        <w:rPr>
+          <w:lang w:val="en-US"/>
+        </w:rPr>
+        <w:lastRenderedPageBreak/>
+        <w:t>Verze 1.</w:t>
+      </w:r>
+      <w:r>
+        <w:rPr>
+          <w:lang w:val="en-US"/>
+        </w:rPr>
         <w:t>4</w:t>
+      </w:r>
+      <w:r>
+        <w:rPr>
+          <w:lang w:val="en-US"/>
+        </w:rPr>
+        <w:t>.</w:t>
+      </w:r>
+      <w:r>
+        <w:rPr>
+          <w:lang w:val="en-US"/>
+        </w:rPr>
+        <w:t>0.4</w:t>
       </w:r>
       <w:r>
         <w:rPr>
@@ -673,19 +881,11 @@
           <w:lang w:val="en-US"/>
         </w:rPr>
       </w:pPr>
-      <w:proofErr w:type="gramStart"/>
-      <w:r>
-        <w:rPr>
-          <w:lang w:val="en-US"/>
-        </w:rPr>
-        <w:t>System.Runtime.InteropServices.COMException</w:t>
-      </w:r>
-      <w:proofErr w:type="gramEnd"/>
-      <w:r>
-        <w:rPr>
-          <w:lang w:val="en-US"/>
-        </w:rPr>
-        <w:t xml:space="preserve"> (0x80080005): Provádění serveru selhalo (0x80080005 (CO_E_SERVER_EXEC_FAILURE))</w:t>
+      <w:r>
+        <w:rPr>
+          <w:lang w:val="en-US"/>
+        </w:rPr>
+        <w:t>System.Runtime.InteropServices.COMException (0x80080005): Provádění serveru selhalo (0x80080005 (CO_E_SERVER_EXEC_FAILURE))</w:t>
       </w:r>
     </w:p>
     <w:p>
@@ -2127,21 +2327,7 @@
           <w:lang w:val="en-US"/>
         </w:rPr>
         <w:br/>
-        <w:t xml:space="preserve">Jedná se pouze o tuto část vizualizace, na zapsané hodiny, ani indikátory příchodu </w:t>
-      </w:r>
-      <w:proofErr w:type="gramStart"/>
-      <w:r>
-        <w:rPr>
-          <w:lang w:val="en-US"/>
-        </w:rPr>
-        <w:t>a</w:t>
-      </w:r>
-      <w:proofErr w:type="gramEnd"/>
-      <w:r>
-        <w:rPr>
-          <w:lang w:val="en-US"/>
-        </w:rPr>
-        <w:t xml:space="preserve"> odchodu to nemá vliv.</w:t>
+        <w:t>Jedná se pouze o tuto část vizualizace, na zapsané hodiny, ani indikátory příchodu a odchodu to nemá vliv.</w:t>
       </w:r>
       <w:r>
         <w:rPr>
@@ -5114,14 +5300,7 @@
         <w:rPr>
           <w:lang w:val="en-US"/>
         </w:rPr>
-        <w:t>V nastaveni (horní lišta =</w:t>
-      </w:r>
-      <w:proofErr w:type="gramStart"/>
-      <w:r>
-        <w:rPr>
-          <w:lang w:val="en-US"/>
-        </w:rPr>
-        <w:t xml:space="preserve">&gt; </w:t>
+        <w:t xml:space="preserve">V nastaveni (horní lišta =&gt; </w:t>
       </w:r>
       <w:r>
         <w:rPr>
@@ -5131,7 +5310,6 @@
         </w:rPr>
         <w:t>?</w:t>
       </w:r>
-      <w:proofErr w:type="gramEnd"/>
       <w:r>
         <w:rPr>
           <w:lang w:val="en-US"/>
@@ -5373,14 +5551,7 @@
         <w:rPr>
           <w:lang w:val="en-US"/>
         </w:rPr>
-        <w:t>V nastavení (horní lišta =</w:t>
-      </w:r>
-      <w:proofErr w:type="gramStart"/>
-      <w:r>
-        <w:rPr>
-          <w:lang w:val="en-US"/>
-        </w:rPr>
-        <w:t xml:space="preserve">&gt; </w:t>
+        <w:t xml:space="preserve">V nastavení (horní lišta =&gt; </w:t>
       </w:r>
       <w:r>
         <w:rPr>
@@ -5390,7 +5561,6 @@
         </w:rPr>
         <w:t>?</w:t>
       </w:r>
-      <w:proofErr w:type="gramEnd"/>
       <w:r>
         <w:rPr>
           <w:lang w:val="en-US"/>

</xml_diff>

<commit_message>
fix revert to old powerkey month conversion
bugfix column name mismatch
</commit_message>
<xml_diff>
--- a/Changelog.docx
+++ b/Changelog.docx
@@ -54,7 +54,257 @@
         <w:rPr>
           <w:lang w:val="en-US"/>
         </w:rPr>
-        <w:t>1</w:t>
+        <w:t>2</w:t>
+      </w:r>
+      <w:r>
+        <w:rPr>
+          <w:lang w:val="en-US"/>
+        </w:rPr>
+        <w:t>.0</w:t>
+      </w:r>
+      <w:r>
+        <w:rPr>
+          <w:lang w:val="en-US"/>
+        </w:rPr>
+        <w:t xml:space="preserve"> </w:t>
+      </w:r>
+      <w:r>
+        <w:rPr>
+          <w:lang w:val="en-US"/>
+        </w:rPr>
+        <w:t xml:space="preserve">– </w:t>
+      </w:r>
+      <w:r>
+        <w:rPr>
+          <w:lang w:val="en-US"/>
+        </w:rPr>
+        <w:t>15.4</w:t>
+      </w:r>
+      <w:r>
+        <w:rPr>
+          <w:lang w:val="en-US"/>
+        </w:rPr>
+        <w:t>.2026</w:t>
+      </w:r>
+    </w:p>
+    <w:p>
+      <w:pPr>
+        <w:pStyle w:val="Nadpis3"/>
+        <w:rPr>
+          <w:lang w:val="en-US"/>
+        </w:rPr>
+      </w:pPr>
+      <w:r>
+        <w:rPr>
+          <w:lang w:val="en-US"/>
+        </w:rPr>
+        <w:t>Přidáno</w:t>
+      </w:r>
+    </w:p>
+    <w:p>
+      <w:pPr>
+        <w:pStyle w:val="Odstavecseseznamem"/>
+        <w:numPr>
+          <w:ilvl w:val="0"/>
+          <w:numId w:val="8"/>
+        </w:numPr>
+        <w:rPr>
+          <w:lang w:val="en-US"/>
+        </w:rPr>
+      </w:pPr>
+      <w:r>
+        <w:rPr>
+          <w:lang w:val="en-US"/>
+        </w:rPr>
+        <w:t>Každý uživatel si může dělat export svých záznamů za specifický časový úsek</w:t>
+      </w:r>
+    </w:p>
+    <w:p>
+      <w:pPr>
+        <w:pStyle w:val="Odstavecseseznamem"/>
+        <w:numPr>
+          <w:ilvl w:val="1"/>
+          <w:numId w:val="8"/>
+        </w:numPr>
+        <w:rPr>
+          <w:lang w:val="en-US"/>
+        </w:rPr>
+      </w:pPr>
+      <w:r>
+        <w:rPr>
+          <w:lang w:val="en-US"/>
+        </w:rPr>
+        <w:t>Vlevo nahoře tlačítko Data =&gt; Export</w:t>
+      </w:r>
+    </w:p>
+    <w:p>
+      <w:pPr>
+        <w:pStyle w:val="Nadpis3"/>
+        <w:rPr>
+          <w:lang w:val="en-US"/>
+        </w:rPr>
+      </w:pPr>
+      <w:r>
+        <w:rPr>
+          <w:lang w:val="en-US"/>
+        </w:rPr>
+        <w:t>Opraveno</w:t>
+      </w:r>
+      <w:r>
+        <w:rPr>
+          <w:lang w:val="en-US"/>
+        </w:rPr>
+        <w:t xml:space="preserve"> </w:t>
+      </w:r>
+    </w:p>
+    <w:p>
+      <w:pPr>
+        <w:pStyle w:val="Odstavecseseznamem"/>
+        <w:numPr>
+          <w:ilvl w:val="0"/>
+          <w:numId w:val="7"/>
+        </w:numPr>
+        <w:rPr>
+          <w:lang w:val="en-US"/>
+        </w:rPr>
+      </w:pPr>
+      <w:r>
+        <w:rPr>
+          <w:lang w:val="en-US"/>
+        </w:rPr>
+        <w:t>V exportu se již správně ukazují hodiny z PowerKey</w:t>
+      </w:r>
+    </w:p>
+    <w:p>
+      <w:pPr>
+        <w:pStyle w:val="Nadpis3"/>
+        <w:rPr>
+          <w:lang w:val="en-US"/>
+        </w:rPr>
+      </w:pPr>
+      <w:r>
+        <w:rPr>
+          <w:lang w:val="en-US"/>
+        </w:rPr>
+        <w:t>Změněno</w:t>
+      </w:r>
+    </w:p>
+    <w:p>
+      <w:pPr>
+        <w:pStyle w:val="Odstavecseseznamem"/>
+        <w:numPr>
+          <w:ilvl w:val="0"/>
+          <w:numId w:val="7"/>
+        </w:numPr>
+        <w:rPr>
+          <w:lang w:val="en-US"/>
+        </w:rPr>
+      </w:pPr>
+      <w:r>
+        <w:rPr>
+          <w:lang w:val="en-US"/>
+        </w:rPr>
+        <w:t>Změna UI exportu</w:t>
+      </w:r>
+    </w:p>
+    <w:p>
+      <w:pPr>
+        <w:pStyle w:val="Odstavecseseznamem"/>
+        <w:numPr>
+          <w:ilvl w:val="1"/>
+          <w:numId w:val="7"/>
+        </w:numPr>
+        <w:rPr>
+          <w:lang w:val="en-US"/>
+        </w:rPr>
+      </w:pPr>
+      <w:r>
+        <w:rPr>
+          <w:lang w:val="en-US"/>
+        </w:rPr>
+        <w:t>Způsob generování exportu za časové úseky</w:t>
+      </w:r>
+    </w:p>
+    <w:p>
+      <w:pPr>
+        <w:pStyle w:val="Odstavecseseznamem"/>
+        <w:numPr>
+          <w:ilvl w:val="1"/>
+          <w:numId w:val="7"/>
+        </w:numPr>
+        <w:rPr>
+          <w:lang w:val="en-US"/>
+        </w:rPr>
+      </w:pPr>
+      <w:r>
+        <w:rPr>
+          <w:lang w:val="en-US"/>
+        </w:rPr>
+        <w:t>Způsob výběru uživatelů a skupin pro export</w:t>
+      </w:r>
+    </w:p>
+    <w:p>
+      <w:pPr>
+        <w:pStyle w:val="Nadpis3"/>
+        <w:rPr>
+          <w:lang w:val="en-US"/>
+        </w:rPr>
+      </w:pPr>
+      <w:r>
+        <w:rPr>
+          <w:lang w:val="en-US"/>
+        </w:rPr>
+        <w:t>Odebráno</w:t>
+      </w:r>
+    </w:p>
+    <w:p>
+      <w:pPr>
+        <w:pStyle w:val="Odstavecseseznamem"/>
+        <w:numPr>
+          <w:ilvl w:val="0"/>
+          <w:numId w:val="7"/>
+        </w:numPr>
+        <w:rPr>
+          <w:lang w:val="en-US"/>
+        </w:rPr>
+      </w:pPr>
+    </w:p>
+    <w:p>
+      <w:pPr>
+        <w:rPr>
+          <w:rFonts w:asciiTheme="majorHAnsi" w:eastAsiaTheme="majorEastAsia" w:hAnsiTheme="majorHAnsi" w:cstheme="majorBidi"/>
+          <w:color w:val="0F4761" w:themeColor="accent1" w:themeShade="BF"/>
+          <w:sz w:val="32"/>
+          <w:szCs w:val="32"/>
+          <w:lang w:val="en-US"/>
+        </w:rPr>
+      </w:pPr>
+      <w:r>
+        <w:rPr>
+          <w:lang w:val="en-US"/>
+        </w:rPr>
+        <w:br w:type="page"/>
+      </w:r>
+    </w:p>
+    <w:p>
+      <w:pPr>
+        <w:pStyle w:val="Nadpis2"/>
+        <w:rPr>
+          <w:lang w:val="en-US"/>
+        </w:rPr>
+      </w:pPr>
+      <w:r>
+        <w:rPr>
+          <w:lang w:val="en-US"/>
+        </w:rPr>
+        <w:lastRenderedPageBreak/>
+        <w:t>Verze 1.</w:t>
+      </w:r>
+      <w:r>
+        <w:rPr>
+          <w:lang w:val="en-US"/>
+        </w:rPr>
+        <w:t>4</w:t>
       </w:r>
       <w:r>
         <w:rPr>
@@ -66,7 +316,7 @@
         <w:rPr>
           <w:lang w:val="en-US"/>
         </w:rPr>
-        <w:t>0</w:t>
+        <w:t>1.0</w:t>
       </w:r>
       <w:r>
         <w:rPr>
@@ -78,31 +328,7 @@
         <w:rPr>
           <w:lang w:val="en-US"/>
         </w:rPr>
-        <w:t xml:space="preserve">– </w:t>
-      </w:r>
-      <w:r>
-        <w:rPr>
-          <w:lang w:val="en-US"/>
-        </w:rPr>
-        <w:t>6</w:t>
-      </w:r>
-      <w:r>
-        <w:rPr>
-          <w:lang w:val="en-US"/>
-        </w:rPr>
-        <w:t>.</w:t>
-      </w:r>
-      <w:r>
-        <w:rPr>
-          <w:lang w:val="en-US"/>
-        </w:rPr>
-        <w:t>2</w:t>
-      </w:r>
-      <w:r>
-        <w:rPr>
-          <w:lang w:val="en-US"/>
-        </w:rPr>
-        <w:t>.2026</w:t>
+        <w:t>– 6.2.2026</w:t>
       </w:r>
     </w:p>
     <w:p>

</xml_diff>

<commit_message>
export / include 0 hour users and absence hours
</commit_message>
<xml_diff>
--- a/Changelog.docx
+++ b/Changelog.docx
@@ -42,6 +42,396 @@
         <w:rPr>
           <w:lang w:val="en-US"/>
         </w:rPr>
+        <w:t>6</w:t>
+      </w:r>
+      <w:r>
+        <w:rPr>
+          <w:lang w:val="en-US"/>
+        </w:rPr>
+        <w:t>.</w:t>
+      </w:r>
+      <w:r>
+        <w:rPr>
+          <w:lang w:val="en-US"/>
+        </w:rPr>
+        <w:t>0.0</w:t>
+      </w:r>
+      <w:r>
+        <w:rPr>
+          <w:lang w:val="en-US"/>
+        </w:rPr>
+        <w:t xml:space="preserve"> </w:t>
+      </w:r>
+      <w:r>
+        <w:rPr>
+          <w:lang w:val="en-US"/>
+        </w:rPr>
+        <w:t>– 23.4.2026</w:t>
+      </w:r>
+    </w:p>
+    <w:p>
+      <w:pPr>
+        <w:pStyle w:val="Nadpis3"/>
+        <w:rPr>
+          <w:lang w:val="en-US"/>
+        </w:rPr>
+      </w:pPr>
+      <w:r>
+        <w:rPr>
+          <w:lang w:val="en-US"/>
+        </w:rPr>
+        <w:t>Přidáno</w:t>
+      </w:r>
+    </w:p>
+    <w:p>
+      <w:pPr>
+        <w:pStyle w:val="Odstavecseseznamem"/>
+        <w:numPr>
+          <w:ilvl w:val="0"/>
+          <w:numId w:val="8"/>
+        </w:numPr>
+        <w:rPr>
+          <w:lang w:val="en-US"/>
+        </w:rPr>
+      </w:pPr>
+      <w:r>
+        <w:rPr>
+          <w:lang w:val="en-US"/>
+        </w:rPr>
+        <w:t>Kategorie ZÁKAZNICKÝ SERVIS</w:t>
+      </w:r>
+    </w:p>
+    <w:p>
+      <w:pPr>
+        <w:pStyle w:val="Odstavecseseznamem"/>
+        <w:numPr>
+          <w:ilvl w:val="0"/>
+          <w:numId w:val="8"/>
+        </w:numPr>
+        <w:rPr>
+          <w:lang w:val="en-US"/>
+        </w:rPr>
+      </w:pPr>
+    </w:p>
+    <w:p>
+      <w:pPr>
+        <w:pStyle w:val="Odstavecseseznamem"/>
+        <w:numPr>
+          <w:ilvl w:val="0"/>
+          <w:numId w:val="8"/>
+        </w:numPr>
+        <w:rPr>
+          <w:lang w:val="en-US"/>
+        </w:rPr>
+      </w:pPr>
+      <w:r>
+        <w:rPr>
+          <w:lang w:val="en-US"/>
+        </w:rPr>
+        <w:t>Tlačítko pro informaci o aktualizacích – pokud je k dispozici nová aktualizace, zbarví se do žluta</w:t>
+      </w:r>
+      <w:r>
+        <w:rPr>
+          <w:lang w:val="en-US"/>
+        </w:rPr>
+        <w:br/>
+      </w:r>
+      <w:r>
+        <w:rPr>
+          <w:noProof/>
+          <w:lang w:val="en-US"/>
+        </w:rPr>
+        <w:drawing>
+          <wp:inline distT="0" distB="0" distL="0" distR="0" wp14:anchorId="2FE9D894" wp14:editId="39266036">
+            <wp:extent cx="1200318" cy="419158"/>
+            <wp:effectExtent l="0" t="0" r="0" b="0"/>
+            <wp:docPr id="1419679278" name="Obrázek 1"/>
+            <wp:cNvGraphicFramePr>
+              <a:graphicFrameLocks xmlns:a="http://schemas.openxmlformats.org/drawingml/2006/main" noChangeAspect="1"/>
+            </wp:cNvGraphicFramePr>
+            <a:graphic xmlns:a="http://schemas.openxmlformats.org/drawingml/2006/main">
+              <a:graphicData uri="http://schemas.openxmlformats.org/drawingml/2006/picture">
+                <pic:pic xmlns:pic="http://schemas.openxmlformats.org/drawingml/2006/picture">
+                  <pic:nvPicPr>
+                    <pic:cNvPr id="912460511" name=""/>
+                    <pic:cNvPicPr/>
+                  </pic:nvPicPr>
+                  <pic:blipFill>
+                    <a:blip r:embed="rId6"/>
+                    <a:stretch>
+                      <a:fillRect/>
+                    </a:stretch>
+                  </pic:blipFill>
+                  <pic:spPr>
+                    <a:xfrm>
+                      <a:off x="0" y="0"/>
+                      <a:ext cx="1200318" cy="419158"/>
+                    </a:xfrm>
+                    <a:prstGeom prst="rect">
+                      <a:avLst/>
+                    </a:prstGeom>
+                  </pic:spPr>
+                </pic:pic>
+              </a:graphicData>
+            </a:graphic>
+          </wp:inline>
+        </w:drawing>
+      </w:r>
+    </w:p>
+    <w:p>
+      <w:pPr>
+        <w:pStyle w:val="Odstavecseseznamem"/>
+        <w:numPr>
+          <w:ilvl w:val="1"/>
+          <w:numId w:val="8"/>
+        </w:numPr>
+        <w:rPr>
+          <w:lang w:val="en-US"/>
+        </w:rPr>
+      </w:pPr>
+      <w:r>
+        <w:rPr>
+          <w:lang w:val="en-US"/>
+        </w:rPr>
+        <w:t>Po stisknutí se zobrazí dialog, kde bude moci uživatel provést aktualizaci a zobrazit seznam změn</w:t>
+      </w:r>
+    </w:p>
+    <w:p>
+      <w:pPr>
+        <w:pStyle w:val="Nadpis3"/>
+        <w:rPr>
+          <w:lang w:val="en-US"/>
+        </w:rPr>
+      </w:pPr>
+      <w:r>
+        <w:rPr>
+          <w:lang w:val="en-US"/>
+        </w:rPr>
+        <w:t>Opraveno</w:t>
+      </w:r>
+      <w:r>
+        <w:rPr>
+          <w:lang w:val="en-US"/>
+        </w:rPr>
+        <w:t xml:space="preserve"> </w:t>
+      </w:r>
+    </w:p>
+    <w:p>
+      <w:pPr>
+        <w:pStyle w:val="Odstavecseseznamem"/>
+        <w:numPr>
+          <w:ilvl w:val="0"/>
+          <w:numId w:val="7"/>
+        </w:numPr>
+        <w:rPr>
+          <w:lang w:val="en-US"/>
+        </w:rPr>
+      </w:pPr>
+    </w:p>
+    <w:p>
+      <w:pPr>
+        <w:pStyle w:val="Nadpis3"/>
+        <w:rPr>
+          <w:lang w:val="en-US"/>
+        </w:rPr>
+      </w:pPr>
+      <w:r>
+        <w:rPr>
+          <w:lang w:val="en-US"/>
+        </w:rPr>
+        <w:t>Změněno</w:t>
+      </w:r>
+    </w:p>
+    <w:p>
+      <w:pPr>
+        <w:pStyle w:val="Odstavecseseznamem"/>
+        <w:numPr>
+          <w:ilvl w:val="0"/>
+          <w:numId w:val="7"/>
+        </w:numPr>
+        <w:rPr>
+          <w:lang w:val="en-US"/>
+        </w:rPr>
+      </w:pPr>
+      <w:r>
+        <w:rPr>
+          <w:lang w:val="en-US"/>
+        </w:rPr>
+        <w:t>V souhrnu vykázaných hodin i v postranním panelu se bude počítat nepřítomnost (dovolená / lékař) jako vykázané hodiny</w:t>
+      </w:r>
+    </w:p>
+    <w:p>
+      <w:pPr>
+        <w:pStyle w:val="Odstavecseseznamem"/>
+        <w:numPr>
+          <w:ilvl w:val="0"/>
+          <w:numId w:val="7"/>
+        </w:numPr>
+        <w:rPr>
+          <w:lang w:val="en-US"/>
+        </w:rPr>
+      </w:pPr>
+      <w:r>
+        <w:rPr>
+          <w:lang w:val="en-US"/>
+        </w:rPr>
+        <w:t>V exportu se zobrazují i uživatelé, kteří nevykázali žádné hodiny + jsou zbarveni červeně</w:t>
+      </w:r>
+      <w:r>
+        <w:rPr>
+          <w:lang w:val="en-US"/>
+        </w:rPr>
+        <w:br/>
+      </w:r>
+      <w:r>
+        <w:rPr>
+          <w:lang w:val="en-US"/>
+        </w:rPr>
+        <w:drawing>
+          <wp:inline distT="0" distB="0" distL="0" distR="0" wp14:anchorId="08C40FE6" wp14:editId="7BE97162">
+            <wp:extent cx="5760720" cy="1400810"/>
+            <wp:effectExtent l="0" t="0" r="0" b="8890"/>
+            <wp:docPr id="2014013142" name="Obrázek 1"/>
+            <wp:cNvGraphicFramePr>
+              <a:graphicFrameLocks xmlns:a="http://schemas.openxmlformats.org/drawingml/2006/main" noChangeAspect="1"/>
+            </wp:cNvGraphicFramePr>
+            <a:graphic xmlns:a="http://schemas.openxmlformats.org/drawingml/2006/main">
+              <a:graphicData uri="http://schemas.openxmlformats.org/drawingml/2006/picture">
+                <pic:pic xmlns:pic="http://schemas.openxmlformats.org/drawingml/2006/picture">
+                  <pic:nvPicPr>
+                    <pic:cNvPr id="2014013142" name=""/>
+                    <pic:cNvPicPr/>
+                  </pic:nvPicPr>
+                  <pic:blipFill>
+                    <a:blip r:embed="rId7"/>
+                    <a:stretch>
+                      <a:fillRect/>
+                    </a:stretch>
+                  </pic:blipFill>
+                  <pic:spPr>
+                    <a:xfrm>
+                      <a:off x="0" y="0"/>
+                      <a:ext cx="5760720" cy="1400810"/>
+                    </a:xfrm>
+                    <a:prstGeom prst="rect">
+                      <a:avLst/>
+                    </a:prstGeom>
+                  </pic:spPr>
+                </pic:pic>
+              </a:graphicData>
+            </a:graphic>
+          </wp:inline>
+        </w:drawing>
+      </w:r>
+      <w:r>
+        <w:rPr>
+          <w:lang w:val="en-US"/>
+        </w:rPr>
+        <w:br/>
+      </w:r>
+      <w:r>
+        <w:rPr>
+          <w:noProof/>
+          <w:lang w:val="en-US"/>
+        </w:rPr>
+        <w:drawing>
+          <wp:inline distT="0" distB="0" distL="0" distR="0" wp14:anchorId="06F58C75" wp14:editId="151A174F">
+            <wp:extent cx="714475" cy="847843"/>
+            <wp:effectExtent l="0" t="0" r="9525" b="0"/>
+            <wp:docPr id="314221006" name="Obrázek 1"/>
+            <wp:cNvGraphicFramePr>
+              <a:graphicFrameLocks xmlns:a="http://schemas.openxmlformats.org/drawingml/2006/main" noChangeAspect="1"/>
+            </wp:cNvGraphicFramePr>
+            <a:graphic xmlns:a="http://schemas.openxmlformats.org/drawingml/2006/main">
+              <a:graphicData uri="http://schemas.openxmlformats.org/drawingml/2006/picture">
+                <pic:pic xmlns:pic="http://schemas.openxmlformats.org/drawingml/2006/picture">
+                  <pic:nvPicPr>
+                    <pic:cNvPr id="314221006" name=""/>
+                    <pic:cNvPicPr/>
+                  </pic:nvPicPr>
+                  <pic:blipFill>
+                    <a:blip r:embed="rId8"/>
+                    <a:stretch>
+                      <a:fillRect/>
+                    </a:stretch>
+                  </pic:blipFill>
+                  <pic:spPr>
+                    <a:xfrm>
+                      <a:off x="0" y="0"/>
+                      <a:ext cx="714475" cy="847843"/>
+                    </a:xfrm>
+                    <a:prstGeom prst="rect">
+                      <a:avLst/>
+                    </a:prstGeom>
+                  </pic:spPr>
+                </pic:pic>
+              </a:graphicData>
+            </a:graphic>
+          </wp:inline>
+        </w:drawing>
+      </w:r>
+    </w:p>
+    <w:p>
+      <w:pPr>
+        <w:pStyle w:val="Nadpis3"/>
+        <w:rPr>
+          <w:lang w:val="en-US"/>
+        </w:rPr>
+      </w:pPr>
+      <w:r>
+        <w:rPr>
+          <w:lang w:val="en-US"/>
+        </w:rPr>
+        <w:t>Odebráno</w:t>
+      </w:r>
+    </w:p>
+    <w:p>
+      <w:pPr>
+        <w:pStyle w:val="Odstavecseseznamem"/>
+        <w:numPr>
+          <w:ilvl w:val="0"/>
+          <w:numId w:val="7"/>
+        </w:numPr>
+        <w:rPr>
+          <w:lang w:val="en-US"/>
+        </w:rPr>
+      </w:pPr>
+    </w:p>
+    <w:p>
+      <w:pPr>
+        <w:rPr>
+          <w:rFonts w:asciiTheme="majorHAnsi" w:eastAsiaTheme="majorEastAsia" w:hAnsiTheme="majorHAnsi" w:cstheme="majorBidi"/>
+          <w:color w:val="0F4761" w:themeColor="accent1" w:themeShade="BF"/>
+          <w:sz w:val="32"/>
+          <w:szCs w:val="32"/>
+          <w:lang w:val="en-US"/>
+        </w:rPr>
+      </w:pPr>
+      <w:r>
+        <w:rPr>
+          <w:lang w:val="en-US"/>
+        </w:rPr>
+        <w:br w:type="page"/>
+      </w:r>
+    </w:p>
+    <w:p>
+      <w:pPr>
+        <w:pStyle w:val="Nadpis2"/>
+        <w:rPr>
+          <w:lang w:val="en-US"/>
+        </w:rPr>
+      </w:pPr>
+      <w:r>
+        <w:rPr>
+          <w:lang w:val="en-US"/>
+        </w:rPr>
+        <w:lastRenderedPageBreak/>
+        <w:t>Verze 1.</w:t>
+      </w:r>
+      <w:r>
+        <w:rPr>
+          <w:lang w:val="en-US"/>
+        </w:rPr>
         <w:t>5</w:t>
       </w:r>
       <w:r>
@@ -54,13 +444,7 @@
         <w:rPr>
           <w:lang w:val="en-US"/>
         </w:rPr>
-        <w:t>0</w:t>
-      </w:r>
-      <w:r>
-        <w:rPr>
-          <w:lang w:val="en-US"/>
-        </w:rPr>
-        <w:t>.0</w:t>
+        <w:t>0.0</w:t>
       </w:r>
       <w:r>
         <w:rPr>
@@ -72,19 +456,7 @@
         <w:rPr>
           <w:lang w:val="en-US"/>
         </w:rPr>
-        <w:t xml:space="preserve">– </w:t>
-      </w:r>
-      <w:r>
-        <w:rPr>
-          <w:lang w:val="en-US"/>
-        </w:rPr>
-        <w:t>23</w:t>
-      </w:r>
-      <w:r>
-        <w:rPr>
-          <w:lang w:val="en-US"/>
-        </w:rPr>
-        <w:t>.4.2026</w:t>
+        <w:t>– 23.4.2026</w:t>
       </w:r>
     </w:p>
     <w:p>
@@ -126,6 +498,7 @@
       </w:r>
       <w:r>
         <w:rPr>
+          <w:noProof/>
           <w:lang w:val="en-US"/>
         </w:rPr>
         <w:drawing>
@@ -411,7 +784,7 @@
                     <pic:cNvPicPr/>
                   </pic:nvPicPr>
                   <pic:blipFill>
-                    <a:blip r:embed="rId7"/>
+                    <a:blip r:embed="rId9"/>
                     <a:stretch>
                       <a:fillRect/>
                     </a:stretch>
@@ -1933,7 +2306,7 @@
                     <pic:cNvPicPr/>
                   </pic:nvPicPr>
                   <pic:blipFill>
-                    <a:blip r:embed="rId8">
+                    <a:blip r:embed="rId10">
                       <a:extLst>
                         <a:ext uri="{28A0092B-C50C-407E-A947-70E740481C1C}">
                           <a14:useLocalDpi xmlns:a14="http://schemas.microsoft.com/office/drawing/2010/main" val="0"/>
@@ -2193,7 +2566,7 @@
                     <pic:cNvPicPr/>
                   </pic:nvPicPr>
                   <pic:blipFill>
-                    <a:blip r:embed="rId9"/>
+                    <a:blip r:embed="rId11"/>
                     <a:stretch>
                       <a:fillRect/>
                     </a:stretch>
@@ -2346,7 +2719,7 @@
                     <pic:cNvPicPr/>
                   </pic:nvPicPr>
                   <pic:blipFill>
-                    <a:blip r:embed="rId10"/>
+                    <a:blip r:embed="rId12"/>
                     <a:stretch>
                       <a:fillRect/>
                     </a:stretch>
@@ -3069,7 +3442,7 @@
                     <pic:cNvPicPr/>
                   </pic:nvPicPr>
                   <pic:blipFill>
-                    <a:blip r:embed="rId11"/>
+                    <a:blip r:embed="rId13"/>
                     <a:stretch>
                       <a:fillRect/>
                     </a:stretch>
@@ -3187,7 +3560,7 @@
                     <pic:cNvPicPr/>
                   </pic:nvPicPr>
                   <pic:blipFill>
-                    <a:blip r:embed="rId12"/>
+                    <a:blip r:embed="rId14"/>
                     <a:stretch>
                       <a:fillRect/>
                     </a:stretch>
@@ -3810,7 +4183,7 @@
                     <pic:cNvPicPr/>
                   </pic:nvPicPr>
                   <pic:blipFill>
-                    <a:blip r:embed="rId13"/>
+                    <a:blip r:embed="rId15"/>
                     <a:stretch>
                       <a:fillRect/>
                     </a:stretch>
@@ -4658,7 +5031,7 @@
                     </pic:cNvPicPr>
                   </pic:nvPicPr>
                   <pic:blipFill>
-                    <a:blip r:embed="rId14">
+                    <a:blip r:embed="rId16">
                       <a:extLst>
                         <a:ext uri="{28A0092B-C50C-407E-A947-70E740481C1C}">
                           <a14:useLocalDpi xmlns:a14="http://schemas.microsoft.com/office/drawing/2010/main" val="0"/>
@@ -4742,7 +5115,7 @@
                     </pic:cNvPicPr>
                   </pic:nvPicPr>
                   <pic:blipFill>
-                    <a:blip r:embed="rId15">
+                    <a:blip r:embed="rId17">
                       <a:extLst>
                         <a:ext uri="{28A0092B-C50C-407E-A947-70E740481C1C}">
                           <a14:useLocalDpi xmlns:a14="http://schemas.microsoft.com/office/drawing/2010/main" val="0"/>
@@ -4852,7 +5225,7 @@
                     <pic:cNvPicPr/>
                   </pic:nvPicPr>
                   <pic:blipFill>
-                    <a:blip r:embed="rId16"/>
+                    <a:blip r:embed="rId18"/>
                     <a:stretch>
                       <a:fillRect/>
                     </a:stretch>
@@ -5588,7 +5961,7 @@
                     </pic:cNvPicPr>
                   </pic:nvPicPr>
                   <pic:blipFill>
-                    <a:blip r:embed="rId17">
+                    <a:blip r:embed="rId19">
                       <a:extLst>
                         <a:ext uri="{28A0092B-C50C-407E-A947-70E740481C1C}">
                           <a14:useLocalDpi xmlns:a14="http://schemas.microsoft.com/office/drawing/2010/main" val="0"/>
@@ -5859,7 +6232,7 @@
                     </pic:cNvPicPr>
                   </pic:nvPicPr>
                   <pic:blipFill>
-                    <a:blip r:embed="rId18">
+                    <a:blip r:embed="rId20">
                       <a:extLst>
                         <a:ext uri="{28A0092B-C50C-407E-A947-70E740481C1C}">
                           <a14:useLocalDpi xmlns:a14="http://schemas.microsoft.com/office/drawing/2010/main" val="0"/>
@@ -5916,7 +6289,7 @@
                     <pic:cNvPicPr/>
                   </pic:nvPicPr>
                   <pic:blipFill>
-                    <a:blip r:embed="rId19"/>
+                    <a:blip r:embed="rId21"/>
                     <a:stretch>
                       <a:fillRect/>
                     </a:stretch>
@@ -6228,7 +6601,7 @@
                     </pic:cNvPicPr>
                   </pic:nvPicPr>
                   <pic:blipFill>
-                    <a:blip r:embed="rId20">
+                    <a:blip r:embed="rId22">
                       <a:extLst>
                         <a:ext uri="{28A0092B-C50C-407E-A947-70E740481C1C}">
                           <a14:useLocalDpi xmlns:a14="http://schemas.microsoft.com/office/drawing/2010/main" val="0"/>
@@ -6307,7 +6680,7 @@
                     </pic:cNvPicPr>
                   </pic:nvPicPr>
                   <pic:blipFill>
-                    <a:blip r:embed="rId21">
+                    <a:blip r:embed="rId23">
                       <a:extLst>
                         <a:ext uri="{28A0092B-C50C-407E-A947-70E740481C1C}">
                           <a14:useLocalDpi xmlns:a14="http://schemas.microsoft.com/office/drawing/2010/main" val="0"/>
@@ -6530,7 +6903,7 @@
                     <pic:cNvPicPr/>
                   </pic:nvPicPr>
                   <pic:blipFill>
-                    <a:blip r:embed="rId22"/>
+                    <a:blip r:embed="rId24"/>
                     <a:stretch>
                       <a:fillRect/>
                     </a:stretch>
@@ -6760,7 +7133,7 @@
                     <pic:cNvPicPr/>
                   </pic:nvPicPr>
                   <pic:blipFill>
-                    <a:blip r:embed="rId23"/>
+                    <a:blip r:embed="rId25"/>
                     <a:stretch>
                       <a:fillRect/>
                     </a:stretch>
@@ -6854,7 +7227,7 @@
                     <pic:cNvPicPr/>
                   </pic:nvPicPr>
                   <pic:blipFill>
-                    <a:blip r:embed="rId24"/>
+                    <a:blip r:embed="rId26"/>
                     <a:stretch>
                       <a:fillRect/>
                     </a:stretch>
@@ -6949,7 +7322,7 @@
                     <pic:cNvPicPr/>
                   </pic:nvPicPr>
                   <pic:blipFill>
-                    <a:blip r:embed="rId25"/>
+                    <a:blip r:embed="rId27"/>
                     <a:stretch>
                       <a:fillRect/>
                     </a:stretch>
@@ -7043,7 +7416,7 @@
                     <pic:cNvPicPr/>
                   </pic:nvPicPr>
                   <pic:blipFill>
-                    <a:blip r:embed="rId26"/>
+                    <a:blip r:embed="rId28"/>
                     <a:stretch>
                       <a:fillRect/>
                     </a:stretch>
@@ -7298,7 +7671,7 @@
                     <pic:cNvPicPr/>
                   </pic:nvPicPr>
                   <pic:blipFill>
-                    <a:blip r:embed="rId27"/>
+                    <a:blip r:embed="rId29"/>
                     <a:stretch>
                       <a:fillRect/>
                     </a:stretch>
@@ -8190,7 +8563,7 @@
                     </pic:cNvPicPr>
                   </pic:nvPicPr>
                   <pic:blipFill>
-                    <a:blip r:embed="rId28">
+                    <a:blip r:embed="rId30">
                       <a:extLst>
                         <a:ext uri="{28A0092B-C50C-407E-A947-70E740481C1C}">
                           <a14:useLocalDpi xmlns:a14="http://schemas.microsoft.com/office/drawing/2010/main" val="0"/>
@@ -8351,7 +8724,7 @@
                     <pic:cNvPicPr/>
                   </pic:nvPicPr>
                   <pic:blipFill>
-                    <a:blip r:embed="rId29"/>
+                    <a:blip r:embed="rId31"/>
                     <a:stretch>
                       <a:fillRect/>
                     </a:stretch>
@@ -9078,7 +9451,7 @@
                     <pic:cNvPicPr/>
                   </pic:nvPicPr>
                   <pic:blipFill>
-                    <a:blip r:embed="rId30"/>
+                    <a:blip r:embed="rId32"/>
                     <a:stretch>
                       <a:fillRect/>
                     </a:stretch>
@@ -9191,7 +9564,7 @@
                     </pic:cNvPicPr>
                   </pic:nvPicPr>
                   <pic:blipFill>
-                    <a:blip r:embed="rId31">
+                    <a:blip r:embed="rId33">
                       <a:extLst>
                         <a:ext uri="{28A0092B-C50C-407E-A947-70E740481C1C}">
                           <a14:useLocalDpi xmlns:a14="http://schemas.microsoft.com/office/drawing/2010/main" val="0"/>

</xml_diff>

<commit_message>
export / evaluation / piechart
</commit_message>
<xml_diff>
--- a/Changelog.docx
+++ b/Changelog.docx
@@ -99,6 +99,70 @@
           <w:lang w:val="en-US"/>
         </w:rPr>
         <w:t>Kategorie ZÁKAZNICKÝ SERVIS</w:t>
+      </w:r>
+    </w:p>
+    <w:p>
+      <w:pPr>
+        <w:pStyle w:val="Odstavecseseznamem"/>
+        <w:numPr>
+          <w:ilvl w:val="0"/>
+          <w:numId w:val="8"/>
+        </w:numPr>
+        <w:rPr>
+          <w:lang w:val="en-US"/>
+        </w:rPr>
+      </w:pPr>
+      <w:r>
+        <w:rPr>
+          <w:lang w:val="en-US"/>
+        </w:rPr>
+        <w:t>Při exportu možnost zahrnout “VYHODNOCENÍ”, kde je souhrnný přehled a grafy</w:t>
+      </w:r>
+      <w:r>
+        <w:rPr>
+          <w:lang w:val="en-US"/>
+        </w:rPr>
+        <w:br/>
+      </w:r>
+      <w:r>
+        <w:rPr>
+          <w:lang w:val="en-US"/>
+        </w:rPr>
+        <w:drawing>
+          <wp:inline distT="0" distB="0" distL="0" distR="0" wp14:anchorId="4947C575" wp14:editId="06FBC235">
+            <wp:extent cx="5760720" cy="3193415"/>
+            <wp:effectExtent l="0" t="0" r="0" b="6985"/>
+            <wp:docPr id="193333234" name="Obrázek 1"/>
+            <wp:cNvGraphicFramePr>
+              <a:graphicFrameLocks xmlns:a="http://schemas.openxmlformats.org/drawingml/2006/main" noChangeAspect="1"/>
+            </wp:cNvGraphicFramePr>
+            <a:graphic xmlns:a="http://schemas.openxmlformats.org/drawingml/2006/main">
+              <a:graphicData uri="http://schemas.openxmlformats.org/drawingml/2006/picture">
+                <pic:pic xmlns:pic="http://schemas.openxmlformats.org/drawingml/2006/picture">
+                  <pic:nvPicPr>
+                    <pic:cNvPr id="193333234" name=""/>
+                    <pic:cNvPicPr/>
+                  </pic:nvPicPr>
+                  <pic:blipFill>
+                    <a:blip r:embed="rId6"/>
+                    <a:stretch>
+                      <a:fillRect/>
+                    </a:stretch>
+                  </pic:blipFill>
+                  <pic:spPr>
+                    <a:xfrm>
+                      <a:off x="0" y="0"/>
+                      <a:ext cx="5760720" cy="3193415"/>
+                    </a:xfrm>
+                    <a:prstGeom prst="rect">
+                      <a:avLst/>
+                    </a:prstGeom>
+                  </pic:spPr>
+                </pic:pic>
+              </a:graphicData>
+            </a:graphic>
+          </wp:inline>
+        </w:drawing>
       </w:r>
     </w:p>
     <w:p>
@@ -157,7 +221,7 @@
                     <pic:cNvPicPr/>
                   </pic:nvPicPr>
                   <pic:blipFill>
-                    <a:blip r:embed="rId6"/>
+                    <a:blip r:embed="rId7"/>
                     <a:stretch>
                       <a:fillRect/>
                     </a:stretch>
@@ -275,6 +339,7 @@
         <w:rPr>
           <w:lang w:val="en-US"/>
         </w:rPr>
+        <w:lastRenderedPageBreak/>
         <w:t>V exportu se zobrazují i uživatelé, kteří nevykázali žádné hodiny + jsou zbarveni červeně</w:t>
       </w:r>
       <w:r>
@@ -285,6 +350,7 @@
       </w:r>
       <w:r>
         <w:rPr>
+          <w:noProof/>
           <w:lang w:val="en-US"/>
         </w:rPr>
         <w:drawing>
@@ -303,7 +369,7 @@
                     <pic:cNvPicPr/>
                   </pic:nvPicPr>
                   <pic:blipFill>
-                    <a:blip r:embed="rId7"/>
+                    <a:blip r:embed="rId8"/>
                     <a:stretch>
                       <a:fillRect/>
                     </a:stretch>
@@ -350,7 +416,7 @@
                     <pic:cNvPicPr/>
                   </pic:nvPicPr>
                   <pic:blipFill>
-                    <a:blip r:embed="rId8"/>
+                    <a:blip r:embed="rId9"/>
                     <a:stretch>
                       <a:fillRect/>
                     </a:stretch>
@@ -517,7 +583,7 @@
                     <pic:cNvPicPr/>
                   </pic:nvPicPr>
                   <pic:blipFill>
-                    <a:blip r:embed="rId6"/>
+                    <a:blip r:embed="rId7"/>
                     <a:stretch>
                       <a:fillRect/>
                     </a:stretch>
@@ -784,7 +850,7 @@
                     <pic:cNvPicPr/>
                   </pic:nvPicPr>
                   <pic:blipFill>
-                    <a:blip r:embed="rId9"/>
+                    <a:blip r:embed="rId10"/>
                     <a:stretch>
                       <a:fillRect/>
                     </a:stretch>
@@ -2306,7 +2372,7 @@
                     <pic:cNvPicPr/>
                   </pic:nvPicPr>
                   <pic:blipFill>
-                    <a:blip r:embed="rId10">
+                    <a:blip r:embed="rId11">
                       <a:extLst>
                         <a:ext uri="{28A0092B-C50C-407E-A947-70E740481C1C}">
                           <a14:useLocalDpi xmlns:a14="http://schemas.microsoft.com/office/drawing/2010/main" val="0"/>
@@ -2566,7 +2632,7 @@
                     <pic:cNvPicPr/>
                   </pic:nvPicPr>
                   <pic:blipFill>
-                    <a:blip r:embed="rId11"/>
+                    <a:blip r:embed="rId12"/>
                     <a:stretch>
                       <a:fillRect/>
                     </a:stretch>
@@ -2719,7 +2785,7 @@
                     <pic:cNvPicPr/>
                   </pic:nvPicPr>
                   <pic:blipFill>
-                    <a:blip r:embed="rId12"/>
+                    <a:blip r:embed="rId13"/>
                     <a:stretch>
                       <a:fillRect/>
                     </a:stretch>
@@ -3055,7 +3121,6 @@
         <w:rPr>
           <w:lang w:val="en-US"/>
         </w:rPr>
-        <w:lastRenderedPageBreak/>
         <w:t>Verze 1.</w:t>
       </w:r>
       <w:r>
@@ -3442,7 +3507,7 @@
                     <pic:cNvPicPr/>
                   </pic:nvPicPr>
                   <pic:blipFill>
-                    <a:blip r:embed="rId13"/>
+                    <a:blip r:embed="rId14"/>
                     <a:stretch>
                       <a:fillRect/>
                     </a:stretch>
@@ -3560,7 +3625,7 @@
                     <pic:cNvPicPr/>
                   </pic:nvPicPr>
                   <pic:blipFill>
-                    <a:blip r:embed="rId14"/>
+                    <a:blip r:embed="rId15"/>
                     <a:stretch>
                       <a:fillRect/>
                     </a:stretch>
@@ -4183,7 +4248,7 @@
                     <pic:cNvPicPr/>
                   </pic:nvPicPr>
                   <pic:blipFill>
-                    <a:blip r:embed="rId15"/>
+                    <a:blip r:embed="rId16"/>
                     <a:stretch>
                       <a:fillRect/>
                     </a:stretch>
@@ -5031,7 +5096,7 @@
                     </pic:cNvPicPr>
                   </pic:nvPicPr>
                   <pic:blipFill>
-                    <a:blip r:embed="rId16">
+                    <a:blip r:embed="rId17">
                       <a:extLst>
                         <a:ext uri="{28A0092B-C50C-407E-A947-70E740481C1C}">
                           <a14:useLocalDpi xmlns:a14="http://schemas.microsoft.com/office/drawing/2010/main" val="0"/>
@@ -5115,7 +5180,7 @@
                     </pic:cNvPicPr>
                   </pic:nvPicPr>
                   <pic:blipFill>
-                    <a:blip r:embed="rId17">
+                    <a:blip r:embed="rId18">
                       <a:extLst>
                         <a:ext uri="{28A0092B-C50C-407E-A947-70E740481C1C}">
                           <a14:useLocalDpi xmlns:a14="http://schemas.microsoft.com/office/drawing/2010/main" val="0"/>
@@ -5225,7 +5290,7 @@
                     <pic:cNvPicPr/>
                   </pic:nvPicPr>
                   <pic:blipFill>
-                    <a:blip r:embed="rId18"/>
+                    <a:blip r:embed="rId19"/>
                     <a:stretch>
                       <a:fillRect/>
                     </a:stretch>
@@ -5961,7 +6026,7 @@
                     </pic:cNvPicPr>
                   </pic:nvPicPr>
                   <pic:blipFill>
-                    <a:blip r:embed="rId19">
+                    <a:blip r:embed="rId20">
                       <a:extLst>
                         <a:ext uri="{28A0092B-C50C-407E-A947-70E740481C1C}">
                           <a14:useLocalDpi xmlns:a14="http://schemas.microsoft.com/office/drawing/2010/main" val="0"/>
@@ -6232,7 +6297,7 @@
                     </pic:cNvPicPr>
                   </pic:nvPicPr>
                   <pic:blipFill>
-                    <a:blip r:embed="rId20">
+                    <a:blip r:embed="rId21">
                       <a:extLst>
                         <a:ext uri="{28A0092B-C50C-407E-A947-70E740481C1C}">
                           <a14:useLocalDpi xmlns:a14="http://schemas.microsoft.com/office/drawing/2010/main" val="0"/>
@@ -6289,7 +6354,7 @@
                     <pic:cNvPicPr/>
                   </pic:nvPicPr>
                   <pic:blipFill>
-                    <a:blip r:embed="rId21"/>
+                    <a:blip r:embed="rId22"/>
                     <a:stretch>
                       <a:fillRect/>
                     </a:stretch>
@@ -6601,7 +6666,7 @@
                     </pic:cNvPicPr>
                   </pic:nvPicPr>
                   <pic:blipFill>
-                    <a:blip r:embed="rId22">
+                    <a:blip r:embed="rId23">
                       <a:extLst>
                         <a:ext uri="{28A0092B-C50C-407E-A947-70E740481C1C}">
                           <a14:useLocalDpi xmlns:a14="http://schemas.microsoft.com/office/drawing/2010/main" val="0"/>
@@ -6680,7 +6745,7 @@
                     </pic:cNvPicPr>
                   </pic:nvPicPr>
                   <pic:blipFill>
-                    <a:blip r:embed="rId23">
+                    <a:blip r:embed="rId24">
                       <a:extLst>
                         <a:ext uri="{28A0092B-C50C-407E-A947-70E740481C1C}">
                           <a14:useLocalDpi xmlns:a14="http://schemas.microsoft.com/office/drawing/2010/main" val="0"/>
@@ -6903,7 +6968,7 @@
                     <pic:cNvPicPr/>
                   </pic:nvPicPr>
                   <pic:blipFill>
-                    <a:blip r:embed="rId24"/>
+                    <a:blip r:embed="rId25"/>
                     <a:stretch>
                       <a:fillRect/>
                     </a:stretch>
@@ -7133,7 +7198,7 @@
                     <pic:cNvPicPr/>
                   </pic:nvPicPr>
                   <pic:blipFill>
-                    <a:blip r:embed="rId25"/>
+                    <a:blip r:embed="rId26"/>
                     <a:stretch>
                       <a:fillRect/>
                     </a:stretch>
@@ -7227,7 +7292,7 @@
                     <pic:cNvPicPr/>
                   </pic:nvPicPr>
                   <pic:blipFill>
-                    <a:blip r:embed="rId26"/>
+                    <a:blip r:embed="rId27"/>
                     <a:stretch>
                       <a:fillRect/>
                     </a:stretch>
@@ -7322,7 +7387,7 @@
                     <pic:cNvPicPr/>
                   </pic:nvPicPr>
                   <pic:blipFill>
-                    <a:blip r:embed="rId27"/>
+                    <a:blip r:embed="rId28"/>
                     <a:stretch>
                       <a:fillRect/>
                     </a:stretch>
@@ -7416,7 +7481,7 @@
                     <pic:cNvPicPr/>
                   </pic:nvPicPr>
                   <pic:blipFill>
-                    <a:blip r:embed="rId28"/>
+                    <a:blip r:embed="rId29"/>
                     <a:stretch>
                       <a:fillRect/>
                     </a:stretch>
@@ -7671,7 +7736,7 @@
                     <pic:cNvPicPr/>
                   </pic:nvPicPr>
                   <pic:blipFill>
-                    <a:blip r:embed="rId29"/>
+                    <a:blip r:embed="rId30"/>
                     <a:stretch>
                       <a:fillRect/>
                     </a:stretch>
@@ -8563,7 +8628,7 @@
                     </pic:cNvPicPr>
                   </pic:nvPicPr>
                   <pic:blipFill>
-                    <a:blip r:embed="rId30">
+                    <a:blip r:embed="rId31">
                       <a:extLst>
                         <a:ext uri="{28A0092B-C50C-407E-A947-70E740481C1C}">
                           <a14:useLocalDpi xmlns:a14="http://schemas.microsoft.com/office/drawing/2010/main" val="0"/>
@@ -8724,7 +8789,7 @@
                     <pic:cNvPicPr/>
                   </pic:nvPicPr>
                   <pic:blipFill>
-                    <a:blip r:embed="rId31"/>
+                    <a:blip r:embed="rId32"/>
                     <a:stretch>
                       <a:fillRect/>
                     </a:stretch>
@@ -9451,7 +9516,7 @@
                     <pic:cNvPicPr/>
                   </pic:nvPicPr>
                   <pic:blipFill>
-                    <a:blip r:embed="rId32"/>
+                    <a:blip r:embed="rId33"/>
                     <a:stretch>
                       <a:fillRect/>
                     </a:stretch>
@@ -9564,7 +9629,7 @@
                     </pic:cNvPicPr>
                   </pic:nvPicPr>
                   <pic:blipFill>
-                    <a:blip r:embed="rId33">
+                    <a:blip r:embed="rId34">
                       <a:extLst>
                         <a:ext uri="{28A0092B-C50C-407E-A947-70E740481C1C}">
                           <a14:useLocalDpi xmlns:a14="http://schemas.microsoft.com/office/drawing/2010/main" val="0"/>

</xml_diff>

<commit_message>
export / powerkey / sum worked hours for time frame
</commit_message>
<xml_diff>
--- a/Changelog.docx
+++ b/Changelog.docx
@@ -126,6 +126,7 @@
       </w:r>
       <w:r>
         <w:rPr>
+          <w:noProof/>
           <w:lang w:val="en-US"/>
         </w:rPr>
         <w:drawing>
@@ -291,6 +292,12 @@
           <w:lang w:val="en-US"/>
         </w:rPr>
       </w:pPr>
+      <w:r>
+        <w:rPr>
+          <w:lang w:val="en-US"/>
+        </w:rPr>
+        <w:t>Při exportu se už ukazují odpracované hodiny za daný úsek, ne za celý měsíc</w:t>
+      </w:r>
     </w:p>
     <w:p>
       <w:pPr>
@@ -1420,21 +1427,7 @@
         <w:rPr>
           <w:lang w:val="en-US"/>
         </w:rPr>
-        <w:t xml:space="preserve"> příchodů </w:t>
-      </w:r>
-      <w:proofErr w:type="gramStart"/>
-      <w:r>
-        <w:rPr>
-          <w:lang w:val="en-US"/>
-        </w:rPr>
-        <w:t>a</w:t>
-      </w:r>
-      <w:proofErr w:type="gramEnd"/>
-      <w:r>
-        <w:rPr>
-          <w:lang w:val="en-US"/>
-        </w:rPr>
-        <w:t xml:space="preserve"> odchodů</w:t>
+        <w:t xml:space="preserve"> příchodů a odchodů</w:t>
       </w:r>
       <w:r>
         <w:rPr>
@@ -2129,19 +2122,11 @@
           <w:lang w:val="en-US"/>
         </w:rPr>
       </w:pPr>
-      <w:proofErr w:type="gramStart"/>
-      <w:r>
-        <w:rPr>
-          <w:lang w:val="en-US"/>
-        </w:rPr>
-        <w:t>System.Runtime.InteropServices.COMException</w:t>
-      </w:r>
-      <w:proofErr w:type="gramEnd"/>
-      <w:r>
-        <w:rPr>
-          <w:lang w:val="en-US"/>
-        </w:rPr>
-        <w:t xml:space="preserve"> (0x80080005): Provádění serveru selhalo (0x80080005 (CO_E_SERVER_EXEC_FAILURE))</w:t>
+      <w:r>
+        <w:rPr>
+          <w:lang w:val="en-US"/>
+        </w:rPr>
+        <w:t>System.Runtime.InteropServices.COMException (0x80080005): Provádění serveru selhalo (0x80080005 (CO_E_SERVER_EXEC_FAILURE))</w:t>
       </w:r>
     </w:p>
     <w:p>
@@ -3121,6 +3106,7 @@
         <w:rPr>
           <w:lang w:val="en-US"/>
         </w:rPr>
+        <w:lastRenderedPageBreak/>
         <w:t>Verze 1.</w:t>
       </w:r>
       <w:r>
@@ -3582,21 +3568,7 @@
           <w:lang w:val="en-US"/>
         </w:rPr>
         <w:br/>
-        <w:t xml:space="preserve">Jedná se pouze o tuto část vizualizace, na zapsané hodiny, ani indikátory příchodu </w:t>
-      </w:r>
-      <w:proofErr w:type="gramStart"/>
-      <w:r>
-        <w:rPr>
-          <w:lang w:val="en-US"/>
-        </w:rPr>
-        <w:t>a</w:t>
-      </w:r>
-      <w:proofErr w:type="gramEnd"/>
-      <w:r>
-        <w:rPr>
-          <w:lang w:val="en-US"/>
-        </w:rPr>
-        <w:t xml:space="preserve"> odchodu to nemá vliv.</w:t>
+        <w:t>Jedná se pouze o tuto část vizualizace, na zapsané hodiny, ani indikátory příchodu a odchodu to nemá vliv.</w:t>
       </w:r>
       <w:r>
         <w:rPr>
@@ -6569,14 +6541,7 @@
         <w:rPr>
           <w:lang w:val="en-US"/>
         </w:rPr>
-        <w:t>V nastaveni (horní lišta =</w:t>
-      </w:r>
-      <w:proofErr w:type="gramStart"/>
-      <w:r>
-        <w:rPr>
-          <w:lang w:val="en-US"/>
-        </w:rPr>
-        <w:t xml:space="preserve">&gt; </w:t>
+        <w:t xml:space="preserve">V nastaveni (horní lišta =&gt; </w:t>
       </w:r>
       <w:r>
         <w:rPr>
@@ -6586,7 +6551,6 @@
         </w:rPr>
         <w:t>?</w:t>
       </w:r>
-      <w:proofErr w:type="gramEnd"/>
       <w:r>
         <w:rPr>
           <w:lang w:val="en-US"/>
@@ -6828,14 +6792,7 @@
         <w:rPr>
           <w:lang w:val="en-US"/>
         </w:rPr>
-        <w:t>V nastavení (horní lišta =</w:t>
-      </w:r>
-      <w:proofErr w:type="gramStart"/>
-      <w:r>
-        <w:rPr>
-          <w:lang w:val="en-US"/>
-        </w:rPr>
-        <w:t xml:space="preserve">&gt; </w:t>
+        <w:t xml:space="preserve">V nastavení (horní lišta =&gt; </w:t>
       </w:r>
       <w:r>
         <w:rPr>
@@ -6845,7 +6802,6 @@
         </w:rPr>
         <w:t>?</w:t>
       </w:r>
-      <w:proofErr w:type="gramEnd"/>
       <w:r>
         <w:rPr>
           <w:lang w:val="en-US"/>

</xml_diff>

<commit_message>
export / bugfix / snacks in entries
</commit_message>
<xml_diff>
--- a/Changelog.docx
+++ b/Changelog.docx
@@ -99,6 +99,81 @@
           <w:lang w:val="en-US"/>
         </w:rPr>
         <w:t>Kategorie ZÁKAZNICKÝ SERVIS</w:t>
+      </w:r>
+      <w:r>
+        <w:rPr>
+          <w:lang w:val="en-US"/>
+        </w:rPr>
+        <w:br/>
+      </w:r>
+      <w:r>
+        <w:rPr>
+          <w:lang w:val="en-US"/>
+        </w:rPr>
+        <w:drawing>
+          <wp:inline distT="0" distB="0" distL="0" distR="0" wp14:anchorId="29BFFAA7" wp14:editId="62F12FF2">
+            <wp:extent cx="4124901" cy="1438476"/>
+            <wp:effectExtent l="152400" t="171450" r="200025" b="200025"/>
+            <wp:docPr id="896007300" name="Obrázek 1"/>
+            <wp:cNvGraphicFramePr>
+              <a:graphicFrameLocks xmlns:a="http://schemas.openxmlformats.org/drawingml/2006/main" noChangeAspect="1"/>
+            </wp:cNvGraphicFramePr>
+            <a:graphic xmlns:a="http://schemas.openxmlformats.org/drawingml/2006/main">
+              <a:graphicData uri="http://schemas.openxmlformats.org/drawingml/2006/picture">
+                <pic:pic xmlns:pic="http://schemas.openxmlformats.org/drawingml/2006/picture">
+                  <pic:nvPicPr>
+                    <pic:cNvPr id="896007300" name=""/>
+                    <pic:cNvPicPr/>
+                  </pic:nvPicPr>
+                  <pic:blipFill>
+                    <a:blip r:embed="rId6"/>
+                    <a:stretch>
+                      <a:fillRect/>
+                    </a:stretch>
+                  </pic:blipFill>
+                  <pic:spPr>
+                    <a:xfrm>
+                      <a:off x="0" y="0"/>
+                      <a:ext cx="4124901" cy="1438476"/>
+                    </a:xfrm>
+                    <a:prstGeom prst="rect">
+                      <a:avLst/>
+                    </a:prstGeom>
+                    <a:solidFill>
+                      <a:srgbClr val="FFFFFF">
+                        <a:shade val="85000"/>
+                      </a:srgbClr>
+                    </a:solidFill>
+                    <a:ln w="190500" cap="rnd">
+                      <a:solidFill>
+                        <a:srgbClr val="FFFFFF"/>
+                      </a:solidFill>
+                    </a:ln>
+                    <a:effectLst>
+                      <a:outerShdw blurRad="50000" algn="tl" rotWithShape="0">
+                        <a:srgbClr val="000000">
+                          <a:alpha val="41000"/>
+                        </a:srgbClr>
+                      </a:outerShdw>
+                    </a:effectLst>
+                    <a:scene3d>
+                      <a:camera prst="orthographicFront"/>
+                      <a:lightRig rig="twoPt" dir="t">
+                        <a:rot lat="0" lon="0" rev="7800000"/>
+                      </a:lightRig>
+                    </a:scene3d>
+                    <a:sp3d contourW="6350">
+                      <a:bevelT w="50800" h="16510"/>
+                      <a:contourClr>
+                        <a:srgbClr val="C0C0C0"/>
+                      </a:contourClr>
+                    </a:sp3d>
+                  </pic:spPr>
+                </pic:pic>
+              </a:graphicData>
+            </a:graphic>
+          </wp:inline>
+        </w:drawing>
       </w:r>
     </w:p>
     <w:p>
@@ -145,7 +220,7 @@
                     <pic:cNvPicPr/>
                   </pic:nvPicPr>
                   <pic:blipFill>
-                    <a:blip r:embed="rId6"/>
+                    <a:blip r:embed="rId7"/>
                     <a:stretch>
                       <a:fillRect/>
                     </a:stretch>
@@ -222,7 +297,7 @@
                     <pic:cNvPicPr/>
                   </pic:nvPicPr>
                   <pic:blipFill>
-                    <a:blip r:embed="rId7"/>
+                    <a:blip r:embed="rId8"/>
                     <a:stretch>
                       <a:fillRect/>
                     </a:stretch>
@@ -310,6 +385,7 @@
         <w:rPr>
           <w:lang w:val="en-US"/>
         </w:rPr>
+        <w:lastRenderedPageBreak/>
         <w:t>Změněno</w:t>
       </w:r>
     </w:p>
@@ -346,7 +422,6 @@
         <w:rPr>
           <w:lang w:val="en-US"/>
         </w:rPr>
-        <w:lastRenderedPageBreak/>
         <w:t>V exportu se zobrazují i uživatelé, kteří nevykázali žádné hodiny + jsou zbarveni červeně</w:t>
       </w:r>
       <w:r>
@@ -376,7 +451,7 @@
                     <pic:cNvPicPr/>
                   </pic:nvPicPr>
                   <pic:blipFill>
-                    <a:blip r:embed="rId8"/>
+                    <a:blip r:embed="rId9"/>
                     <a:stretch>
                       <a:fillRect/>
                     </a:stretch>
@@ -423,7 +498,7 @@
                     <pic:cNvPicPr/>
                   </pic:nvPicPr>
                   <pic:blipFill>
-                    <a:blip r:embed="rId9"/>
+                    <a:blip r:embed="rId10"/>
                     <a:stretch>
                       <a:fillRect/>
                     </a:stretch>
@@ -590,7 +665,7 @@
                     <pic:cNvPicPr/>
                   </pic:nvPicPr>
                   <pic:blipFill>
-                    <a:blip r:embed="rId7"/>
+                    <a:blip r:embed="rId8"/>
                     <a:stretch>
                       <a:fillRect/>
                     </a:stretch>
@@ -857,7 +932,7 @@
                     <pic:cNvPicPr/>
                   </pic:nvPicPr>
                   <pic:blipFill>
-                    <a:blip r:embed="rId10"/>
+                    <a:blip r:embed="rId11"/>
                     <a:stretch>
                       <a:fillRect/>
                     </a:stretch>
@@ -1427,7 +1502,21 @@
         <w:rPr>
           <w:lang w:val="en-US"/>
         </w:rPr>
-        <w:t xml:space="preserve"> příchodů a odchodů</w:t>
+        <w:t xml:space="preserve"> příchodů </w:t>
+      </w:r>
+      <w:proofErr w:type="gramStart"/>
+      <w:r>
+        <w:rPr>
+          <w:lang w:val="en-US"/>
+        </w:rPr>
+        <w:t>a</w:t>
+      </w:r>
+      <w:proofErr w:type="gramEnd"/>
+      <w:r>
+        <w:rPr>
+          <w:lang w:val="en-US"/>
+        </w:rPr>
+        <w:t xml:space="preserve"> odchodů</w:t>
       </w:r>
       <w:r>
         <w:rPr>
@@ -2122,11 +2211,19 @@
           <w:lang w:val="en-US"/>
         </w:rPr>
       </w:pPr>
-      <w:r>
-        <w:rPr>
-          <w:lang w:val="en-US"/>
-        </w:rPr>
-        <w:t>System.Runtime.InteropServices.COMException (0x80080005): Provádění serveru selhalo (0x80080005 (CO_E_SERVER_EXEC_FAILURE))</w:t>
+      <w:proofErr w:type="gramStart"/>
+      <w:r>
+        <w:rPr>
+          <w:lang w:val="en-US"/>
+        </w:rPr>
+        <w:t>System.Runtime.InteropServices.COMException</w:t>
+      </w:r>
+      <w:proofErr w:type="gramEnd"/>
+      <w:r>
+        <w:rPr>
+          <w:lang w:val="en-US"/>
+        </w:rPr>
+        <w:t xml:space="preserve"> (0x80080005): Provádění serveru selhalo (0x80080005 (CO_E_SERVER_EXEC_FAILURE))</w:t>
       </w:r>
     </w:p>
     <w:p>
@@ -2357,7 +2454,7 @@
                     <pic:cNvPicPr/>
                   </pic:nvPicPr>
                   <pic:blipFill>
-                    <a:blip r:embed="rId11">
+                    <a:blip r:embed="rId12">
                       <a:extLst>
                         <a:ext uri="{28A0092B-C50C-407E-A947-70E740481C1C}">
                           <a14:useLocalDpi xmlns:a14="http://schemas.microsoft.com/office/drawing/2010/main" val="0"/>
@@ -2617,7 +2714,7 @@
                     <pic:cNvPicPr/>
                   </pic:nvPicPr>
                   <pic:blipFill>
-                    <a:blip r:embed="rId12"/>
+                    <a:blip r:embed="rId13"/>
                     <a:stretch>
                       <a:fillRect/>
                     </a:stretch>
@@ -2770,7 +2867,7 @@
                     <pic:cNvPicPr/>
                   </pic:nvPicPr>
                   <pic:blipFill>
-                    <a:blip r:embed="rId13"/>
+                    <a:blip r:embed="rId14"/>
                     <a:stretch>
                       <a:fillRect/>
                     </a:stretch>
@@ -3493,7 +3590,7 @@
                     <pic:cNvPicPr/>
                   </pic:nvPicPr>
                   <pic:blipFill>
-                    <a:blip r:embed="rId14"/>
+                    <a:blip r:embed="rId15"/>
                     <a:stretch>
                       <a:fillRect/>
                     </a:stretch>
@@ -3568,7 +3665,21 @@
           <w:lang w:val="en-US"/>
         </w:rPr>
         <w:br/>
-        <w:t>Jedná se pouze o tuto část vizualizace, na zapsané hodiny, ani indikátory příchodu a odchodu to nemá vliv.</w:t>
+        <w:t xml:space="preserve">Jedná se pouze o tuto část vizualizace, na zapsané hodiny, ani indikátory příchodu </w:t>
+      </w:r>
+      <w:proofErr w:type="gramStart"/>
+      <w:r>
+        <w:rPr>
+          <w:lang w:val="en-US"/>
+        </w:rPr>
+        <w:t>a</w:t>
+      </w:r>
+      <w:proofErr w:type="gramEnd"/>
+      <w:r>
+        <w:rPr>
+          <w:lang w:val="en-US"/>
+        </w:rPr>
+        <w:t xml:space="preserve"> odchodu to nemá vliv.</w:t>
       </w:r>
       <w:r>
         <w:rPr>
@@ -3597,7 +3708,7 @@
                     <pic:cNvPicPr/>
                   </pic:nvPicPr>
                   <pic:blipFill>
-                    <a:blip r:embed="rId15"/>
+                    <a:blip r:embed="rId16"/>
                     <a:stretch>
                       <a:fillRect/>
                     </a:stretch>
@@ -4220,7 +4331,7 @@
                     <pic:cNvPicPr/>
                   </pic:nvPicPr>
                   <pic:blipFill>
-                    <a:blip r:embed="rId16"/>
+                    <a:blip r:embed="rId17"/>
                     <a:stretch>
                       <a:fillRect/>
                     </a:stretch>
@@ -5068,7 +5179,7 @@
                     </pic:cNvPicPr>
                   </pic:nvPicPr>
                   <pic:blipFill>
-                    <a:blip r:embed="rId17">
+                    <a:blip r:embed="rId18">
                       <a:extLst>
                         <a:ext uri="{28A0092B-C50C-407E-A947-70E740481C1C}">
                           <a14:useLocalDpi xmlns:a14="http://schemas.microsoft.com/office/drawing/2010/main" val="0"/>
@@ -5152,7 +5263,7 @@
                     </pic:cNvPicPr>
                   </pic:nvPicPr>
                   <pic:blipFill>
-                    <a:blip r:embed="rId18">
+                    <a:blip r:embed="rId19">
                       <a:extLst>
                         <a:ext uri="{28A0092B-C50C-407E-A947-70E740481C1C}">
                           <a14:useLocalDpi xmlns:a14="http://schemas.microsoft.com/office/drawing/2010/main" val="0"/>
@@ -5262,7 +5373,7 @@
                     <pic:cNvPicPr/>
                   </pic:nvPicPr>
                   <pic:blipFill>
-                    <a:blip r:embed="rId19"/>
+                    <a:blip r:embed="rId20"/>
                     <a:stretch>
                       <a:fillRect/>
                     </a:stretch>
@@ -5998,7 +6109,7 @@
                     </pic:cNvPicPr>
                   </pic:nvPicPr>
                   <pic:blipFill>
-                    <a:blip r:embed="rId20">
+                    <a:blip r:embed="rId21">
                       <a:extLst>
                         <a:ext uri="{28A0092B-C50C-407E-A947-70E740481C1C}">
                           <a14:useLocalDpi xmlns:a14="http://schemas.microsoft.com/office/drawing/2010/main" val="0"/>
@@ -6269,7 +6380,7 @@
                     </pic:cNvPicPr>
                   </pic:nvPicPr>
                   <pic:blipFill>
-                    <a:blip r:embed="rId21">
+                    <a:blip r:embed="rId22">
                       <a:extLst>
                         <a:ext uri="{28A0092B-C50C-407E-A947-70E740481C1C}">
                           <a14:useLocalDpi xmlns:a14="http://schemas.microsoft.com/office/drawing/2010/main" val="0"/>
@@ -6326,7 +6437,7 @@
                     <pic:cNvPicPr/>
                   </pic:nvPicPr>
                   <pic:blipFill>
-                    <a:blip r:embed="rId22"/>
+                    <a:blip r:embed="rId23"/>
                     <a:stretch>
                       <a:fillRect/>
                     </a:stretch>
@@ -6541,7 +6652,14 @@
         <w:rPr>
           <w:lang w:val="en-US"/>
         </w:rPr>
-        <w:t xml:space="preserve">V nastaveni (horní lišta =&gt; </w:t>
+        <w:t>V nastaveni (horní lišta =</w:t>
+      </w:r>
+      <w:proofErr w:type="gramStart"/>
+      <w:r>
+        <w:rPr>
+          <w:lang w:val="en-US"/>
+        </w:rPr>
+        <w:t xml:space="preserve">&gt; </w:t>
       </w:r>
       <w:r>
         <w:rPr>
@@ -6551,6 +6669,7 @@
         </w:rPr>
         <w:t>?</w:t>
       </w:r>
+      <w:proofErr w:type="gramEnd"/>
       <w:r>
         <w:rPr>
           <w:lang w:val="en-US"/>
@@ -6630,7 +6749,7 @@
                     </pic:cNvPicPr>
                   </pic:nvPicPr>
                   <pic:blipFill>
-                    <a:blip r:embed="rId23">
+                    <a:blip r:embed="rId24">
                       <a:extLst>
                         <a:ext uri="{28A0092B-C50C-407E-A947-70E740481C1C}">
                           <a14:useLocalDpi xmlns:a14="http://schemas.microsoft.com/office/drawing/2010/main" val="0"/>
@@ -6709,7 +6828,7 @@
                     </pic:cNvPicPr>
                   </pic:nvPicPr>
                   <pic:blipFill>
-                    <a:blip r:embed="rId24">
+                    <a:blip r:embed="rId25">
                       <a:extLst>
                         <a:ext uri="{28A0092B-C50C-407E-A947-70E740481C1C}">
                           <a14:useLocalDpi xmlns:a14="http://schemas.microsoft.com/office/drawing/2010/main" val="0"/>
@@ -6792,7 +6911,14 @@
         <w:rPr>
           <w:lang w:val="en-US"/>
         </w:rPr>
-        <w:t xml:space="preserve">V nastavení (horní lišta =&gt; </w:t>
+        <w:t>V nastavení (horní lišta =</w:t>
+      </w:r>
+      <w:proofErr w:type="gramStart"/>
+      <w:r>
+        <w:rPr>
+          <w:lang w:val="en-US"/>
+        </w:rPr>
+        <w:t xml:space="preserve">&gt; </w:t>
       </w:r>
       <w:r>
         <w:rPr>
@@ -6802,6 +6928,7 @@
         </w:rPr>
         <w:t>?</w:t>
       </w:r>
+      <w:proofErr w:type="gramEnd"/>
       <w:r>
         <w:rPr>
           <w:lang w:val="en-US"/>
@@ -6924,7 +7051,7 @@
                     <pic:cNvPicPr/>
                   </pic:nvPicPr>
                   <pic:blipFill>
-                    <a:blip r:embed="rId25"/>
+                    <a:blip r:embed="rId26"/>
                     <a:stretch>
                       <a:fillRect/>
                     </a:stretch>
@@ -7154,7 +7281,7 @@
                     <pic:cNvPicPr/>
                   </pic:nvPicPr>
                   <pic:blipFill>
-                    <a:blip r:embed="rId26"/>
+                    <a:blip r:embed="rId27"/>
                     <a:stretch>
                       <a:fillRect/>
                     </a:stretch>
@@ -7248,7 +7375,7 @@
                     <pic:cNvPicPr/>
                   </pic:nvPicPr>
                   <pic:blipFill>
-                    <a:blip r:embed="rId27"/>
+                    <a:blip r:embed="rId28"/>
                     <a:stretch>
                       <a:fillRect/>
                     </a:stretch>
@@ -7343,7 +7470,7 @@
                     <pic:cNvPicPr/>
                   </pic:nvPicPr>
                   <pic:blipFill>
-                    <a:blip r:embed="rId28"/>
+                    <a:blip r:embed="rId29"/>
                     <a:stretch>
                       <a:fillRect/>
                     </a:stretch>
@@ -7437,7 +7564,7 @@
                     <pic:cNvPicPr/>
                   </pic:nvPicPr>
                   <pic:blipFill>
-                    <a:blip r:embed="rId29"/>
+                    <a:blip r:embed="rId30"/>
                     <a:stretch>
                       <a:fillRect/>
                     </a:stretch>
@@ -7692,7 +7819,7 @@
                     <pic:cNvPicPr/>
                   </pic:nvPicPr>
                   <pic:blipFill>
-                    <a:blip r:embed="rId30"/>
+                    <a:blip r:embed="rId31"/>
                     <a:stretch>
                       <a:fillRect/>
                     </a:stretch>
@@ -8584,7 +8711,7 @@
                     </pic:cNvPicPr>
                   </pic:nvPicPr>
                   <pic:blipFill>
-                    <a:blip r:embed="rId31">
+                    <a:blip r:embed="rId32">
                       <a:extLst>
                         <a:ext uri="{28A0092B-C50C-407E-A947-70E740481C1C}">
                           <a14:useLocalDpi xmlns:a14="http://schemas.microsoft.com/office/drawing/2010/main" val="0"/>
@@ -8745,7 +8872,7 @@
                     <pic:cNvPicPr/>
                   </pic:nvPicPr>
                   <pic:blipFill>
-                    <a:blip r:embed="rId32"/>
+                    <a:blip r:embed="rId33"/>
                     <a:stretch>
                       <a:fillRect/>
                     </a:stretch>
@@ -9472,7 +9599,7 @@
                     <pic:cNvPicPr/>
                   </pic:nvPicPr>
                   <pic:blipFill>
-                    <a:blip r:embed="rId33"/>
+                    <a:blip r:embed="rId34"/>
                     <a:stretch>
                       <a:fillRect/>
                     </a:stretch>
@@ -9585,7 +9712,7 @@
                     </pic:cNvPicPr>
                   </pic:nvPicPr>
                   <pic:blipFill>
-                    <a:blip r:embed="rId34">
+                    <a:blip r:embed="rId35">
                       <a:extLst>
                         <a:ext uri="{28A0092B-C50C-407E-A947-70E740481C1C}">
                           <a14:useLocalDpi xmlns:a14="http://schemas.microsoft.com/office/drawing/2010/main" val="0"/>

</xml_diff>

<commit_message>
export / summary / subtract absence in user summary
</commit_message>
<xml_diff>
--- a/Changelog.docx
+++ b/Changelog.docx
@@ -108,6 +108,7 @@
       </w:r>
       <w:r>
         <w:rPr>
+          <w:noProof/>
           <w:lang w:val="en-US"/>
         </w:rPr>
         <w:drawing>
@@ -193,53 +194,6 @@
         </w:rPr>
         <w:t>Při exportu možnost zahrnout “VYHODNOCENÍ”, kde je souhrnný přehled a grafy</w:t>
       </w:r>
-      <w:r>
-        <w:rPr>
-          <w:lang w:val="en-US"/>
-        </w:rPr>
-        <w:br/>
-      </w:r>
-      <w:r>
-        <w:rPr>
-          <w:noProof/>
-          <w:lang w:val="en-US"/>
-        </w:rPr>
-        <w:drawing>
-          <wp:inline distT="0" distB="0" distL="0" distR="0" wp14:anchorId="4947C575" wp14:editId="06FBC235">
-            <wp:extent cx="5760720" cy="3193415"/>
-            <wp:effectExtent l="0" t="0" r="0" b="6985"/>
-            <wp:docPr id="193333234" name="Obrázek 1"/>
-            <wp:cNvGraphicFramePr>
-              <a:graphicFrameLocks xmlns:a="http://schemas.openxmlformats.org/drawingml/2006/main" noChangeAspect="1"/>
-            </wp:cNvGraphicFramePr>
-            <a:graphic xmlns:a="http://schemas.openxmlformats.org/drawingml/2006/main">
-              <a:graphicData uri="http://schemas.openxmlformats.org/drawingml/2006/picture">
-                <pic:pic xmlns:pic="http://schemas.openxmlformats.org/drawingml/2006/picture">
-                  <pic:nvPicPr>
-                    <pic:cNvPr id="193333234" name=""/>
-                    <pic:cNvPicPr/>
-                  </pic:nvPicPr>
-                  <pic:blipFill>
-                    <a:blip r:embed="rId7"/>
-                    <a:stretch>
-                      <a:fillRect/>
-                    </a:stretch>
-                  </pic:blipFill>
-                  <pic:spPr>
-                    <a:xfrm>
-                      <a:off x="0" y="0"/>
-                      <a:ext cx="5760720" cy="3193415"/>
-                    </a:xfrm>
-                    <a:prstGeom prst="rect">
-                      <a:avLst/>
-                    </a:prstGeom>
-                  </pic:spPr>
-                </pic:pic>
-              </a:graphicData>
-            </a:graphic>
-          </wp:inline>
-        </w:drawing>
-      </w:r>
     </w:p>
     <w:p>
       <w:pPr>
@@ -297,7 +251,7 @@
                     <pic:cNvPicPr/>
                   </pic:nvPicPr>
                   <pic:blipFill>
-                    <a:blip r:embed="rId8"/>
+                    <a:blip r:embed="rId7"/>
                     <a:stretch>
                       <a:fillRect/>
                     </a:stretch>
@@ -385,7 +339,6 @@
         <w:rPr>
           <w:lang w:val="en-US"/>
         </w:rPr>
-        <w:lastRenderedPageBreak/>
         <w:t>Změněno</w:t>
       </w:r>
     </w:p>
@@ -422,7 +375,31 @@
         <w:rPr>
           <w:lang w:val="en-US"/>
         </w:rPr>
+        <w:t>Dovolená lze nyní nastavit pouze na délku maximálně 7,5 h</w:t>
+      </w:r>
+    </w:p>
+    <w:p>
+      <w:pPr>
+        <w:pStyle w:val="Odstavecseseznamem"/>
+        <w:numPr>
+          <w:ilvl w:val="0"/>
+          <w:numId w:val="7"/>
+        </w:numPr>
+        <w:rPr>
+          <w:lang w:val="en-US"/>
+        </w:rPr>
+      </w:pPr>
+      <w:r>
+        <w:rPr>
+          <w:lang w:val="en-US"/>
+        </w:rPr>
         <w:t>V exportu se zobrazují i uživatelé, kteří nevykázali žádné hodiny + jsou zbarveni červeně</w:t>
+      </w:r>
+      <w:r>
+        <w:rPr>
+          <w:lang w:val="en-US"/>
+        </w:rPr>
+        <w:t xml:space="preserve"> ti, kteří mají oproti příchodům a odchodům nesouhlasný počet vykázaných hodin o více než 5 %.</w:t>
       </w:r>
       <w:r>
         <w:rPr>
@@ -451,7 +428,7 @@
                     <pic:cNvPicPr/>
                   </pic:nvPicPr>
                   <pic:blipFill>
-                    <a:blip r:embed="rId9"/>
+                    <a:blip r:embed="rId8"/>
                     <a:stretch>
                       <a:fillRect/>
                     </a:stretch>
@@ -477,59 +454,19 @@
         </w:rPr>
         <w:br/>
       </w:r>
-      <w:r>
-        <w:rPr>
-          <w:noProof/>
-          <w:lang w:val="en-US"/>
-        </w:rPr>
-        <w:drawing>
-          <wp:inline distT="0" distB="0" distL="0" distR="0" wp14:anchorId="06F58C75" wp14:editId="151A174F">
-            <wp:extent cx="714475" cy="847843"/>
-            <wp:effectExtent l="0" t="0" r="9525" b="0"/>
-            <wp:docPr id="314221006" name="Obrázek 1"/>
-            <wp:cNvGraphicFramePr>
-              <a:graphicFrameLocks xmlns:a="http://schemas.openxmlformats.org/drawingml/2006/main" noChangeAspect="1"/>
-            </wp:cNvGraphicFramePr>
-            <a:graphic xmlns:a="http://schemas.openxmlformats.org/drawingml/2006/main">
-              <a:graphicData uri="http://schemas.openxmlformats.org/drawingml/2006/picture">
-                <pic:pic xmlns:pic="http://schemas.openxmlformats.org/drawingml/2006/picture">
-                  <pic:nvPicPr>
-                    <pic:cNvPr id="314221006" name=""/>
-                    <pic:cNvPicPr/>
-                  </pic:nvPicPr>
-                  <pic:blipFill>
-                    <a:blip r:embed="rId10"/>
-                    <a:stretch>
-                      <a:fillRect/>
-                    </a:stretch>
-                  </pic:blipFill>
-                  <pic:spPr>
-                    <a:xfrm>
-                      <a:off x="0" y="0"/>
-                      <a:ext cx="714475" cy="847843"/>
-                    </a:xfrm>
-                    <a:prstGeom prst="rect">
-                      <a:avLst/>
-                    </a:prstGeom>
-                  </pic:spPr>
-                </pic:pic>
-              </a:graphicData>
-            </a:graphic>
-          </wp:inline>
-        </w:drawing>
-      </w:r>
-    </w:p>
-    <w:p>
-      <w:pPr>
-        <w:pStyle w:val="Nadpis3"/>
-        <w:rPr>
-          <w:lang w:val="en-US"/>
-        </w:rPr>
-      </w:pPr>
-      <w:r>
-        <w:rPr>
-          <w:lang w:val="en-US"/>
-        </w:rPr>
+    </w:p>
+    <w:p>
+      <w:pPr>
+        <w:pStyle w:val="Nadpis3"/>
+        <w:rPr>
+          <w:lang w:val="en-US"/>
+        </w:rPr>
+      </w:pPr>
+      <w:r>
+        <w:rPr>
+          <w:lang w:val="en-US"/>
+        </w:rPr>
+        <w:lastRenderedPageBreak/>
         <w:t>Odebráno</w:t>
       </w:r>
     </w:p>
@@ -665,7 +602,7 @@
                     <pic:cNvPicPr/>
                   </pic:nvPicPr>
                   <pic:blipFill>
-                    <a:blip r:embed="rId8"/>
+                    <a:blip r:embed="rId7"/>
                     <a:stretch>
                       <a:fillRect/>
                     </a:stretch>
@@ -932,7 +869,7 @@
                     <pic:cNvPicPr/>
                   </pic:nvPicPr>
                   <pic:blipFill>
-                    <a:blip r:embed="rId11"/>
+                    <a:blip r:embed="rId9"/>
                     <a:stretch>
                       <a:fillRect/>
                     </a:stretch>
@@ -1502,21 +1439,7 @@
         <w:rPr>
           <w:lang w:val="en-US"/>
         </w:rPr>
-        <w:t xml:space="preserve"> příchodů </w:t>
-      </w:r>
-      <w:proofErr w:type="gramStart"/>
-      <w:r>
-        <w:rPr>
-          <w:lang w:val="en-US"/>
-        </w:rPr>
-        <w:t>a</w:t>
-      </w:r>
-      <w:proofErr w:type="gramEnd"/>
-      <w:r>
-        <w:rPr>
-          <w:lang w:val="en-US"/>
-        </w:rPr>
-        <w:t xml:space="preserve"> odchodů</w:t>
+        <w:t xml:space="preserve"> příchodů a odchodů</w:t>
       </w:r>
       <w:r>
         <w:rPr>
@@ -2211,19 +2134,11 @@
           <w:lang w:val="en-US"/>
         </w:rPr>
       </w:pPr>
-      <w:proofErr w:type="gramStart"/>
-      <w:r>
-        <w:rPr>
-          <w:lang w:val="en-US"/>
-        </w:rPr>
-        <w:t>System.Runtime.InteropServices.COMException</w:t>
-      </w:r>
-      <w:proofErr w:type="gramEnd"/>
-      <w:r>
-        <w:rPr>
-          <w:lang w:val="en-US"/>
-        </w:rPr>
-        <w:t xml:space="preserve"> (0x80080005): Provádění serveru selhalo (0x80080005 (CO_E_SERVER_EXEC_FAILURE))</w:t>
+      <w:r>
+        <w:rPr>
+          <w:lang w:val="en-US"/>
+        </w:rPr>
+        <w:t>System.Runtime.InteropServices.COMException (0x80080005): Provádění serveru selhalo (0x80080005 (CO_E_SERVER_EXEC_FAILURE))</w:t>
       </w:r>
     </w:p>
     <w:p>
@@ -2454,7 +2369,7 @@
                     <pic:cNvPicPr/>
                   </pic:nvPicPr>
                   <pic:blipFill>
-                    <a:blip r:embed="rId12">
+                    <a:blip r:embed="rId10">
                       <a:extLst>
                         <a:ext uri="{28A0092B-C50C-407E-A947-70E740481C1C}">
                           <a14:useLocalDpi xmlns:a14="http://schemas.microsoft.com/office/drawing/2010/main" val="0"/>
@@ -2714,7 +2629,7 @@
                     <pic:cNvPicPr/>
                   </pic:nvPicPr>
                   <pic:blipFill>
-                    <a:blip r:embed="rId13"/>
+                    <a:blip r:embed="rId11"/>
                     <a:stretch>
                       <a:fillRect/>
                     </a:stretch>
@@ -2867,7 +2782,7 @@
                     <pic:cNvPicPr/>
                   </pic:nvPicPr>
                   <pic:blipFill>
-                    <a:blip r:embed="rId14"/>
+                    <a:blip r:embed="rId12"/>
                     <a:stretch>
                       <a:fillRect/>
                     </a:stretch>
@@ -3590,7 +3505,7 @@
                     <pic:cNvPicPr/>
                   </pic:nvPicPr>
                   <pic:blipFill>
-                    <a:blip r:embed="rId15"/>
+                    <a:blip r:embed="rId13"/>
                     <a:stretch>
                       <a:fillRect/>
                     </a:stretch>
@@ -3665,21 +3580,7 @@
           <w:lang w:val="en-US"/>
         </w:rPr>
         <w:br/>
-        <w:t xml:space="preserve">Jedná se pouze o tuto část vizualizace, na zapsané hodiny, ani indikátory příchodu </w:t>
-      </w:r>
-      <w:proofErr w:type="gramStart"/>
-      <w:r>
-        <w:rPr>
-          <w:lang w:val="en-US"/>
-        </w:rPr>
-        <w:t>a</w:t>
-      </w:r>
-      <w:proofErr w:type="gramEnd"/>
-      <w:r>
-        <w:rPr>
-          <w:lang w:val="en-US"/>
-        </w:rPr>
-        <w:t xml:space="preserve"> odchodu to nemá vliv.</w:t>
+        <w:t>Jedná se pouze o tuto část vizualizace, na zapsané hodiny, ani indikátory příchodu a odchodu to nemá vliv.</w:t>
       </w:r>
       <w:r>
         <w:rPr>
@@ -3708,7 +3609,7 @@
                     <pic:cNvPicPr/>
                   </pic:nvPicPr>
                   <pic:blipFill>
-                    <a:blip r:embed="rId16"/>
+                    <a:blip r:embed="rId14"/>
                     <a:stretch>
                       <a:fillRect/>
                     </a:stretch>
@@ -4331,7 +4232,7 @@
                     <pic:cNvPicPr/>
                   </pic:nvPicPr>
                   <pic:blipFill>
-                    <a:blip r:embed="rId17"/>
+                    <a:blip r:embed="rId15"/>
                     <a:stretch>
                       <a:fillRect/>
                     </a:stretch>
@@ -5179,7 +5080,7 @@
                     </pic:cNvPicPr>
                   </pic:nvPicPr>
                   <pic:blipFill>
-                    <a:blip r:embed="rId18">
+                    <a:blip r:embed="rId16">
                       <a:extLst>
                         <a:ext uri="{28A0092B-C50C-407E-A947-70E740481C1C}">
                           <a14:useLocalDpi xmlns:a14="http://schemas.microsoft.com/office/drawing/2010/main" val="0"/>
@@ -5263,7 +5164,7 @@
                     </pic:cNvPicPr>
                   </pic:nvPicPr>
                   <pic:blipFill>
-                    <a:blip r:embed="rId19">
+                    <a:blip r:embed="rId17">
                       <a:extLst>
                         <a:ext uri="{28A0092B-C50C-407E-A947-70E740481C1C}">
                           <a14:useLocalDpi xmlns:a14="http://schemas.microsoft.com/office/drawing/2010/main" val="0"/>
@@ -5373,7 +5274,7 @@
                     <pic:cNvPicPr/>
                   </pic:nvPicPr>
                   <pic:blipFill>
-                    <a:blip r:embed="rId20"/>
+                    <a:blip r:embed="rId18"/>
                     <a:stretch>
                       <a:fillRect/>
                     </a:stretch>
@@ -6109,7 +6010,7 @@
                     </pic:cNvPicPr>
                   </pic:nvPicPr>
                   <pic:blipFill>
-                    <a:blip r:embed="rId21">
+                    <a:blip r:embed="rId19">
                       <a:extLst>
                         <a:ext uri="{28A0092B-C50C-407E-A947-70E740481C1C}">
                           <a14:useLocalDpi xmlns:a14="http://schemas.microsoft.com/office/drawing/2010/main" val="0"/>
@@ -6380,7 +6281,7 @@
                     </pic:cNvPicPr>
                   </pic:nvPicPr>
                   <pic:blipFill>
-                    <a:blip r:embed="rId22">
+                    <a:blip r:embed="rId20">
                       <a:extLst>
                         <a:ext uri="{28A0092B-C50C-407E-A947-70E740481C1C}">
                           <a14:useLocalDpi xmlns:a14="http://schemas.microsoft.com/office/drawing/2010/main" val="0"/>
@@ -6437,7 +6338,7 @@
                     <pic:cNvPicPr/>
                   </pic:nvPicPr>
                   <pic:blipFill>
-                    <a:blip r:embed="rId23"/>
+                    <a:blip r:embed="rId21"/>
                     <a:stretch>
                       <a:fillRect/>
                     </a:stretch>
@@ -6652,14 +6553,7 @@
         <w:rPr>
           <w:lang w:val="en-US"/>
         </w:rPr>
-        <w:t>V nastaveni (horní lišta =</w:t>
-      </w:r>
-      <w:proofErr w:type="gramStart"/>
-      <w:r>
-        <w:rPr>
-          <w:lang w:val="en-US"/>
-        </w:rPr>
-        <w:t xml:space="preserve">&gt; </w:t>
+        <w:t xml:space="preserve">V nastaveni (horní lišta =&gt; </w:t>
       </w:r>
       <w:r>
         <w:rPr>
@@ -6669,7 +6563,6 @@
         </w:rPr>
         <w:t>?</w:t>
       </w:r>
-      <w:proofErr w:type="gramEnd"/>
       <w:r>
         <w:rPr>
           <w:lang w:val="en-US"/>
@@ -6749,7 +6642,7 @@
                     </pic:cNvPicPr>
                   </pic:nvPicPr>
                   <pic:blipFill>
-                    <a:blip r:embed="rId24">
+                    <a:blip r:embed="rId22">
                       <a:extLst>
                         <a:ext uri="{28A0092B-C50C-407E-A947-70E740481C1C}">
                           <a14:useLocalDpi xmlns:a14="http://schemas.microsoft.com/office/drawing/2010/main" val="0"/>
@@ -6828,7 +6721,7 @@
                     </pic:cNvPicPr>
                   </pic:nvPicPr>
                   <pic:blipFill>
-                    <a:blip r:embed="rId25">
+                    <a:blip r:embed="rId23">
                       <a:extLst>
                         <a:ext uri="{28A0092B-C50C-407E-A947-70E740481C1C}">
                           <a14:useLocalDpi xmlns:a14="http://schemas.microsoft.com/office/drawing/2010/main" val="0"/>
@@ -6911,14 +6804,7 @@
         <w:rPr>
           <w:lang w:val="en-US"/>
         </w:rPr>
-        <w:t>V nastavení (horní lišta =</w:t>
-      </w:r>
-      <w:proofErr w:type="gramStart"/>
-      <w:r>
-        <w:rPr>
-          <w:lang w:val="en-US"/>
-        </w:rPr>
-        <w:t xml:space="preserve">&gt; </w:t>
+        <w:t xml:space="preserve">V nastavení (horní lišta =&gt; </w:t>
       </w:r>
       <w:r>
         <w:rPr>
@@ -6928,7 +6814,6 @@
         </w:rPr>
         <w:t>?</w:t>
       </w:r>
-      <w:proofErr w:type="gramEnd"/>
       <w:r>
         <w:rPr>
           <w:lang w:val="en-US"/>
@@ -7051,7 +6936,7 @@
                     <pic:cNvPicPr/>
                   </pic:nvPicPr>
                   <pic:blipFill>
-                    <a:blip r:embed="rId26"/>
+                    <a:blip r:embed="rId24"/>
                     <a:stretch>
                       <a:fillRect/>
                     </a:stretch>
@@ -7281,7 +7166,7 @@
                     <pic:cNvPicPr/>
                   </pic:nvPicPr>
                   <pic:blipFill>
-                    <a:blip r:embed="rId27"/>
+                    <a:blip r:embed="rId25"/>
                     <a:stretch>
                       <a:fillRect/>
                     </a:stretch>
@@ -7375,7 +7260,7 @@
                     <pic:cNvPicPr/>
                   </pic:nvPicPr>
                   <pic:blipFill>
-                    <a:blip r:embed="rId28"/>
+                    <a:blip r:embed="rId26"/>
                     <a:stretch>
                       <a:fillRect/>
                     </a:stretch>
@@ -7470,7 +7355,7 @@
                     <pic:cNvPicPr/>
                   </pic:nvPicPr>
                   <pic:blipFill>
-                    <a:blip r:embed="rId29"/>
+                    <a:blip r:embed="rId27"/>
                     <a:stretch>
                       <a:fillRect/>
                     </a:stretch>
@@ -7564,7 +7449,7 @@
                     <pic:cNvPicPr/>
                   </pic:nvPicPr>
                   <pic:blipFill>
-                    <a:blip r:embed="rId30"/>
+                    <a:blip r:embed="rId28"/>
                     <a:stretch>
                       <a:fillRect/>
                     </a:stretch>
@@ -7819,7 +7704,7 @@
                     <pic:cNvPicPr/>
                   </pic:nvPicPr>
                   <pic:blipFill>
-                    <a:blip r:embed="rId31"/>
+                    <a:blip r:embed="rId29"/>
                     <a:stretch>
                       <a:fillRect/>
                     </a:stretch>
@@ -8711,7 +8596,7 @@
                     </pic:cNvPicPr>
                   </pic:nvPicPr>
                   <pic:blipFill>
-                    <a:blip r:embed="rId32">
+                    <a:blip r:embed="rId30">
                       <a:extLst>
                         <a:ext uri="{28A0092B-C50C-407E-A947-70E740481C1C}">
                           <a14:useLocalDpi xmlns:a14="http://schemas.microsoft.com/office/drawing/2010/main" val="0"/>
@@ -8872,7 +8757,7 @@
                     <pic:cNvPicPr/>
                   </pic:nvPicPr>
                   <pic:blipFill>
-                    <a:blip r:embed="rId33"/>
+                    <a:blip r:embed="rId31"/>
                     <a:stretch>
                       <a:fillRect/>
                     </a:stretch>
@@ -9599,7 +9484,7 @@
                     <pic:cNvPicPr/>
                   </pic:nvPicPr>
                   <pic:blipFill>
-                    <a:blip r:embed="rId34"/>
+                    <a:blip r:embed="rId32"/>
                     <a:stretch>
                       <a:fillRect/>
                     </a:stretch>
@@ -9712,7 +9597,7 @@
                     </pic:cNvPicPr>
                   </pic:nvPicPr>
                   <pic:blipFill>
-                    <a:blip r:embed="rId35">
+                    <a:blip r:embed="rId33">
                       <a:extLst>
                         <a:ext uri="{28A0092B-C50C-407E-A947-70E740481C1C}">
                           <a14:useLocalDpi xmlns:a14="http://schemas.microsoft.com/office/drawing/2010/main" val="0"/>

</xml_diff>

<commit_message>
import / backend + frontend
</commit_message>
<xml_diff>
--- a/Changelog.docx
+++ b/Changelog.docx
@@ -102,6 +102,7 @@
       </w:r>
       <w:r>
         <w:rPr>
+          <w:noProof/>
           <w:lang w:val="en-US"/>
         </w:rPr>
         <w:br/>
@@ -112,7 +113,77 @@
           <w:lang w:val="en-US"/>
         </w:rPr>
         <w:drawing>
-          <wp:inline distT="0" distB="0" distL="0" distR="0" wp14:anchorId="29BFFAA7" wp14:editId="62F12FF2">
+          <wp:inline distT="0" distB="0" distL="0" distR="0" wp14:anchorId="30E47337" wp14:editId="0B0081BF">
+            <wp:extent cx="2648320" cy="4858428"/>
+            <wp:effectExtent l="171450" t="171450" r="171450" b="189865"/>
+            <wp:docPr id="2063177506" name="Obrázek 1"/>
+            <wp:cNvGraphicFramePr>
+              <a:graphicFrameLocks xmlns:a="http://schemas.openxmlformats.org/drawingml/2006/main" noChangeAspect="1"/>
+            </wp:cNvGraphicFramePr>
+            <a:graphic xmlns:a="http://schemas.openxmlformats.org/drawingml/2006/main">
+              <a:graphicData uri="http://schemas.openxmlformats.org/drawingml/2006/picture">
+                <pic:pic xmlns:pic="http://schemas.openxmlformats.org/drawingml/2006/picture">
+                  <pic:nvPicPr>
+                    <pic:cNvPr id="2063177506" name=""/>
+                    <pic:cNvPicPr/>
+                  </pic:nvPicPr>
+                  <pic:blipFill>
+                    <a:blip r:embed="rId6"/>
+                    <a:stretch>
+                      <a:fillRect/>
+                    </a:stretch>
+                  </pic:blipFill>
+                  <pic:spPr>
+                    <a:xfrm>
+                      <a:off x="0" y="0"/>
+                      <a:ext cx="2648320" cy="4858428"/>
+                    </a:xfrm>
+                    <a:prstGeom prst="rect">
+                      <a:avLst/>
+                    </a:prstGeom>
+                    <a:solidFill>
+                      <a:srgbClr val="FFFFFF">
+                        <a:shade val="85000"/>
+                      </a:srgbClr>
+                    </a:solidFill>
+                    <a:ln w="190500" cap="rnd">
+                      <a:solidFill>
+                        <a:srgbClr val="FFFFFF"/>
+                      </a:solidFill>
+                    </a:ln>
+                    <a:effectLst>
+                      <a:outerShdw blurRad="50000" algn="tl" rotWithShape="0">
+                        <a:srgbClr val="000000">
+                          <a:alpha val="41000"/>
+                        </a:srgbClr>
+                      </a:outerShdw>
+                    </a:effectLst>
+                    <a:scene3d>
+                      <a:camera prst="orthographicFront"/>
+                      <a:lightRig rig="twoPt" dir="t">
+                        <a:rot lat="0" lon="0" rev="7800000"/>
+                      </a:lightRig>
+                    </a:scene3d>
+                    <a:sp3d contourW="6350">
+                      <a:bevelT w="50800" h="16510"/>
+                      <a:contourClr>
+                        <a:srgbClr val="C0C0C0"/>
+                      </a:contourClr>
+                    </a:sp3d>
+                  </pic:spPr>
+                </pic:pic>
+              </a:graphicData>
+            </a:graphic>
+          </wp:inline>
+        </w:drawing>
+      </w:r>
+      <w:r>
+        <w:rPr>
+          <w:noProof/>
+          <w:lang w:val="en-US"/>
+        </w:rPr>
+        <w:drawing>
+          <wp:inline distT="0" distB="0" distL="0" distR="0" wp14:anchorId="29BFFAA7" wp14:editId="2B749F59">
             <wp:extent cx="4124901" cy="1438476"/>
             <wp:effectExtent l="152400" t="171450" r="200025" b="200025"/>
             <wp:docPr id="896007300" name="Obrázek 1"/>
@@ -127,7 +198,7 @@
                     <pic:cNvPicPr/>
                   </pic:nvPicPr>
                   <pic:blipFill>
-                    <a:blip r:embed="rId6"/>
+                    <a:blip r:embed="rId7"/>
                     <a:stretch>
                       <a:fillRect/>
                     </a:stretch>
@@ -192,8 +263,84 @@
         <w:rPr>
           <w:lang w:val="en-US"/>
         </w:rPr>
+        <w:lastRenderedPageBreak/>
         <w:t>Při exportu možnost zahrnout “VYHODNOCENÍ”, kde je souhrnný přehled a grafy</w:t>
       </w:r>
+      <w:r>
+        <w:rPr>
+          <w:lang w:val="en-US"/>
+        </w:rPr>
+        <w:br/>
+      </w:r>
+      <w:r>
+        <w:rPr>
+          <w:lang w:val="en-US"/>
+        </w:rPr>
+        <w:drawing>
+          <wp:inline distT="0" distB="0" distL="0" distR="0" wp14:anchorId="6DC37011" wp14:editId="0667EF31">
+            <wp:extent cx="4933950" cy="3311055"/>
+            <wp:effectExtent l="171450" t="171450" r="190500" b="194310"/>
+            <wp:docPr id="870869665" name="Obrázek 1"/>
+            <wp:cNvGraphicFramePr>
+              <a:graphicFrameLocks xmlns:a="http://schemas.openxmlformats.org/drawingml/2006/main" noChangeAspect="1"/>
+            </wp:cNvGraphicFramePr>
+            <a:graphic xmlns:a="http://schemas.openxmlformats.org/drawingml/2006/main">
+              <a:graphicData uri="http://schemas.openxmlformats.org/drawingml/2006/picture">
+                <pic:pic xmlns:pic="http://schemas.openxmlformats.org/drawingml/2006/picture">
+                  <pic:nvPicPr>
+                    <pic:cNvPr id="870869665" name=""/>
+                    <pic:cNvPicPr/>
+                  </pic:nvPicPr>
+                  <pic:blipFill>
+                    <a:blip r:embed="rId8"/>
+                    <a:stretch>
+                      <a:fillRect/>
+                    </a:stretch>
+                  </pic:blipFill>
+                  <pic:spPr>
+                    <a:xfrm>
+                      <a:off x="0" y="0"/>
+                      <a:ext cx="4936504" cy="3312769"/>
+                    </a:xfrm>
+                    <a:prstGeom prst="rect">
+                      <a:avLst/>
+                    </a:prstGeom>
+                    <a:solidFill>
+                      <a:srgbClr val="FFFFFF">
+                        <a:shade val="85000"/>
+                      </a:srgbClr>
+                    </a:solidFill>
+                    <a:ln w="190500" cap="rnd">
+                      <a:solidFill>
+                        <a:srgbClr val="FFFFFF"/>
+                      </a:solidFill>
+                    </a:ln>
+                    <a:effectLst>
+                      <a:outerShdw blurRad="50000" algn="tl" rotWithShape="0">
+                        <a:srgbClr val="000000">
+                          <a:alpha val="41000"/>
+                        </a:srgbClr>
+                      </a:outerShdw>
+                    </a:effectLst>
+                    <a:scene3d>
+                      <a:camera prst="orthographicFront"/>
+                      <a:lightRig rig="twoPt" dir="t">
+                        <a:rot lat="0" lon="0" rev="7800000"/>
+                      </a:lightRig>
+                    </a:scene3d>
+                    <a:sp3d contourW="6350">
+                      <a:bevelT w="50800" h="16510"/>
+                      <a:contourClr>
+                        <a:srgbClr val="C0C0C0"/>
+                      </a:contourClr>
+                    </a:sp3d>
+                  </pic:spPr>
+                </pic:pic>
+              </a:graphicData>
+            </a:graphic>
+          </wp:inline>
+        </w:drawing>
+      </w:r>
     </w:p>
     <w:p>
       <w:pPr>
@@ -206,6 +353,402 @@
           <w:lang w:val="en-US"/>
         </w:rPr>
       </w:pPr>
+      <w:r>
+        <w:rPr>
+          <w:lang w:val="en-US"/>
+        </w:rPr>
+        <w:t>Import hodin ze šablony pro externí pracovníky</w:t>
+      </w:r>
+      <w:r>
+        <w:rPr>
+          <w:lang w:val="en-US"/>
+        </w:rPr>
+        <w:br/>
+      </w:r>
+      <w:r>
+        <w:rPr>
+          <w:lang w:val="en-US"/>
+        </w:rPr>
+        <w:drawing>
+          <wp:inline distT="0" distB="0" distL="0" distR="0" wp14:anchorId="56FF610F" wp14:editId="26138727">
+            <wp:extent cx="1533739" cy="1105054"/>
+            <wp:effectExtent l="190500" t="171450" r="200025" b="171450"/>
+            <wp:docPr id="603979596" name="Obrázek 1"/>
+            <wp:cNvGraphicFramePr>
+              <a:graphicFrameLocks xmlns:a="http://schemas.openxmlformats.org/drawingml/2006/main" noChangeAspect="1"/>
+            </wp:cNvGraphicFramePr>
+            <a:graphic xmlns:a="http://schemas.openxmlformats.org/drawingml/2006/main">
+              <a:graphicData uri="http://schemas.openxmlformats.org/drawingml/2006/picture">
+                <pic:pic xmlns:pic="http://schemas.openxmlformats.org/drawingml/2006/picture">
+                  <pic:nvPicPr>
+                    <pic:cNvPr id="603979596" name=""/>
+                    <pic:cNvPicPr/>
+                  </pic:nvPicPr>
+                  <pic:blipFill>
+                    <a:blip r:embed="rId9"/>
+                    <a:stretch>
+                      <a:fillRect/>
+                    </a:stretch>
+                  </pic:blipFill>
+                  <pic:spPr>
+                    <a:xfrm>
+                      <a:off x="0" y="0"/>
+                      <a:ext cx="1533739" cy="1105054"/>
+                    </a:xfrm>
+                    <a:prstGeom prst="rect">
+                      <a:avLst/>
+                    </a:prstGeom>
+                    <a:solidFill>
+                      <a:srgbClr val="FFFFFF">
+                        <a:shade val="85000"/>
+                      </a:srgbClr>
+                    </a:solidFill>
+                    <a:ln w="190500" cap="rnd">
+                      <a:solidFill>
+                        <a:srgbClr val="FFFFFF"/>
+                      </a:solidFill>
+                    </a:ln>
+                    <a:effectLst>
+                      <a:outerShdw blurRad="50000" algn="tl" rotWithShape="0">
+                        <a:srgbClr val="000000">
+                          <a:alpha val="41000"/>
+                        </a:srgbClr>
+                      </a:outerShdw>
+                    </a:effectLst>
+                    <a:scene3d>
+                      <a:camera prst="orthographicFront"/>
+                      <a:lightRig rig="twoPt" dir="t">
+                        <a:rot lat="0" lon="0" rev="7800000"/>
+                      </a:lightRig>
+                    </a:scene3d>
+                    <a:sp3d contourW="6350">
+                      <a:bevelT w="50800" h="16510"/>
+                      <a:contourClr>
+                        <a:srgbClr val="C0C0C0"/>
+                      </a:contourClr>
+                    </a:sp3d>
+                  </pic:spPr>
+                </pic:pic>
+              </a:graphicData>
+            </a:graphic>
+          </wp:inline>
+        </w:drawing>
+      </w:r>
+    </w:p>
+    <w:p>
+      <w:pPr>
+        <w:pStyle w:val="Nadpis3"/>
+        <w:rPr>
+          <w:lang w:val="en-US"/>
+        </w:rPr>
+      </w:pPr>
+      <w:r>
+        <w:rPr>
+          <w:lang w:val="en-US"/>
+        </w:rPr>
+        <w:t>Opraveno</w:t>
+      </w:r>
+      <w:r>
+        <w:rPr>
+          <w:lang w:val="en-US"/>
+        </w:rPr>
+        <w:t xml:space="preserve"> </w:t>
+      </w:r>
+    </w:p>
+    <w:p>
+      <w:pPr>
+        <w:pStyle w:val="Odstavecseseznamem"/>
+        <w:numPr>
+          <w:ilvl w:val="0"/>
+          <w:numId w:val="7"/>
+        </w:numPr>
+        <w:rPr>
+          <w:lang w:val="en-US"/>
+        </w:rPr>
+      </w:pPr>
+      <w:r>
+        <w:rPr>
+          <w:lang w:val="en-US"/>
+        </w:rPr>
+        <w:t xml:space="preserve">Při exportu se už ukazují odpracované hodiny </w:t>
+      </w:r>
+      <w:r>
+        <w:rPr>
+          <w:lang w:val="en-US"/>
+        </w:rPr>
+        <w:t xml:space="preserve">z powerkey za </w:t>
+      </w:r>
+      <w:r>
+        <w:rPr>
+          <w:lang w:val="en-US"/>
+        </w:rPr>
+        <w:t>daný úsek, ne za celý měsíc</w:t>
+      </w:r>
+    </w:p>
+    <w:p>
+      <w:pPr>
+        <w:pStyle w:val="Nadpis3"/>
+        <w:rPr>
+          <w:lang w:val="en-US"/>
+        </w:rPr>
+      </w:pPr>
+      <w:r>
+        <w:rPr>
+          <w:lang w:val="en-US"/>
+        </w:rPr>
+        <w:t>Změněno</w:t>
+      </w:r>
+    </w:p>
+    <w:p>
+      <w:pPr>
+        <w:pStyle w:val="Odstavecseseznamem"/>
+        <w:numPr>
+          <w:ilvl w:val="0"/>
+          <w:numId w:val="7"/>
+        </w:numPr>
+        <w:rPr>
+          <w:lang w:val="en-US"/>
+        </w:rPr>
+      </w:pPr>
+      <w:r>
+        <w:rPr>
+          <w:lang w:val="en-US"/>
+        </w:rPr>
+        <w:t>V souhrnu vykázaných hodin i v postranním panelu se bude počítat nepřítomnost (dovolená / lékař) jako vykázané hodiny</w:t>
+      </w:r>
+    </w:p>
+    <w:p>
+      <w:pPr>
+        <w:pStyle w:val="Odstavecseseznamem"/>
+        <w:numPr>
+          <w:ilvl w:val="0"/>
+          <w:numId w:val="7"/>
+        </w:numPr>
+        <w:rPr>
+          <w:lang w:val="en-US"/>
+        </w:rPr>
+      </w:pPr>
+      <w:r>
+        <w:rPr>
+          <w:lang w:val="en-US"/>
+        </w:rPr>
+        <w:t>V exportu se zobrazují i uživatelé, kteří nevykázali žádné hodiny + jsou zbarveni červeně</w:t>
+      </w:r>
+      <w:r>
+        <w:rPr>
+          <w:lang w:val="en-US"/>
+        </w:rPr>
+        <w:t xml:space="preserve"> ti, kteří mají oproti příchodům</w:t>
+      </w:r>
+      <w:r>
+        <w:rPr>
+          <w:lang w:val="en-US"/>
+        </w:rPr>
+        <w:t>/</w:t>
+      </w:r>
+      <w:r>
+        <w:rPr>
+          <w:lang w:val="en-US"/>
+        </w:rPr>
+        <w:t xml:space="preserve">odchodům nesouhlasný počet vykázaných hodin o více než </w:t>
+      </w:r>
+      <w:r>
+        <w:rPr>
+          <w:lang w:val="en-US"/>
+        </w:rPr>
+        <w:t>10</w:t>
+      </w:r>
+      <w:r>
+        <w:rPr>
+          <w:lang w:val="en-US"/>
+        </w:rPr>
+        <w:t xml:space="preserve"> %.</w:t>
+      </w:r>
+      <w:r>
+        <w:rPr>
+          <w:lang w:val="en-US"/>
+        </w:rPr>
+        <w:br/>
+      </w:r>
+      <w:r>
+        <w:rPr>
+          <w:noProof/>
+          <w:lang w:val="en-US"/>
+        </w:rPr>
+        <w:lastRenderedPageBreak/>
+        <w:drawing>
+          <wp:inline distT="0" distB="0" distL="0" distR="0" wp14:anchorId="08C40FE6" wp14:editId="24D71CA9">
+            <wp:extent cx="5314950" cy="1292414"/>
+            <wp:effectExtent l="171450" t="171450" r="171450" b="193675"/>
+            <wp:docPr id="2014013142" name="Obrázek 1"/>
+            <wp:cNvGraphicFramePr>
+              <a:graphicFrameLocks xmlns:a="http://schemas.openxmlformats.org/drawingml/2006/main" noChangeAspect="1"/>
+            </wp:cNvGraphicFramePr>
+            <a:graphic xmlns:a="http://schemas.openxmlformats.org/drawingml/2006/main">
+              <a:graphicData uri="http://schemas.openxmlformats.org/drawingml/2006/picture">
+                <pic:pic xmlns:pic="http://schemas.openxmlformats.org/drawingml/2006/picture">
+                  <pic:nvPicPr>
+                    <pic:cNvPr id="2014013142" name=""/>
+                    <pic:cNvPicPr/>
+                  </pic:nvPicPr>
+                  <pic:blipFill>
+                    <a:blip r:embed="rId10"/>
+                    <a:stretch>
+                      <a:fillRect/>
+                    </a:stretch>
+                  </pic:blipFill>
+                  <pic:spPr>
+                    <a:xfrm>
+                      <a:off x="0" y="0"/>
+                      <a:ext cx="5321375" cy="1293976"/>
+                    </a:xfrm>
+                    <a:prstGeom prst="rect">
+                      <a:avLst/>
+                    </a:prstGeom>
+                    <a:solidFill>
+                      <a:srgbClr val="FFFFFF">
+                        <a:shade val="85000"/>
+                      </a:srgbClr>
+                    </a:solidFill>
+                    <a:ln w="190500" cap="rnd">
+                      <a:solidFill>
+                        <a:srgbClr val="FFFFFF"/>
+                      </a:solidFill>
+                    </a:ln>
+                    <a:effectLst>
+                      <a:outerShdw blurRad="50000" algn="tl" rotWithShape="0">
+                        <a:srgbClr val="000000">
+                          <a:alpha val="41000"/>
+                        </a:srgbClr>
+                      </a:outerShdw>
+                    </a:effectLst>
+                    <a:scene3d>
+                      <a:camera prst="orthographicFront"/>
+                      <a:lightRig rig="twoPt" dir="t">
+                        <a:rot lat="0" lon="0" rev="7800000"/>
+                      </a:lightRig>
+                    </a:scene3d>
+                    <a:sp3d contourW="6350">
+                      <a:bevelT w="50800" h="16510"/>
+                      <a:contourClr>
+                        <a:srgbClr val="C0C0C0"/>
+                      </a:contourClr>
+                    </a:sp3d>
+                  </pic:spPr>
+                </pic:pic>
+              </a:graphicData>
+            </a:graphic>
+          </wp:inline>
+        </w:drawing>
+      </w:r>
+      <w:r>
+        <w:rPr>
+          <w:lang w:val="en-US"/>
+        </w:rPr>
+        <w:br/>
+      </w:r>
+    </w:p>
+    <w:p>
+      <w:pPr>
+        <w:pStyle w:val="Nadpis3"/>
+        <w:rPr>
+          <w:lang w:val="en-US"/>
+        </w:rPr>
+      </w:pPr>
+      <w:r>
+        <w:rPr>
+          <w:lang w:val="en-US"/>
+        </w:rPr>
+        <w:t>Odebráno</w:t>
+      </w:r>
+    </w:p>
+    <w:p>
+      <w:pPr>
+        <w:pStyle w:val="Odstavecseseznamem"/>
+        <w:numPr>
+          <w:ilvl w:val="0"/>
+          <w:numId w:val="7"/>
+        </w:numPr>
+        <w:rPr>
+          <w:lang w:val="en-US"/>
+        </w:rPr>
+      </w:pPr>
+    </w:p>
+    <w:p>
+      <w:pPr>
+        <w:rPr>
+          <w:rFonts w:asciiTheme="majorHAnsi" w:eastAsiaTheme="majorEastAsia" w:hAnsiTheme="majorHAnsi" w:cstheme="majorBidi"/>
+          <w:color w:val="0F4761" w:themeColor="accent1" w:themeShade="BF"/>
+          <w:sz w:val="32"/>
+          <w:szCs w:val="32"/>
+          <w:lang w:val="en-US"/>
+        </w:rPr>
+      </w:pPr>
+      <w:r>
+        <w:rPr>
+          <w:lang w:val="en-US"/>
+        </w:rPr>
+        <w:br w:type="page"/>
+      </w:r>
+    </w:p>
+    <w:p>
+      <w:pPr>
+        <w:pStyle w:val="Nadpis2"/>
+        <w:rPr>
+          <w:lang w:val="en-US"/>
+        </w:rPr>
+      </w:pPr>
+      <w:r>
+        <w:rPr>
+          <w:lang w:val="en-US"/>
+        </w:rPr>
+        <w:lastRenderedPageBreak/>
+        <w:t>Verze 1.</w:t>
+      </w:r>
+      <w:r>
+        <w:rPr>
+          <w:lang w:val="en-US"/>
+        </w:rPr>
+        <w:t>5</w:t>
+      </w:r>
+      <w:r>
+        <w:rPr>
+          <w:lang w:val="en-US"/>
+        </w:rPr>
+        <w:t>.</w:t>
+      </w:r>
+      <w:r>
+        <w:rPr>
+          <w:lang w:val="en-US"/>
+        </w:rPr>
+        <w:t>0.0</w:t>
+      </w:r>
+      <w:r>
+        <w:rPr>
+          <w:lang w:val="en-US"/>
+        </w:rPr>
+        <w:t xml:space="preserve"> </w:t>
+      </w:r>
+      <w:r>
+        <w:rPr>
+          <w:lang w:val="en-US"/>
+        </w:rPr>
+        <w:t>– 23.4.2026</w:t>
+      </w:r>
+    </w:p>
+    <w:p>
+      <w:pPr>
+        <w:pStyle w:val="Nadpis3"/>
+        <w:rPr>
+          <w:lang w:val="en-US"/>
+        </w:rPr>
+      </w:pPr>
+      <w:r>
+        <w:rPr>
+          <w:lang w:val="en-US"/>
+        </w:rPr>
+        <w:t>Přidáno</w:t>
+      </w:r>
     </w:p>
     <w:p>
       <w:pPr>
@@ -236,10 +779,10 @@
           <w:lang w:val="en-US"/>
         </w:rPr>
         <w:drawing>
-          <wp:inline distT="0" distB="0" distL="0" distR="0" wp14:anchorId="2FE9D894" wp14:editId="39266036">
+          <wp:inline distT="0" distB="0" distL="0" distR="0" wp14:anchorId="50E11EF2" wp14:editId="676D179B">
             <wp:extent cx="1200318" cy="419158"/>
             <wp:effectExtent l="0" t="0" r="0" b="0"/>
-            <wp:docPr id="1419679278" name="Obrázek 1"/>
+            <wp:docPr id="912460511" name="Obrázek 1"/>
             <wp:cNvGraphicFramePr>
               <a:graphicFrameLocks xmlns:a="http://schemas.openxmlformats.org/drawingml/2006/main" noChangeAspect="1"/>
             </wp:cNvGraphicFramePr>
@@ -251,7 +794,7 @@
                     <pic:cNvPicPr/>
                   </pic:nvPicPr>
                   <pic:blipFill>
-                    <a:blip r:embed="rId7"/>
+                    <a:blip r:embed="rId11"/>
                     <a:stretch>
                       <a:fillRect/>
                     </a:stretch>
@@ -321,357 +864,6 @@
           <w:lang w:val="en-US"/>
         </w:rPr>
       </w:pPr>
-      <w:r>
-        <w:rPr>
-          <w:lang w:val="en-US"/>
-        </w:rPr>
-        <w:t>Při exportu se už ukazují odpracované hodiny za daný úsek, ne za celý měsíc</w:t>
-      </w:r>
-    </w:p>
-    <w:p>
-      <w:pPr>
-        <w:pStyle w:val="Nadpis3"/>
-        <w:rPr>
-          <w:lang w:val="en-US"/>
-        </w:rPr>
-      </w:pPr>
-      <w:r>
-        <w:rPr>
-          <w:lang w:val="en-US"/>
-        </w:rPr>
-        <w:t>Změněno</w:t>
-      </w:r>
-    </w:p>
-    <w:p>
-      <w:pPr>
-        <w:pStyle w:val="Odstavecseseznamem"/>
-        <w:numPr>
-          <w:ilvl w:val="0"/>
-          <w:numId w:val="7"/>
-        </w:numPr>
-        <w:rPr>
-          <w:lang w:val="en-US"/>
-        </w:rPr>
-      </w:pPr>
-      <w:r>
-        <w:rPr>
-          <w:lang w:val="en-US"/>
-        </w:rPr>
-        <w:t>V souhrnu vykázaných hodin i v postranním panelu se bude počítat nepřítomnost (dovolená / lékař) jako vykázané hodiny</w:t>
-      </w:r>
-    </w:p>
-    <w:p>
-      <w:pPr>
-        <w:pStyle w:val="Odstavecseseznamem"/>
-        <w:numPr>
-          <w:ilvl w:val="0"/>
-          <w:numId w:val="7"/>
-        </w:numPr>
-        <w:rPr>
-          <w:lang w:val="en-US"/>
-        </w:rPr>
-      </w:pPr>
-      <w:r>
-        <w:rPr>
-          <w:lang w:val="en-US"/>
-        </w:rPr>
-        <w:t>Dovolená lze nyní nastavit pouze na délku maximálně 7,5 h</w:t>
-      </w:r>
-    </w:p>
-    <w:p>
-      <w:pPr>
-        <w:pStyle w:val="Odstavecseseznamem"/>
-        <w:numPr>
-          <w:ilvl w:val="0"/>
-          <w:numId w:val="7"/>
-        </w:numPr>
-        <w:rPr>
-          <w:lang w:val="en-US"/>
-        </w:rPr>
-      </w:pPr>
-      <w:r>
-        <w:rPr>
-          <w:lang w:val="en-US"/>
-        </w:rPr>
-        <w:t>V exportu se zobrazují i uživatelé, kteří nevykázali žádné hodiny + jsou zbarveni červeně</w:t>
-      </w:r>
-      <w:r>
-        <w:rPr>
-          <w:lang w:val="en-US"/>
-        </w:rPr>
-        <w:t xml:space="preserve"> ti, kteří mají oproti příchodům a odchodům nesouhlasný počet vykázaných hodin o více než 5 %.</w:t>
-      </w:r>
-      <w:r>
-        <w:rPr>
-          <w:lang w:val="en-US"/>
-        </w:rPr>
-        <w:br/>
-      </w:r>
-      <w:r>
-        <w:rPr>
-          <w:noProof/>
-          <w:lang w:val="en-US"/>
-        </w:rPr>
-        <w:drawing>
-          <wp:inline distT="0" distB="0" distL="0" distR="0" wp14:anchorId="08C40FE6" wp14:editId="7BE97162">
-            <wp:extent cx="5760720" cy="1400810"/>
-            <wp:effectExtent l="0" t="0" r="0" b="8890"/>
-            <wp:docPr id="2014013142" name="Obrázek 1"/>
-            <wp:cNvGraphicFramePr>
-              <a:graphicFrameLocks xmlns:a="http://schemas.openxmlformats.org/drawingml/2006/main" noChangeAspect="1"/>
-            </wp:cNvGraphicFramePr>
-            <a:graphic xmlns:a="http://schemas.openxmlformats.org/drawingml/2006/main">
-              <a:graphicData uri="http://schemas.openxmlformats.org/drawingml/2006/picture">
-                <pic:pic xmlns:pic="http://schemas.openxmlformats.org/drawingml/2006/picture">
-                  <pic:nvPicPr>
-                    <pic:cNvPr id="2014013142" name=""/>
-                    <pic:cNvPicPr/>
-                  </pic:nvPicPr>
-                  <pic:blipFill>
-                    <a:blip r:embed="rId8"/>
-                    <a:stretch>
-                      <a:fillRect/>
-                    </a:stretch>
-                  </pic:blipFill>
-                  <pic:spPr>
-                    <a:xfrm>
-                      <a:off x="0" y="0"/>
-                      <a:ext cx="5760720" cy="1400810"/>
-                    </a:xfrm>
-                    <a:prstGeom prst="rect">
-                      <a:avLst/>
-                    </a:prstGeom>
-                  </pic:spPr>
-                </pic:pic>
-              </a:graphicData>
-            </a:graphic>
-          </wp:inline>
-        </w:drawing>
-      </w:r>
-      <w:r>
-        <w:rPr>
-          <w:lang w:val="en-US"/>
-        </w:rPr>
-        <w:br/>
-      </w:r>
-    </w:p>
-    <w:p>
-      <w:pPr>
-        <w:pStyle w:val="Nadpis3"/>
-        <w:rPr>
-          <w:lang w:val="en-US"/>
-        </w:rPr>
-      </w:pPr>
-      <w:r>
-        <w:rPr>
-          <w:lang w:val="en-US"/>
-        </w:rPr>
-        <w:lastRenderedPageBreak/>
-        <w:t>Odebráno</w:t>
-      </w:r>
-    </w:p>
-    <w:p>
-      <w:pPr>
-        <w:pStyle w:val="Odstavecseseznamem"/>
-        <w:numPr>
-          <w:ilvl w:val="0"/>
-          <w:numId w:val="7"/>
-        </w:numPr>
-        <w:rPr>
-          <w:lang w:val="en-US"/>
-        </w:rPr>
-      </w:pPr>
-    </w:p>
-    <w:p>
-      <w:pPr>
-        <w:rPr>
-          <w:rFonts w:asciiTheme="majorHAnsi" w:eastAsiaTheme="majorEastAsia" w:hAnsiTheme="majorHAnsi" w:cstheme="majorBidi"/>
-          <w:color w:val="0F4761" w:themeColor="accent1" w:themeShade="BF"/>
-          <w:sz w:val="32"/>
-          <w:szCs w:val="32"/>
-          <w:lang w:val="en-US"/>
-        </w:rPr>
-      </w:pPr>
-      <w:r>
-        <w:rPr>
-          <w:lang w:val="en-US"/>
-        </w:rPr>
-        <w:br w:type="page"/>
-      </w:r>
-    </w:p>
-    <w:p>
-      <w:pPr>
-        <w:pStyle w:val="Nadpis2"/>
-        <w:rPr>
-          <w:lang w:val="en-US"/>
-        </w:rPr>
-      </w:pPr>
-      <w:r>
-        <w:rPr>
-          <w:lang w:val="en-US"/>
-        </w:rPr>
-        <w:lastRenderedPageBreak/>
-        <w:t>Verze 1.</w:t>
-      </w:r>
-      <w:r>
-        <w:rPr>
-          <w:lang w:val="en-US"/>
-        </w:rPr>
-        <w:t>5</w:t>
-      </w:r>
-      <w:r>
-        <w:rPr>
-          <w:lang w:val="en-US"/>
-        </w:rPr>
-        <w:t>.</w:t>
-      </w:r>
-      <w:r>
-        <w:rPr>
-          <w:lang w:val="en-US"/>
-        </w:rPr>
-        <w:t>0.0</w:t>
-      </w:r>
-      <w:r>
-        <w:rPr>
-          <w:lang w:val="en-US"/>
-        </w:rPr>
-        <w:t xml:space="preserve"> </w:t>
-      </w:r>
-      <w:r>
-        <w:rPr>
-          <w:lang w:val="en-US"/>
-        </w:rPr>
-        <w:t>– 23.4.2026</w:t>
-      </w:r>
-    </w:p>
-    <w:p>
-      <w:pPr>
-        <w:pStyle w:val="Nadpis3"/>
-        <w:rPr>
-          <w:lang w:val="en-US"/>
-        </w:rPr>
-      </w:pPr>
-      <w:r>
-        <w:rPr>
-          <w:lang w:val="en-US"/>
-        </w:rPr>
-        <w:t>Přidáno</w:t>
-      </w:r>
-    </w:p>
-    <w:p>
-      <w:pPr>
-        <w:pStyle w:val="Odstavecseseznamem"/>
-        <w:numPr>
-          <w:ilvl w:val="0"/>
-          <w:numId w:val="8"/>
-        </w:numPr>
-        <w:rPr>
-          <w:lang w:val="en-US"/>
-        </w:rPr>
-      </w:pPr>
-      <w:r>
-        <w:rPr>
-          <w:lang w:val="en-US"/>
-        </w:rPr>
-        <w:t>Tlačítko pro informaci o aktualizacích – pokud je k dispozici nová aktualizace, zbarví se do žluta</w:t>
-      </w:r>
-      <w:r>
-        <w:rPr>
-          <w:lang w:val="en-US"/>
-        </w:rPr>
-        <w:br/>
-      </w:r>
-      <w:r>
-        <w:rPr>
-          <w:noProof/>
-          <w:lang w:val="en-US"/>
-        </w:rPr>
-        <w:drawing>
-          <wp:inline distT="0" distB="0" distL="0" distR="0" wp14:anchorId="50E11EF2" wp14:editId="676D179B">
-            <wp:extent cx="1200318" cy="419158"/>
-            <wp:effectExtent l="0" t="0" r="0" b="0"/>
-            <wp:docPr id="912460511" name="Obrázek 1"/>
-            <wp:cNvGraphicFramePr>
-              <a:graphicFrameLocks xmlns:a="http://schemas.openxmlformats.org/drawingml/2006/main" noChangeAspect="1"/>
-            </wp:cNvGraphicFramePr>
-            <a:graphic xmlns:a="http://schemas.openxmlformats.org/drawingml/2006/main">
-              <a:graphicData uri="http://schemas.openxmlformats.org/drawingml/2006/picture">
-                <pic:pic xmlns:pic="http://schemas.openxmlformats.org/drawingml/2006/picture">
-                  <pic:nvPicPr>
-                    <pic:cNvPr id="912460511" name=""/>
-                    <pic:cNvPicPr/>
-                  </pic:nvPicPr>
-                  <pic:blipFill>
-                    <a:blip r:embed="rId7"/>
-                    <a:stretch>
-                      <a:fillRect/>
-                    </a:stretch>
-                  </pic:blipFill>
-                  <pic:spPr>
-                    <a:xfrm>
-                      <a:off x="0" y="0"/>
-                      <a:ext cx="1200318" cy="419158"/>
-                    </a:xfrm>
-                    <a:prstGeom prst="rect">
-                      <a:avLst/>
-                    </a:prstGeom>
-                  </pic:spPr>
-                </pic:pic>
-              </a:graphicData>
-            </a:graphic>
-          </wp:inline>
-        </w:drawing>
-      </w:r>
-    </w:p>
-    <w:p>
-      <w:pPr>
-        <w:pStyle w:val="Odstavecseseznamem"/>
-        <w:numPr>
-          <w:ilvl w:val="1"/>
-          <w:numId w:val="8"/>
-        </w:numPr>
-        <w:rPr>
-          <w:lang w:val="en-US"/>
-        </w:rPr>
-      </w:pPr>
-      <w:r>
-        <w:rPr>
-          <w:lang w:val="en-US"/>
-        </w:rPr>
-        <w:t>Po stisknutí se zobrazí dialog, kde bude moci uživatel provést aktualizaci a zobrazit seznam změn</w:t>
-      </w:r>
-    </w:p>
-    <w:p>
-      <w:pPr>
-        <w:pStyle w:val="Nadpis3"/>
-        <w:rPr>
-          <w:lang w:val="en-US"/>
-        </w:rPr>
-      </w:pPr>
-      <w:r>
-        <w:rPr>
-          <w:lang w:val="en-US"/>
-        </w:rPr>
-        <w:t>Opraveno</w:t>
-      </w:r>
-      <w:r>
-        <w:rPr>
-          <w:lang w:val="en-US"/>
-        </w:rPr>
-        <w:t xml:space="preserve"> </w:t>
-      </w:r>
-    </w:p>
-    <w:p>
-      <w:pPr>
-        <w:pStyle w:val="Odstavecseseznamem"/>
-        <w:numPr>
-          <w:ilvl w:val="0"/>
-          <w:numId w:val="7"/>
-        </w:numPr>
-        <w:rPr>
-          <w:lang w:val="en-US"/>
-        </w:rPr>
-      </w:pPr>
     </w:p>
     <w:p>
       <w:pPr>
@@ -869,7 +1061,7 @@
                     <pic:cNvPicPr/>
                   </pic:nvPicPr>
                   <pic:blipFill>
-                    <a:blip r:embed="rId9"/>
+                    <a:blip r:embed="rId12"/>
                     <a:stretch>
                       <a:fillRect/>
                     </a:stretch>
@@ -1439,7 +1631,21 @@
         <w:rPr>
           <w:lang w:val="en-US"/>
         </w:rPr>
-        <w:t xml:space="preserve"> příchodů a odchodů</w:t>
+        <w:t xml:space="preserve"> příchodů </w:t>
+      </w:r>
+      <w:proofErr w:type="gramStart"/>
+      <w:r>
+        <w:rPr>
+          <w:lang w:val="en-US"/>
+        </w:rPr>
+        <w:t>a</w:t>
+      </w:r>
+      <w:proofErr w:type="gramEnd"/>
+      <w:r>
+        <w:rPr>
+          <w:lang w:val="en-US"/>
+        </w:rPr>
+        <w:t xml:space="preserve"> odchodů</w:t>
       </w:r>
       <w:r>
         <w:rPr>
@@ -2134,11 +2340,19 @@
           <w:lang w:val="en-US"/>
         </w:rPr>
       </w:pPr>
-      <w:r>
-        <w:rPr>
-          <w:lang w:val="en-US"/>
-        </w:rPr>
-        <w:t>System.Runtime.InteropServices.COMException (0x80080005): Provádění serveru selhalo (0x80080005 (CO_E_SERVER_EXEC_FAILURE))</w:t>
+      <w:proofErr w:type="gramStart"/>
+      <w:r>
+        <w:rPr>
+          <w:lang w:val="en-US"/>
+        </w:rPr>
+        <w:t>System.Runtime.InteropServices.COMException</w:t>
+      </w:r>
+      <w:proofErr w:type="gramEnd"/>
+      <w:r>
+        <w:rPr>
+          <w:lang w:val="en-US"/>
+        </w:rPr>
+        <w:t xml:space="preserve"> (0x80080005): Provádění serveru selhalo (0x80080005 (CO_E_SERVER_EXEC_FAILURE))</w:t>
       </w:r>
     </w:p>
     <w:p>
@@ -2369,7 +2583,7 @@
                     <pic:cNvPicPr/>
                   </pic:nvPicPr>
                   <pic:blipFill>
-                    <a:blip r:embed="rId10">
+                    <a:blip r:embed="rId13">
                       <a:extLst>
                         <a:ext uri="{28A0092B-C50C-407E-A947-70E740481C1C}">
                           <a14:useLocalDpi xmlns:a14="http://schemas.microsoft.com/office/drawing/2010/main" val="0"/>
@@ -2629,7 +2843,7 @@
                     <pic:cNvPicPr/>
                   </pic:nvPicPr>
                   <pic:blipFill>
-                    <a:blip r:embed="rId11"/>
+                    <a:blip r:embed="rId14"/>
                     <a:stretch>
                       <a:fillRect/>
                     </a:stretch>
@@ -2782,7 +2996,7 @@
                     <pic:cNvPicPr/>
                   </pic:nvPicPr>
                   <pic:blipFill>
-                    <a:blip r:embed="rId12"/>
+                    <a:blip r:embed="rId15"/>
                     <a:stretch>
                       <a:fillRect/>
                     </a:stretch>
@@ -3505,7 +3719,7 @@
                     <pic:cNvPicPr/>
                   </pic:nvPicPr>
                   <pic:blipFill>
-                    <a:blip r:embed="rId13"/>
+                    <a:blip r:embed="rId16"/>
                     <a:stretch>
                       <a:fillRect/>
                     </a:stretch>
@@ -3580,7 +3794,21 @@
           <w:lang w:val="en-US"/>
         </w:rPr>
         <w:br/>
-        <w:t>Jedná se pouze o tuto část vizualizace, na zapsané hodiny, ani indikátory příchodu a odchodu to nemá vliv.</w:t>
+        <w:t xml:space="preserve">Jedná se pouze o tuto část vizualizace, na zapsané hodiny, ani indikátory příchodu </w:t>
+      </w:r>
+      <w:proofErr w:type="gramStart"/>
+      <w:r>
+        <w:rPr>
+          <w:lang w:val="en-US"/>
+        </w:rPr>
+        <w:t>a</w:t>
+      </w:r>
+      <w:proofErr w:type="gramEnd"/>
+      <w:r>
+        <w:rPr>
+          <w:lang w:val="en-US"/>
+        </w:rPr>
+        <w:t xml:space="preserve"> odchodu to nemá vliv.</w:t>
       </w:r>
       <w:r>
         <w:rPr>
@@ -3609,7 +3837,7 @@
                     <pic:cNvPicPr/>
                   </pic:nvPicPr>
                   <pic:blipFill>
-                    <a:blip r:embed="rId14"/>
+                    <a:blip r:embed="rId17"/>
                     <a:stretch>
                       <a:fillRect/>
                     </a:stretch>
@@ -4232,7 +4460,7 @@
                     <pic:cNvPicPr/>
                   </pic:nvPicPr>
                   <pic:blipFill>
-                    <a:blip r:embed="rId15"/>
+                    <a:blip r:embed="rId18"/>
                     <a:stretch>
                       <a:fillRect/>
                     </a:stretch>
@@ -5080,7 +5308,7 @@
                     </pic:cNvPicPr>
                   </pic:nvPicPr>
                   <pic:blipFill>
-                    <a:blip r:embed="rId16">
+                    <a:blip r:embed="rId19">
                       <a:extLst>
                         <a:ext uri="{28A0092B-C50C-407E-A947-70E740481C1C}">
                           <a14:useLocalDpi xmlns:a14="http://schemas.microsoft.com/office/drawing/2010/main" val="0"/>
@@ -5164,7 +5392,7 @@
                     </pic:cNvPicPr>
                   </pic:nvPicPr>
                   <pic:blipFill>
-                    <a:blip r:embed="rId17">
+                    <a:blip r:embed="rId20">
                       <a:extLst>
                         <a:ext uri="{28A0092B-C50C-407E-A947-70E740481C1C}">
                           <a14:useLocalDpi xmlns:a14="http://schemas.microsoft.com/office/drawing/2010/main" val="0"/>
@@ -5274,7 +5502,7 @@
                     <pic:cNvPicPr/>
                   </pic:nvPicPr>
                   <pic:blipFill>
-                    <a:blip r:embed="rId18"/>
+                    <a:blip r:embed="rId21"/>
                     <a:stretch>
                       <a:fillRect/>
                     </a:stretch>
@@ -6010,7 +6238,7 @@
                     </pic:cNvPicPr>
                   </pic:nvPicPr>
                   <pic:blipFill>
-                    <a:blip r:embed="rId19">
+                    <a:blip r:embed="rId22">
                       <a:extLst>
                         <a:ext uri="{28A0092B-C50C-407E-A947-70E740481C1C}">
                           <a14:useLocalDpi xmlns:a14="http://schemas.microsoft.com/office/drawing/2010/main" val="0"/>
@@ -6281,7 +6509,7 @@
                     </pic:cNvPicPr>
                   </pic:nvPicPr>
                   <pic:blipFill>
-                    <a:blip r:embed="rId20">
+                    <a:blip r:embed="rId23">
                       <a:extLst>
                         <a:ext uri="{28A0092B-C50C-407E-A947-70E740481C1C}">
                           <a14:useLocalDpi xmlns:a14="http://schemas.microsoft.com/office/drawing/2010/main" val="0"/>
@@ -6338,7 +6566,7 @@
                     <pic:cNvPicPr/>
                   </pic:nvPicPr>
                   <pic:blipFill>
-                    <a:blip r:embed="rId21"/>
+                    <a:blip r:embed="rId24"/>
                     <a:stretch>
                       <a:fillRect/>
                     </a:stretch>
@@ -6553,7 +6781,14 @@
         <w:rPr>
           <w:lang w:val="en-US"/>
         </w:rPr>
-        <w:t xml:space="preserve">V nastaveni (horní lišta =&gt; </w:t>
+        <w:t>V nastaveni (horní lišta =</w:t>
+      </w:r>
+      <w:proofErr w:type="gramStart"/>
+      <w:r>
+        <w:rPr>
+          <w:lang w:val="en-US"/>
+        </w:rPr>
+        <w:t xml:space="preserve">&gt; </w:t>
       </w:r>
       <w:r>
         <w:rPr>
@@ -6563,6 +6798,7 @@
         </w:rPr>
         <w:t>?</w:t>
       </w:r>
+      <w:proofErr w:type="gramEnd"/>
       <w:r>
         <w:rPr>
           <w:lang w:val="en-US"/>
@@ -6642,7 +6878,7 @@
                     </pic:cNvPicPr>
                   </pic:nvPicPr>
                   <pic:blipFill>
-                    <a:blip r:embed="rId22">
+                    <a:blip r:embed="rId25">
                       <a:extLst>
                         <a:ext uri="{28A0092B-C50C-407E-A947-70E740481C1C}">
                           <a14:useLocalDpi xmlns:a14="http://schemas.microsoft.com/office/drawing/2010/main" val="0"/>
@@ -6721,7 +6957,7 @@
                     </pic:cNvPicPr>
                   </pic:nvPicPr>
                   <pic:blipFill>
-                    <a:blip r:embed="rId23">
+                    <a:blip r:embed="rId26">
                       <a:extLst>
                         <a:ext uri="{28A0092B-C50C-407E-A947-70E740481C1C}">
                           <a14:useLocalDpi xmlns:a14="http://schemas.microsoft.com/office/drawing/2010/main" val="0"/>
@@ -6804,7 +7040,14 @@
         <w:rPr>
           <w:lang w:val="en-US"/>
         </w:rPr>
-        <w:t xml:space="preserve">V nastavení (horní lišta =&gt; </w:t>
+        <w:t>V nastavení (horní lišta =</w:t>
+      </w:r>
+      <w:proofErr w:type="gramStart"/>
+      <w:r>
+        <w:rPr>
+          <w:lang w:val="en-US"/>
+        </w:rPr>
+        <w:t xml:space="preserve">&gt; </w:t>
       </w:r>
       <w:r>
         <w:rPr>
@@ -6814,6 +7057,7 @@
         </w:rPr>
         <w:t>?</w:t>
       </w:r>
+      <w:proofErr w:type="gramEnd"/>
       <w:r>
         <w:rPr>
           <w:lang w:val="en-US"/>
@@ -6936,7 +7180,7 @@
                     <pic:cNvPicPr/>
                   </pic:nvPicPr>
                   <pic:blipFill>
-                    <a:blip r:embed="rId24"/>
+                    <a:blip r:embed="rId27"/>
                     <a:stretch>
                       <a:fillRect/>
                     </a:stretch>
@@ -7166,7 +7410,7 @@
                     <pic:cNvPicPr/>
                   </pic:nvPicPr>
                   <pic:blipFill>
-                    <a:blip r:embed="rId25"/>
+                    <a:blip r:embed="rId28"/>
                     <a:stretch>
                       <a:fillRect/>
                     </a:stretch>
@@ -7260,7 +7504,7 @@
                     <pic:cNvPicPr/>
                   </pic:nvPicPr>
                   <pic:blipFill>
-                    <a:blip r:embed="rId26"/>
+                    <a:blip r:embed="rId29"/>
                     <a:stretch>
                       <a:fillRect/>
                     </a:stretch>
@@ -7355,7 +7599,7 @@
                     <pic:cNvPicPr/>
                   </pic:nvPicPr>
                   <pic:blipFill>
-                    <a:blip r:embed="rId27"/>
+                    <a:blip r:embed="rId30"/>
                     <a:stretch>
                       <a:fillRect/>
                     </a:stretch>
@@ -7449,7 +7693,7 @@
                     <pic:cNvPicPr/>
                   </pic:nvPicPr>
                   <pic:blipFill>
-                    <a:blip r:embed="rId28"/>
+                    <a:blip r:embed="rId31"/>
                     <a:stretch>
                       <a:fillRect/>
                     </a:stretch>
@@ -7704,7 +7948,7 @@
                     <pic:cNvPicPr/>
                   </pic:nvPicPr>
                   <pic:blipFill>
-                    <a:blip r:embed="rId29"/>
+                    <a:blip r:embed="rId32"/>
                     <a:stretch>
                       <a:fillRect/>
                     </a:stretch>
@@ -8596,7 +8840,7 @@
                     </pic:cNvPicPr>
                   </pic:nvPicPr>
                   <pic:blipFill>
-                    <a:blip r:embed="rId30">
+                    <a:blip r:embed="rId33">
                       <a:extLst>
                         <a:ext uri="{28A0092B-C50C-407E-A947-70E740481C1C}">
                           <a14:useLocalDpi xmlns:a14="http://schemas.microsoft.com/office/drawing/2010/main" val="0"/>
@@ -8757,7 +9001,7 @@
                     <pic:cNvPicPr/>
                   </pic:nvPicPr>
                   <pic:blipFill>
-                    <a:blip r:embed="rId31"/>
+                    <a:blip r:embed="rId34"/>
                     <a:stretch>
                       <a:fillRect/>
                     </a:stretch>
@@ -9484,7 +9728,7 @@
                     <pic:cNvPicPr/>
                   </pic:nvPicPr>
                   <pic:blipFill>
-                    <a:blip r:embed="rId32"/>
+                    <a:blip r:embed="rId35"/>
                     <a:stretch>
                       <a:fillRect/>
                     </a:stretch>
@@ -9597,7 +9841,7 @@
                     </pic:cNvPicPr>
                   </pic:nvPicPr>
                   <pic:blipFill>
-                    <a:blip r:embed="rId33">
+                    <a:blip r:embed="rId36">
                       <a:extLst>
                         <a:ext uri="{28A0092B-C50C-407E-A947-70E740481C1C}">
                           <a14:useLocalDpi xmlns:a14="http://schemas.microsoft.com/office/drawing/2010/main" val="0"/>

</xml_diff>

<commit_message>
install not copy to temp anymore
</commit_message>
<xml_diff>
--- a/Changelog.docx
+++ b/Changelog.docx
@@ -841,6 +841,172 @@
     </w:p>
     <w:p>
       <w:pPr>
+        <w:pStyle w:val="Odstavecseseznamem"/>
+        <w:numPr>
+          <w:ilvl w:val="0"/>
+          <w:numId w:val="7"/>
+        </w:numPr>
+        <w:rPr>
+          <w:lang w:val="en-US"/>
+        </w:rPr>
+      </w:pPr>
+      <w:proofErr w:type="spellStart"/>
+      <w:r>
+        <w:rPr>
+          <w:lang w:val="en-US"/>
+        </w:rPr>
+        <w:t>Aktualizace</w:t>
+      </w:r>
+      <w:proofErr w:type="spellEnd"/>
+      <w:r>
+        <w:rPr>
+          <w:lang w:val="en-US"/>
+        </w:rPr>
+        <w:t xml:space="preserve"> </w:t>
+      </w:r>
+      <w:proofErr w:type="spellStart"/>
+      <w:r>
+        <w:rPr>
+          <w:lang w:val="en-US"/>
+        </w:rPr>
+        <w:t>probíhá</w:t>
+      </w:r>
+      <w:proofErr w:type="spellEnd"/>
+      <w:r>
+        <w:rPr>
+          <w:lang w:val="en-US"/>
+        </w:rPr>
+        <w:t xml:space="preserve"> ze </w:t>
+      </w:r>
+      <w:proofErr w:type="spellStart"/>
+      <w:r>
+        <w:rPr>
+          <w:lang w:val="en-US"/>
+        </w:rPr>
+        <w:t>síťové</w:t>
+      </w:r>
+      <w:proofErr w:type="spellEnd"/>
+      <w:r>
+        <w:rPr>
+          <w:lang w:val="en-US"/>
+        </w:rPr>
+        <w:t xml:space="preserve"> </w:t>
+      </w:r>
+      <w:proofErr w:type="spellStart"/>
+      <w:r>
+        <w:rPr>
+          <w:lang w:val="en-US"/>
+        </w:rPr>
+        <w:t>složky</w:t>
+      </w:r>
+      <w:proofErr w:type="spellEnd"/>
+      <w:r>
+        <w:rPr>
+          <w:lang w:val="en-US"/>
+        </w:rPr>
+        <w:t xml:space="preserve"> bez </w:t>
+      </w:r>
+      <w:proofErr w:type="spellStart"/>
+      <w:r>
+        <w:rPr>
+          <w:lang w:val="en-US"/>
+        </w:rPr>
+        <w:t>kopírování</w:t>
+      </w:r>
+      <w:proofErr w:type="spellEnd"/>
+      <w:r>
+        <w:rPr>
+          <w:lang w:val="en-US"/>
+        </w:rPr>
+        <w:t xml:space="preserve"> do temp </w:t>
+      </w:r>
+      <w:proofErr w:type="spellStart"/>
+      <w:r>
+        <w:rPr>
+          <w:lang w:val="en-US"/>
+        </w:rPr>
+        <w:t>souborů</w:t>
+      </w:r>
+      <w:proofErr w:type="spellEnd"/>
+      <w:r>
+        <w:rPr>
+          <w:lang w:val="en-US"/>
+        </w:rPr>
+        <w:t xml:space="preserve"> (</w:t>
+      </w:r>
+      <w:proofErr w:type="spellStart"/>
+      <w:r>
+        <w:rPr>
+          <w:lang w:val="en-US"/>
+        </w:rPr>
+        <w:t>zapříčinilo</w:t>
+      </w:r>
+      <w:proofErr w:type="spellEnd"/>
+      <w:r>
+        <w:rPr>
+          <w:lang w:val="en-US"/>
+        </w:rPr>
+        <w:t xml:space="preserve">, </w:t>
+      </w:r>
+      <w:proofErr w:type="spellStart"/>
+      <w:r>
+        <w:rPr>
+          <w:lang w:val="en-US"/>
+        </w:rPr>
+        <w:t>že</w:t>
+      </w:r>
+      <w:proofErr w:type="spellEnd"/>
+      <w:r>
+        <w:rPr>
+          <w:lang w:val="en-US"/>
+        </w:rPr>
+        <w:t xml:space="preserve"> </w:t>
+      </w:r>
+      <w:proofErr w:type="spellStart"/>
+      <w:r>
+        <w:rPr>
+          <w:lang w:val="en-US"/>
+        </w:rPr>
+        <w:t>instalace</w:t>
+      </w:r>
+      <w:proofErr w:type="spellEnd"/>
+      <w:r>
+        <w:rPr>
+          <w:lang w:val="en-US"/>
+        </w:rPr>
+        <w:t xml:space="preserve"> </w:t>
+      </w:r>
+      <w:proofErr w:type="spellStart"/>
+      <w:r>
+        <w:rPr>
+          <w:lang w:val="en-US"/>
+        </w:rPr>
+        <w:t>nejde</w:t>
+      </w:r>
+      <w:proofErr w:type="spellEnd"/>
+      <w:r>
+        <w:rPr>
+          <w:lang w:val="en-US"/>
+        </w:rPr>
+        <w:t xml:space="preserve"> </w:t>
+      </w:r>
+      <w:proofErr w:type="spellStart"/>
+      <w:r>
+        <w:rPr>
+          <w:lang w:val="en-US"/>
+        </w:rPr>
+        <w:t>spustit</w:t>
+      </w:r>
+      <w:proofErr w:type="spellEnd"/>
+      <w:r>
+        <w:rPr>
+          <w:lang w:val="en-US"/>
+        </w:rPr>
+        <w:t>)</w:t>
+      </w:r>
+    </w:p>
+    <w:p>
+      <w:pPr>
         <w:pStyle w:val="Nadpis3"/>
         <w:rPr>
           <w:lang w:val="en-US"/>
@@ -3747,21 +3913,7 @@
         <w:rPr>
           <w:lang w:val="en-US"/>
         </w:rPr>
-        <w:t xml:space="preserve"> </w:t>
-      </w:r>
-      <w:proofErr w:type="gramStart"/>
-      <w:r>
-        <w:rPr>
-          <w:lang w:val="en-US"/>
-        </w:rPr>
-        <w:t>a</w:t>
-      </w:r>
-      <w:proofErr w:type="gramEnd"/>
-      <w:r>
-        <w:rPr>
-          <w:lang w:val="en-US"/>
-        </w:rPr>
-        <w:t xml:space="preserve"> </w:t>
+        <w:t xml:space="preserve"> a </w:t>
       </w:r>
       <w:proofErr w:type="spellStart"/>
       <w:r>
@@ -4729,7 +4881,6 @@
         </w:rPr>
       </w:pPr>
       <w:proofErr w:type="spellStart"/>
-      <w:proofErr w:type="gramStart"/>
       <w:r>
         <w:rPr>
           <w:lang w:val="en-US"/>
@@ -4737,7 +4888,6 @@
         <w:t>System.Runtime.InteropServices.COMException</w:t>
       </w:r>
       <w:proofErr w:type="spellEnd"/>
-      <w:proofErr w:type="gramEnd"/>
       <w:r>
         <w:rPr>
           <w:lang w:val="en-US"/>
@@ -8972,21 +9122,7 @@
         <w:rPr>
           <w:lang w:val="en-US"/>
         </w:rPr>
-        <w:t xml:space="preserve"> </w:t>
-      </w:r>
-      <w:proofErr w:type="gramStart"/>
-      <w:r>
-        <w:rPr>
-          <w:lang w:val="en-US"/>
-        </w:rPr>
-        <w:t>a</w:t>
-      </w:r>
-      <w:proofErr w:type="gramEnd"/>
-      <w:r>
-        <w:rPr>
-          <w:lang w:val="en-US"/>
-        </w:rPr>
-        <w:t xml:space="preserve"> </w:t>
+        <w:t xml:space="preserve"> a </w:t>
       </w:r>
       <w:proofErr w:type="spellStart"/>
       <w:r>
@@ -15824,14 +15960,7 @@
         <w:rPr>
           <w:lang w:val="en-US"/>
         </w:rPr>
-        <w:t xml:space="preserve"> =</w:t>
-      </w:r>
-      <w:proofErr w:type="gramStart"/>
-      <w:r>
-        <w:rPr>
-          <w:lang w:val="en-US"/>
-        </w:rPr>
-        <w:t xml:space="preserve">&gt; </w:t>
+        <w:t xml:space="preserve"> =&gt; </w:t>
       </w:r>
       <w:r>
         <w:rPr>
@@ -15841,7 +15970,6 @@
         </w:rPr>
         <w:t>?</w:t>
       </w:r>
-      <w:proofErr w:type="gramEnd"/>
       <w:r>
         <w:rPr>
           <w:lang w:val="en-US"/>
@@ -16409,14 +16537,7 @@
         <w:rPr>
           <w:lang w:val="en-US"/>
         </w:rPr>
-        <w:t xml:space="preserve"> =</w:t>
-      </w:r>
-      <w:proofErr w:type="gramStart"/>
-      <w:r>
-        <w:rPr>
-          <w:lang w:val="en-US"/>
-        </w:rPr>
-        <w:t xml:space="preserve">&gt; </w:t>
+        <w:t xml:space="preserve"> =&gt; </w:t>
       </w:r>
       <w:r>
         <w:rPr>
@@ -16426,7 +16547,6 @@
         </w:rPr>
         <w:t>?</w:t>
       </w:r>
-      <w:proofErr w:type="gramEnd"/>
       <w:r>
         <w:rPr>
           <w:lang w:val="en-US"/>

</xml_diff>

<commit_message>
bugfix icon reinstall + buttons adjustments
</commit_message>
<xml_diff>
--- a/Changelog.docx
+++ b/Changelog.docx
@@ -9,44 +9,16 @@
           <w:bottom w:val="single" w:sz="6" w:space="1" w:color="auto"/>
         </w:pBdr>
       </w:pPr>
-      <w:proofErr w:type="spellStart"/>
-      <w:r>
-        <w:t>Changelog</w:t>
-      </w:r>
-      <w:proofErr w:type="spellEnd"/>
-      <w:r>
-        <w:t xml:space="preserve"> – </w:t>
-      </w:r>
-      <w:proofErr w:type="spellStart"/>
-      <w:r>
-        <w:t>WorkLog</w:t>
-      </w:r>
-      <w:proofErr w:type="spellEnd"/>
+      <w:r>
+        <w:t>Changelog – WorkLog</w:t>
+      </w:r>
     </w:p>
     <w:p>
       <w:pPr>
         <w:pStyle w:val="Nadpis2"/>
       </w:pPr>
       <w:r>
-        <w:t>Verze 1.6.</w:t>
-      </w:r>
-      <w:r>
-        <w:t>1</w:t>
-      </w:r>
-      <w:r>
-        <w:t xml:space="preserve">.0 – </w:t>
-      </w:r>
-      <w:r>
-        <w:t>X</w:t>
-      </w:r>
-      <w:r>
-        <w:t>.</w:t>
-      </w:r>
-      <w:r>
-        <w:t>7</w:t>
-      </w:r>
-      <w:r>
-        <w:t>.2026</w:t>
+        <w:t>Verze 1.6.1.0 – X.7.2026</w:t>
       </w:r>
     </w:p>
     <w:p>
@@ -62,6 +34,18 @@
         <w:pStyle w:val="Odstavecseseznamem"/>
         <w:numPr>
           <w:ilvl w:val="0"/>
+          <w:numId w:val="8"/>
+        </w:numPr>
+      </w:pPr>
+      <w:r>
+        <w:t>Archivace uživatelů</w:t>
+      </w:r>
+    </w:p>
+    <w:p>
+      <w:pPr>
+        <w:pStyle w:val="Odstavecseseznamem"/>
+        <w:numPr>
+          <w:ilvl w:val="1"/>
           <w:numId w:val="8"/>
         </w:numPr>
       </w:pPr>
@@ -120,6 +104,120 @@
     </w:p>
     <w:p>
       <w:pPr>
+        <w:pStyle w:val="Odstavecseseznamem"/>
+        <w:numPr>
+          <w:ilvl w:val="0"/>
+          <w:numId w:val="8"/>
+        </w:numPr>
+      </w:pPr>
+      <w:r>
+        <w:t>V exportovaném souboru přidáno dodatečné rozdělení interních a externích pracovníků v listu VYHODNOCENÍ.</w:t>
+      </w:r>
+      <w:r>
+        <w:br/>
+      </w:r>
+      <w:r>
+        <w:rPr>
+          <w:noProof/>
+        </w:rPr>
+        <w:drawing>
+          <wp:inline distT="0" distB="0" distL="0" distR="0" wp14:anchorId="6F528829" wp14:editId="4C3E8E72">
+            <wp:extent cx="5487166" cy="1314633"/>
+            <wp:effectExtent l="0" t="0" r="0" b="0"/>
+            <wp:docPr id="2078017240" name="Obrázek 1"/>
+            <wp:cNvGraphicFramePr>
+              <a:graphicFrameLocks xmlns:a="http://schemas.openxmlformats.org/drawingml/2006/main" noChangeAspect="1"/>
+            </wp:cNvGraphicFramePr>
+            <a:graphic xmlns:a="http://schemas.openxmlformats.org/drawingml/2006/main">
+              <a:graphicData uri="http://schemas.openxmlformats.org/drawingml/2006/picture">
+                <pic:pic xmlns:pic="http://schemas.openxmlformats.org/drawingml/2006/picture">
+                  <pic:nvPicPr>
+                    <pic:cNvPr id="2078017240" name=""/>
+                    <pic:cNvPicPr/>
+                  </pic:nvPicPr>
+                  <pic:blipFill>
+                    <a:blip r:embed="rId7"/>
+                    <a:stretch>
+                      <a:fillRect/>
+                    </a:stretch>
+                  </pic:blipFill>
+                  <pic:spPr>
+                    <a:xfrm>
+                      <a:off x="0" y="0"/>
+                      <a:ext cx="5487166" cy="1314633"/>
+                    </a:xfrm>
+                    <a:prstGeom prst="rect">
+                      <a:avLst/>
+                    </a:prstGeom>
+                  </pic:spPr>
+                </pic:pic>
+              </a:graphicData>
+            </a:graphic>
+          </wp:inline>
+        </w:drawing>
+      </w:r>
+    </w:p>
+    <w:p>
+      <w:pPr>
+        <w:pStyle w:val="Odstavecseseznamem"/>
+        <w:numPr>
+          <w:ilvl w:val="0"/>
+          <w:numId w:val="8"/>
+        </w:numPr>
+      </w:pPr>
+      <w:r>
+        <w:t>V exportovaném souboru přibyly grafy v případě: zahrnutí externistů v exportu + vyhodnocení</w:t>
+      </w:r>
+      <w:r>
+        <w:br/>
+      </w:r>
+      <w:r>
+        <w:rPr>
+          <w:noProof/>
+        </w:rPr>
+        <w:lastRenderedPageBreak/>
+        <w:drawing>
+          <wp:inline distT="0" distB="0" distL="0" distR="0" wp14:anchorId="68E54428" wp14:editId="477EE1ED">
+            <wp:extent cx="5760720" cy="3089910"/>
+            <wp:effectExtent l="0" t="0" r="0" b="0"/>
+            <wp:docPr id="1275998936" name="Obrázek 1"/>
+            <wp:cNvGraphicFramePr>
+              <a:graphicFrameLocks xmlns:a="http://schemas.openxmlformats.org/drawingml/2006/main" noChangeAspect="1"/>
+            </wp:cNvGraphicFramePr>
+            <a:graphic xmlns:a="http://schemas.openxmlformats.org/drawingml/2006/main">
+              <a:graphicData uri="http://schemas.openxmlformats.org/drawingml/2006/picture">
+                <pic:pic xmlns:pic="http://schemas.openxmlformats.org/drawingml/2006/picture">
+                  <pic:nvPicPr>
+                    <pic:cNvPr id="1275998936" name=""/>
+                    <pic:cNvPicPr/>
+                  </pic:nvPicPr>
+                  <pic:blipFill>
+                    <a:blip r:embed="rId8"/>
+                    <a:stretch>
+                      <a:fillRect/>
+                    </a:stretch>
+                  </pic:blipFill>
+                  <pic:spPr>
+                    <a:xfrm>
+                      <a:off x="0" y="0"/>
+                      <a:ext cx="5760720" cy="3089910"/>
+                    </a:xfrm>
+                    <a:prstGeom prst="rect">
+                      <a:avLst/>
+                    </a:prstGeom>
+                  </pic:spPr>
+                </pic:pic>
+              </a:graphicData>
+            </a:graphic>
+          </wp:inline>
+        </w:drawing>
+      </w:r>
+      <w:r>
+        <w:br/>
+      </w:r>
+    </w:p>
+    <w:p>
+      <w:pPr>
         <w:pStyle w:val="Nadpis3"/>
       </w:pPr>
       <w:r>
@@ -134,6 +232,9 @@
           <w:numId w:val="7"/>
         </w:numPr>
       </w:pPr>
+      <w:r>
+        <w:t>Rozložení tlačítek při výkazu – již není useknuté na layoutu notebooku</w:t>
+      </w:r>
     </w:p>
     <w:p>
       <w:pPr>
@@ -141,6 +242,42 @@
       </w:pPr>
       <w:r>
         <w:t>Změněno</w:t>
+      </w:r>
+    </w:p>
+    <w:p>
+      <w:pPr>
+        <w:pStyle w:val="Odstavecseseznamem"/>
+        <w:numPr>
+          <w:ilvl w:val="0"/>
+          <w:numId w:val="7"/>
+        </w:numPr>
+      </w:pPr>
+      <w:r>
+        <w:t>Standardizace dialogu pro výběr uživatelů</w:t>
+      </w:r>
+    </w:p>
+    <w:p>
+      <w:pPr>
+        <w:pStyle w:val="Odstavecseseznamem"/>
+        <w:numPr>
+          <w:ilvl w:val="1"/>
+          <w:numId w:val="7"/>
+        </w:numPr>
+      </w:pPr>
+      <w:r>
+        <w:t>Už není třeba dvojklik pro výběr skupiny</w:t>
+      </w:r>
+    </w:p>
+    <w:p>
+      <w:pPr>
+        <w:pStyle w:val="Odstavecseseznamem"/>
+        <w:numPr>
+          <w:ilvl w:val="0"/>
+          <w:numId w:val="7"/>
+        </w:numPr>
+      </w:pPr>
+      <w:r>
+        <w:t>Odebrané tlačítko Outlook události kvůli končící podpoře ze strany Microsoftu</w:t>
       </w:r>
     </w:p>
     <w:p>
@@ -179,7 +316,7 @@
                     </pic:cNvPicPr>
                   </pic:nvPicPr>
                   <pic:blipFill>
-                    <a:blip r:embed="rId7">
+                    <a:blip r:embed="rId9">
                       <a:extLst>
                         <a:ext uri="{28A0092B-C50C-407E-A947-70E740481C1C}">
                           <a14:useLocalDpi xmlns:a14="http://schemas.microsoft.com/office/drawing/2010/main" val="0"/>
@@ -213,6 +350,18 @@
     </w:p>
     <w:p>
       <w:pPr>
+        <w:pStyle w:val="Odstavecseseznamem"/>
+        <w:numPr>
+          <w:ilvl w:val="0"/>
+          <w:numId w:val="7"/>
+        </w:numPr>
+      </w:pPr>
+      <w:r>
+        <w:t>Odebráno tlačítko aktualizace</w:t>
+      </w:r>
+    </w:p>
+    <w:p>
+      <w:pPr>
         <w:pStyle w:val="Nadpis2"/>
       </w:pPr>
       <w:r>
@@ -277,7 +426,7 @@
                     <pic:cNvPicPr/>
                   </pic:nvPicPr>
                   <pic:blipFill>
-                    <a:blip r:embed="rId8"/>
+                    <a:blip r:embed="rId10"/>
                     <a:stretch>
                       <a:fillRect/>
                     </a:stretch>
@@ -347,7 +496,7 @@
                     <pic:cNvPicPr/>
                   </pic:nvPicPr>
                   <pic:blipFill>
-                    <a:blip r:embed="rId9"/>
+                    <a:blip r:embed="rId11"/>
                     <a:stretch>
                       <a:fillRect/>
                     </a:stretch>
@@ -433,7 +582,7 @@
                     <pic:cNvPicPr/>
                   </pic:nvPicPr>
                   <pic:blipFill>
-                    <a:blip r:embed="rId10"/>
+                    <a:blip r:embed="rId12"/>
                     <a:stretch>
                       <a:fillRect/>
                     </a:stretch>
@@ -518,7 +667,7 @@
                     <pic:cNvPicPr/>
                   </pic:nvPicPr>
                   <pic:blipFill>
-                    <a:blip r:embed="rId11"/>
+                    <a:blip r:embed="rId13"/>
                     <a:stretch>
                       <a:fillRect/>
                     </a:stretch>
@@ -607,15 +756,7 @@
         <w:t xml:space="preserve">ukazují odpracované hodiny </w:t>
       </w:r>
       <w:r>
-        <w:t xml:space="preserve">z </w:t>
-      </w:r>
-      <w:proofErr w:type="spellStart"/>
-      <w:r>
-        <w:t>powerkey</w:t>
-      </w:r>
-      <w:proofErr w:type="spellEnd"/>
-      <w:r>
-        <w:t xml:space="preserve"> za </w:t>
+        <w:t xml:space="preserve">z powerkey za </w:t>
       </w:r>
       <w:r>
         <w:t>daný úsek, ne za celý měsíc</w:t>
@@ -715,7 +856,7 @@
                     <pic:cNvPicPr/>
                   </pic:nvPicPr>
                   <pic:blipFill>
-                    <a:blip r:embed="rId12"/>
+                    <a:blip r:embed="rId14"/>
                     <a:stretch>
                       <a:fillRect/>
                     </a:stretch>
@@ -800,7 +941,7 @@
                     <pic:cNvPicPr/>
                   </pic:nvPicPr>
                   <pic:blipFill>
-                    <a:blip r:embed="rId13"/>
+                    <a:blip r:embed="rId15"/>
                     <a:stretch>
                       <a:fillRect/>
                     </a:stretch>
@@ -935,7 +1076,7 @@
                     <pic:cNvPicPr/>
                   </pic:nvPicPr>
                   <pic:blipFill>
-                    <a:blip r:embed="rId14"/>
+                    <a:blip r:embed="rId16"/>
                     <a:stretch>
                       <a:fillRect/>
                     </a:stretch>
@@ -1002,15 +1143,7 @@
         </w:numPr>
       </w:pPr>
       <w:r>
-        <w:t xml:space="preserve">Aktualizace bude vyžadovat </w:t>
-      </w:r>
-      <w:proofErr w:type="spellStart"/>
-      <w:r>
-        <w:t>administrátoské</w:t>
-      </w:r>
-      <w:proofErr w:type="spellEnd"/>
-      <w:r>
-        <w:t xml:space="preserve"> heslo</w:t>
+        <w:t>Aktualizace bude vyžadovat administrátoské heslo</w:t>
       </w:r>
     </w:p>
     <w:p>
@@ -1106,7 +1239,7 @@
                     <pic:cNvPicPr/>
                   </pic:nvPicPr>
                   <pic:blipFill>
-                    <a:blip r:embed="rId15"/>
+                    <a:blip r:embed="rId17"/>
                     <a:stretch>
                       <a:fillRect/>
                     </a:stretch>
@@ -1147,13 +1280,8 @@
         </w:numPr>
       </w:pPr>
       <w:r>
-        <w:t xml:space="preserve">V exportu se již správně ukazují hodiny z </w:t>
-      </w:r>
-      <w:proofErr w:type="spellStart"/>
-      <w:r>
-        <w:t>PowerKey</w:t>
-      </w:r>
-      <w:proofErr w:type="spellEnd"/>
+        <w:t>V exportu se již správně ukazují hodiny z PowerKey</w:t>
+      </w:r>
     </w:p>
     <w:p>
       <w:pPr>
@@ -1420,13 +1548,8 @@
       <w:r>
         <w:t xml:space="preserve">Zprovozněna funkcionalita </w:t>
       </w:r>
-      <w:proofErr w:type="spellStart"/>
-      <w:r>
-        <w:t>powerkey</w:t>
-      </w:r>
-      <w:proofErr w:type="spellEnd"/>
-      <w:r>
-        <w:t xml:space="preserve"> (</w:t>
+      <w:r>
+        <w:t>powerkey (</w:t>
       </w:r>
       <w:r>
         <w:t>ukazatel</w:t>
@@ -1611,15 +1734,7 @@
         </w:numPr>
       </w:pPr>
       <w:r>
-        <w:t xml:space="preserve">Export lze provádět i bez </w:t>
-      </w:r>
-      <w:proofErr w:type="spellStart"/>
-      <w:r>
-        <w:t>PowerKey</w:t>
-      </w:r>
-      <w:proofErr w:type="spellEnd"/>
-      <w:r>
-        <w:t xml:space="preserve"> – údaje budou nastaveny na nulové hodnoty</w:t>
+        <w:t>Export lze provádět i bez PowerKey – údaje budou nastaveny na nulové hodnoty</w:t>
       </w:r>
     </w:p>
     <w:p>
@@ -1639,15 +1754,7 @@
         </w:numPr>
       </w:pPr>
       <w:r>
-        <w:t>Dočasně umlčeny chybové hlášky (připojení k </w:t>
-      </w:r>
-      <w:proofErr w:type="spellStart"/>
-      <w:r>
-        <w:t>PowerKey</w:t>
-      </w:r>
-      <w:proofErr w:type="spellEnd"/>
-      <w:r>
-        <w:t xml:space="preserve"> stále nebylo opraveno)</w:t>
+        <w:t>Dočasně umlčeny chybové hlášky (připojení k PowerKey stále nebylo opraveno)</w:t>
       </w:r>
     </w:p>
     <w:p>
@@ -1740,23 +1847,7 @@
         </w:numPr>
       </w:pPr>
       <w:r>
-        <w:t xml:space="preserve">Dočasná úprava, aby šlo zapisovat hodiny i bez načtených příchodů a odchodů, než </w:t>
-      </w:r>
-      <w:proofErr w:type="spellStart"/>
-      <w:r>
-        <w:t>ajťáci</w:t>
-      </w:r>
-      <w:proofErr w:type="spellEnd"/>
-      <w:r>
-        <w:t xml:space="preserve"> opraví </w:t>
-      </w:r>
-      <w:proofErr w:type="spellStart"/>
-      <w:r>
-        <w:t>powerkey</w:t>
-      </w:r>
-      <w:proofErr w:type="spellEnd"/>
-      <w:r>
-        <w:t>.</w:t>
+        <w:t>Dočasná úprava, aby šlo zapisovat hodiny i bez načtených příchodů a odchodů, než ajťáci opraví powerkey.</w:t>
       </w:r>
     </w:p>
     <w:p>
@@ -1831,15 +1922,8 @@
           <w:numId w:val="7"/>
         </w:numPr>
       </w:pPr>
-      <w:proofErr w:type="spellStart"/>
-      <w:proofErr w:type="gramStart"/>
-      <w:r>
-        <w:t>System.Runtime.InteropServices.COMException</w:t>
-      </w:r>
-      <w:proofErr w:type="spellEnd"/>
-      <w:proofErr w:type="gramEnd"/>
-      <w:r>
-        <w:t xml:space="preserve"> (0x80080005): Provádění serveru selhalo (0x80080005 (CO_E_SERVER_EXEC_FAILURE))</w:t>
+      <w:r>
+        <w:t>System.Runtime.InteropServices.COMException (0x80080005): Provádění serveru selhalo (0x80080005 (CO_E_SERVER_EXEC_FAILURE))</w:t>
       </w:r>
     </w:p>
     <w:p>
@@ -1929,13 +2013,8 @@
           <w:numId w:val="8"/>
         </w:numPr>
       </w:pPr>
-      <w:proofErr w:type="spellStart"/>
-      <w:r>
-        <w:t>Imprort</w:t>
-      </w:r>
-      <w:proofErr w:type="spellEnd"/>
-      <w:r>
-        <w:t xml:space="preserve"> Outlook událostí</w:t>
+      <w:r>
+        <w:t>Imprort Outlook událostí</w:t>
       </w:r>
     </w:p>
     <w:p>
@@ -1975,7 +2054,7 @@
                     <pic:cNvPicPr/>
                   </pic:nvPicPr>
                   <pic:blipFill>
-                    <a:blip r:embed="rId16">
+                    <a:blip r:embed="rId18">
                       <a:extLst>
                         <a:ext uri="{28A0092B-C50C-407E-A947-70E740481C1C}">
                           <a14:useLocalDpi xmlns:a14="http://schemas.microsoft.com/office/drawing/2010/main" val="0"/>
@@ -2166,7 +2245,7 @@
                     <pic:cNvPicPr/>
                   </pic:nvPicPr>
                   <pic:blipFill>
-                    <a:blip r:embed="rId17"/>
+                    <a:blip r:embed="rId19"/>
                     <a:stretch>
                       <a:fillRect/>
                     </a:stretch>
@@ -2208,15 +2287,7 @@
         </w:numPr>
       </w:pPr>
       <w:r>
-        <w:t xml:space="preserve">Opakující se události nebudou automaticky importovány, budou znovu načteny do seznamu </w:t>
-      </w:r>
-      <w:proofErr w:type="gramStart"/>
-      <w:r>
-        <w:t>událostí</w:t>
-      </w:r>
-      <w:proofErr w:type="gramEnd"/>
-      <w:r>
-        <w:t xml:space="preserve"> jakmile se objeví v rozsahu </w:t>
+        <w:t xml:space="preserve">Opakující se události nebudou automaticky importovány, budou znovu načteny do seznamu událostí jakmile se objeví v rozsahu </w:t>
       </w:r>
       <w:r>
         <w:rPr>
@@ -2253,7 +2324,6 @@
       <w:r>
         <w:t xml:space="preserve">Podržením klávesy </w:t>
       </w:r>
-      <w:proofErr w:type="spellStart"/>
       <w:r>
         <w:rPr>
           <w:b/>
@@ -2261,7 +2331,6 @@
         </w:rPr>
         <w:t>ctrl</w:t>
       </w:r>
-      <w:proofErr w:type="spellEnd"/>
       <w:r>
         <w:t xml:space="preserve"> a kliknutím lze vybrat více záznamů, pro které lze hromadně upravit parametry</w:t>
       </w:r>
@@ -2288,7 +2357,7 @@
                     <pic:cNvPicPr/>
                   </pic:nvPicPr>
                   <pic:blipFill>
-                    <a:blip r:embed="rId18"/>
+                    <a:blip r:embed="rId20"/>
                     <a:stretch>
                       <a:fillRect/>
                     </a:stretch>
@@ -2528,7 +2597,6 @@
       <w:r>
         <w:t xml:space="preserve">Klávesa </w:t>
       </w:r>
-      <w:proofErr w:type="spellStart"/>
       <w:r>
         <w:rPr>
           <w:b/>
@@ -2536,7 +2604,6 @@
         </w:rPr>
         <w:t>delete</w:t>
       </w:r>
-      <w:proofErr w:type="spellEnd"/>
       <w:r>
         <w:t xml:space="preserve"> už nemaže záznam, pokud je aktivní prvek rozbalovací / textové pole</w:t>
       </w:r>
@@ -2648,15 +2715,7 @@
       </w:r>
       <w:r>
         <w:br/>
-        <w:t xml:space="preserve">od data vzniku </w:t>
-      </w:r>
-      <w:proofErr w:type="spellStart"/>
-      <w:r>
-        <w:t>předprojektu</w:t>
-      </w:r>
-      <w:proofErr w:type="spellEnd"/>
-      <w:r>
-        <w:t xml:space="preserve"> až po datum převedení na plnohodnotný projekt</w:t>
+        <w:t>od data vzniku předprojektu až po datum převedení na plnohodnotný projekt</w:t>
       </w:r>
     </w:p>
     <w:p>
@@ -2668,15 +2727,7 @@
         </w:numPr>
       </w:pPr>
       <w:r>
-        <w:t xml:space="preserve">V dialogu pro správu projektu přibyl ovládací prvek pro nastavení data </w:t>
-      </w:r>
-      <w:proofErr w:type="spellStart"/>
-      <w:r>
-        <w:t>zplnohodnotnění</w:t>
-      </w:r>
-      <w:proofErr w:type="spellEnd"/>
-      <w:r>
-        <w:t xml:space="preserve"> projektu (pro propsání je třeba zakliknout zaškrtávací pole a tlačítko Uložit)</w:t>
+        <w:t>V dialogu pro správu projektu přibyl ovládací prvek pro nastavení data zplnohodnotnění projektu (pro propsání je třeba zakliknout zaškrtávací pole a tlačítko Uložit)</w:t>
       </w:r>
       <w:r>
         <w:br/>
@@ -2701,7 +2752,7 @@
                     <pic:cNvPicPr/>
                   </pic:nvPicPr>
                   <pic:blipFill>
-                    <a:blip r:embed="rId19"/>
+                    <a:blip r:embed="rId21"/>
                     <a:stretch>
                       <a:fillRect/>
                     </a:stretch>
@@ -2745,15 +2796,7 @@
         <w:t xml:space="preserve">týdne 41 </w:t>
       </w:r>
       <w:r>
-        <w:t xml:space="preserve">bude opravena chyba, kdy se chybně stahuje počet odpracovaných hodin i přes uživatelskou změnu v </w:t>
-      </w:r>
-      <w:proofErr w:type="spellStart"/>
-      <w:r>
-        <w:t>PowerKey</w:t>
-      </w:r>
-      <w:proofErr w:type="spellEnd"/>
-      <w:r>
-        <w:t>, namísto původních reálných dat.</w:t>
+        <w:t>bude opravena chyba, kdy se chybně stahuje počet odpracovaných hodin i přes uživatelskou změnu v PowerKey, namísto původních reálných dat.</w:t>
       </w:r>
       <w:r>
         <w:br/>
@@ -2782,7 +2825,7 @@
                     <pic:cNvPicPr/>
                   </pic:nvPicPr>
                   <pic:blipFill>
-                    <a:blip r:embed="rId20"/>
+                    <a:blip r:embed="rId22"/>
                     <a:stretch>
                       <a:fillRect/>
                     </a:stretch>
@@ -3107,15 +3150,7 @@
         </w:numPr>
       </w:pPr>
       <w:r>
-        <w:t xml:space="preserve">Status připojení k </w:t>
-      </w:r>
-      <w:proofErr w:type="spellStart"/>
-      <w:r>
-        <w:t>powerkey</w:t>
-      </w:r>
-      <w:proofErr w:type="spellEnd"/>
-      <w:r>
-        <w:t xml:space="preserve"> a k síťovému disku – v případě ztracení připojení se místo pádu aplikace zablokují změny, dokud není připojení obnoveno</w:t>
+        <w:t>Status připojení k powerkey a k síťovému disku – v případě ztracení připojení se místo pádu aplikace zablokují změny, dokud není připojení obnoveno</w:t>
       </w:r>
     </w:p>
     <w:p>
@@ -3152,7 +3187,7 @@
                     <pic:cNvPicPr/>
                   </pic:nvPicPr>
                   <pic:blipFill>
-                    <a:blip r:embed="rId21"/>
+                    <a:blip r:embed="rId23"/>
                     <a:stretch>
                       <a:fillRect/>
                     </a:stretch>
@@ -3622,7 +3657,7 @@
                     </pic:cNvPicPr>
                   </pic:nvPicPr>
                   <pic:blipFill>
-                    <a:blip r:embed="rId22">
+                    <a:blip r:embed="rId24">
                       <a:extLst>
                         <a:ext uri="{28A0092B-C50C-407E-A947-70E740481C1C}">
                           <a14:useLocalDpi xmlns:a14="http://schemas.microsoft.com/office/drawing/2010/main" val="0"/>
@@ -3696,7 +3731,7 @@
                     </pic:cNvPicPr>
                   </pic:nvPicPr>
                   <pic:blipFill>
-                    <a:blip r:embed="rId23">
+                    <a:blip r:embed="rId25">
                       <a:extLst>
                         <a:ext uri="{28A0092B-C50C-407E-A947-70E740481C1C}">
                           <a14:useLocalDpi xmlns:a14="http://schemas.microsoft.com/office/drawing/2010/main" val="0"/>
@@ -3789,7 +3824,7 @@
                     <pic:cNvPicPr/>
                   </pic:nvPicPr>
                   <pic:blipFill>
-                    <a:blip r:embed="rId24"/>
+                    <a:blip r:embed="rId26"/>
                     <a:stretch>
                       <a:fillRect/>
                     </a:stretch>
@@ -3954,15 +3989,7 @@
         </w:numPr>
       </w:pPr>
       <w:r>
-        <w:t xml:space="preserve">Změna názvu projektu se projeví na </w:t>
-      </w:r>
-      <w:proofErr w:type="spellStart"/>
-      <w:r>
-        <w:t>nakliknutý</w:t>
-      </w:r>
-      <w:proofErr w:type="spellEnd"/>
-      <w:r>
-        <w:t xml:space="preserve"> projekt i přes to, že existuje záznam se stejným názvem</w:t>
+        <w:t>Změna názvu projektu se projeví na nakliknutý projekt i přes to, že existuje záznam se stejným názvem</w:t>
       </w:r>
     </w:p>
     <w:p>
@@ -4071,13 +4098,8 @@
         <w:t xml:space="preserve">nově </w:t>
       </w:r>
       <w:r>
-        <w:t xml:space="preserve">počítají s časovou kompenzací </w:t>
-      </w:r>
-      <w:proofErr w:type="spellStart"/>
-      <w:r>
-        <w:t>PowerKey</w:t>
-      </w:r>
-      <w:proofErr w:type="spellEnd"/>
+        <w:t>počítají s časovou kompenzací PowerKey</w:t>
+      </w:r>
       <w:r>
         <w:br/>
         <w:t>(6:0</w:t>
@@ -4201,13 +4223,8 @@
           <w:numId w:val="6"/>
         </w:numPr>
       </w:pPr>
-      <w:proofErr w:type="spellStart"/>
-      <w:r>
-        <w:t>Debugovací</w:t>
-      </w:r>
-      <w:proofErr w:type="spellEnd"/>
-      <w:r>
-        <w:t xml:space="preserve"> logování pro identifikaci problémů (ze základu vypnuto)</w:t>
+      <w:r>
+        <w:t>Debugovací logování pro identifikaci problémů (ze základu vypnuto)</w:t>
       </w:r>
     </w:p>
     <w:p>
@@ -4244,13 +4261,8 @@
         </w:numPr>
       </w:pPr>
       <w:r>
-        <w:t xml:space="preserve">Rozšířeno okno pro zobrazení odpracovaných hodin o 10 </w:t>
-      </w:r>
-      <w:proofErr w:type="spellStart"/>
-      <w:r>
-        <w:t>px</w:t>
-      </w:r>
-      <w:proofErr w:type="spellEnd"/>
+        <w:t>Rozšířeno okno pro zobrazení odpracovaných hodin o 10 px</w:t>
+      </w:r>
       <w:r>
         <w:br/>
       </w:r>
@@ -4276,7 +4288,7 @@
                     </pic:cNvPicPr>
                   </pic:nvPicPr>
                   <pic:blipFill>
-                    <a:blip r:embed="rId25">
+                    <a:blip r:embed="rId27">
                       <a:extLst>
                         <a:ext uri="{28A0092B-C50C-407E-A947-70E740481C1C}">
                           <a14:useLocalDpi xmlns:a14="http://schemas.microsoft.com/office/drawing/2010/main" val="0"/>
@@ -4449,7 +4461,7 @@
                     </pic:cNvPicPr>
                   </pic:nvPicPr>
                   <pic:blipFill>
-                    <a:blip r:embed="rId26">
+                    <a:blip r:embed="rId28">
                       <a:extLst>
                         <a:ext uri="{28A0092B-C50C-407E-A947-70E740481C1C}">
                           <a14:useLocalDpi xmlns:a14="http://schemas.microsoft.com/office/drawing/2010/main" val="0"/>
@@ -4506,7 +4518,7 @@
                     <pic:cNvPicPr/>
                   </pic:nvPicPr>
                   <pic:blipFill>
-                    <a:blip r:embed="rId27"/>
+                    <a:blip r:embed="rId29"/>
                     <a:stretch>
                       <a:fillRect/>
                     </a:stretch>
@@ -4655,11 +4667,7 @@
         </w:numPr>
       </w:pPr>
       <w:r>
-        <w:t>V nastaveni (horní lišta =</w:t>
-      </w:r>
-      <w:proofErr w:type="gramStart"/>
-      <w:r>
-        <w:t xml:space="preserve">&gt; </w:t>
+        <w:t xml:space="preserve">V nastaveni (horní lišta =&gt; </w:t>
       </w:r>
       <w:r>
         <w:rPr>
@@ -4668,7 +4676,6 @@
         </w:rPr>
         <w:t>?</w:t>
       </w:r>
-      <w:proofErr w:type="gramEnd"/>
       <w:r>
         <w:t xml:space="preserve"> =&gt; </w:t>
       </w:r>
@@ -4722,7 +4729,7 @@
                     </pic:cNvPicPr>
                   </pic:nvPicPr>
                   <pic:blipFill>
-                    <a:blip r:embed="rId28">
+                    <a:blip r:embed="rId30">
                       <a:extLst>
                         <a:ext uri="{28A0092B-C50C-407E-A947-70E740481C1C}">
                           <a14:useLocalDpi xmlns:a14="http://schemas.microsoft.com/office/drawing/2010/main" val="0"/>
@@ -4764,15 +4771,7 @@
       </w:pPr>
       <w:r>
         <w:lastRenderedPageBreak/>
-        <w:t xml:space="preserve">Aplikace se při uzavření minimalizuje do </w:t>
-      </w:r>
-      <w:proofErr w:type="spellStart"/>
-      <w:r>
-        <w:t>traye</w:t>
-      </w:r>
-      <w:proofErr w:type="spellEnd"/>
-      <w:r>
-        <w:t xml:space="preserve"> (zrychlení načítání, notifikace)</w:t>
+        <w:t>Aplikace se při uzavření minimalizuje do traye (zrychlení načítání, notifikace)</w:t>
       </w:r>
       <w:r>
         <w:br/>
@@ -4799,7 +4798,7 @@
                     </pic:cNvPicPr>
                   </pic:nvPicPr>
                   <pic:blipFill>
-                    <a:blip r:embed="rId29">
+                    <a:blip r:embed="rId31">
                       <a:extLst>
                         <a:ext uri="{28A0092B-C50C-407E-A947-70E740481C1C}">
                           <a14:useLocalDpi xmlns:a14="http://schemas.microsoft.com/office/drawing/2010/main" val="0"/>
@@ -4864,11 +4863,7 @@
         </w:numPr>
       </w:pPr>
       <w:r>
-        <w:t>V nastavení (horní lišta =</w:t>
-      </w:r>
-      <w:proofErr w:type="gramStart"/>
-      <w:r>
-        <w:t xml:space="preserve">&gt; </w:t>
+        <w:t xml:space="preserve">V nastavení (horní lišta =&gt; </w:t>
       </w:r>
       <w:r>
         <w:rPr>
@@ -4877,7 +4872,6 @@
         </w:rPr>
         <w:t>?</w:t>
       </w:r>
-      <w:proofErr w:type="gramEnd"/>
       <w:r>
         <w:t xml:space="preserve"> =&gt; </w:t>
       </w:r>
@@ -4963,7 +4957,7 @@
                     <pic:cNvPicPr/>
                   </pic:nvPicPr>
                   <pic:blipFill>
-                    <a:blip r:embed="rId30"/>
+                    <a:blip r:embed="rId32"/>
                     <a:stretch>
                       <a:fillRect/>
                     </a:stretch>
@@ -5105,7 +5099,7 @@
                     <pic:cNvPicPr/>
                   </pic:nvPicPr>
                   <pic:blipFill>
-                    <a:blip r:embed="rId31"/>
+                    <a:blip r:embed="rId33"/>
                     <a:stretch>
                       <a:fillRect/>
                     </a:stretch>
@@ -5190,7 +5184,7 @@
                     <pic:cNvPicPr/>
                   </pic:nvPicPr>
                   <pic:blipFill>
-                    <a:blip r:embed="rId32"/>
+                    <a:blip r:embed="rId34"/>
                     <a:stretch>
                       <a:fillRect/>
                     </a:stretch>
@@ -5251,15 +5245,7 @@
       </w:pPr>
       <w:r>
         <w:lastRenderedPageBreak/>
-        <w:t xml:space="preserve">Červená =&gt; nesedí s docházkou, </w:t>
-      </w:r>
-      <w:proofErr w:type="gramStart"/>
-      <w:r>
-        <w:t>Zelená</w:t>
-      </w:r>
-      <w:proofErr w:type="gramEnd"/>
-      <w:r>
-        <w:t xml:space="preserve"> =&gt; sedí s docházkou</w:t>
+        <w:t>Červená =&gt; nesedí s docházkou, Zelená =&gt; sedí s docházkou</w:t>
       </w:r>
       <w:r>
         <w:br/>
@@ -5284,7 +5270,7 @@
                     <pic:cNvPicPr/>
                   </pic:nvPicPr>
                   <pic:blipFill>
-                    <a:blip r:embed="rId33"/>
+                    <a:blip r:embed="rId35"/>
                     <a:stretch>
                       <a:fillRect/>
                     </a:stretch>
@@ -5369,7 +5355,7 @@
                     <pic:cNvPicPr/>
                   </pic:nvPicPr>
                   <pic:blipFill>
-                    <a:blip r:embed="rId34"/>
+                    <a:blip r:embed="rId36"/>
                     <a:stretch>
                       <a:fillRect/>
                     </a:stretch>
@@ -5537,7 +5523,7 @@
                     <pic:cNvPicPr/>
                   </pic:nvPicPr>
                   <pic:blipFill>
-                    <a:blip r:embed="rId35"/>
+                    <a:blip r:embed="rId37"/>
                     <a:stretch>
                       <a:fillRect/>
                     </a:stretch>
@@ -5698,13 +5684,8 @@
         <w:t xml:space="preserve">přidány </w:t>
       </w:r>
       <w:r>
-        <w:t xml:space="preserve">sumy hodin z </w:t>
-      </w:r>
-      <w:proofErr w:type="spellStart"/>
-      <w:r>
-        <w:t>PowerKey</w:t>
-      </w:r>
-      <w:proofErr w:type="spellEnd"/>
+        <w:t>sumy hodin z PowerKey</w:t>
+      </w:r>
     </w:p>
     <w:p>
       <w:pPr>
@@ -5723,15 +5704,7 @@
         </w:numPr>
       </w:pPr>
       <w:r>
-        <w:t xml:space="preserve">Při </w:t>
-      </w:r>
-      <w:proofErr w:type="spellStart"/>
-      <w:r>
-        <w:t>překliknutí</w:t>
-      </w:r>
-      <w:proofErr w:type="spellEnd"/>
-      <w:r>
-        <w:t xml:space="preserve"> mezi projektem/provozem se nemazal vysouvací seznam</w:t>
+        <w:t>Při překliknutí mezi projektem/provozem se nemazal vysouvací seznam</w:t>
       </w:r>
     </w:p>
     <w:p>
@@ -5934,15 +5907,7 @@
         <w:t>den zpětně</w:t>
       </w:r>
       <w:r>
-        <w:t xml:space="preserve">; stále se čeká na zpracování od </w:t>
-      </w:r>
-      <w:proofErr w:type="spellStart"/>
-      <w:r>
-        <w:t>Tetroniku</w:t>
-      </w:r>
-      <w:proofErr w:type="spellEnd"/>
-      <w:r>
-        <w:t>)</w:t>
+        <w:t>; stále se čeká na zpracování od Tetroniku)</w:t>
       </w:r>
     </w:p>
     <w:p>
@@ -6063,15 +6028,7 @@
         </w:numPr>
       </w:pPr>
       <w:r>
-        <w:t xml:space="preserve">Po otevření správy indexů se špatně zobrazoval seznam projektů u předtím </w:t>
-      </w:r>
-      <w:proofErr w:type="spellStart"/>
-      <w:r>
-        <w:t>nakliknutého</w:t>
-      </w:r>
-      <w:proofErr w:type="spellEnd"/>
-      <w:r>
-        <w:t xml:space="preserve"> záznamu</w:t>
+        <w:t>Po otevření správy indexů se špatně zobrazoval seznam projektů u předtím nakliknutého záznamu</w:t>
       </w:r>
     </w:p>
     <w:p>
@@ -6118,7 +6075,7 @@
                     </pic:cNvPicPr>
                   </pic:nvPicPr>
                   <pic:blipFill>
-                    <a:blip r:embed="rId36">
+                    <a:blip r:embed="rId38">
                       <a:extLst>
                         <a:ext uri="{28A0092B-C50C-407E-A947-70E740481C1C}">
                           <a14:useLocalDpi xmlns:a14="http://schemas.microsoft.com/office/drawing/2010/main" val="0"/>
@@ -6195,13 +6152,8 @@
           <w:numId w:val="1"/>
         </w:numPr>
       </w:pPr>
-      <w:proofErr w:type="spellStart"/>
-      <w:r>
-        <w:t>Esc</w:t>
-      </w:r>
-      <w:proofErr w:type="spellEnd"/>
-      <w:r>
-        <w:t xml:space="preserve"> – uzavření vysouvacího seznamu</w:t>
+      <w:r>
+        <w:t>Esc – uzavření vysouvacího seznamu</w:t>
       </w:r>
     </w:p>
     <w:p>
@@ -6251,7 +6203,7 @@
                     <pic:cNvPicPr/>
                   </pic:nvPicPr>
                   <pic:blipFill>
-                    <a:blip r:embed="rId37"/>
+                    <a:blip r:embed="rId39"/>
                     <a:stretch>
                       <a:fillRect/>
                     </a:stretch>
@@ -6298,15 +6250,7 @@
         </w:numPr>
       </w:pPr>
       <w:r>
-        <w:t>Lze mazat více položek najednou (</w:t>
-      </w:r>
-      <w:proofErr w:type="spellStart"/>
-      <w:r>
-        <w:t>multivýběr</w:t>
-      </w:r>
-      <w:proofErr w:type="spellEnd"/>
-      <w:r>
-        <w:t xml:space="preserve"> pomocí modifikátoru </w:t>
+        <w:t xml:space="preserve">Lze mazat více položek najednou (multivýběr pomocí modifikátoru </w:t>
       </w:r>
       <w:r>
         <w:t>Ctrl</w:t>
@@ -6342,15 +6286,7 @@
         </w:numPr>
       </w:pPr>
       <w:r>
-        <w:t xml:space="preserve">Pro </w:t>
-      </w:r>
-      <w:proofErr w:type="spellStart"/>
-      <w:r>
-        <w:t>info</w:t>
-      </w:r>
-      <w:proofErr w:type="spellEnd"/>
-      <w:r>
-        <w:t>:</w:t>
+        <w:t>Pro info:</w:t>
       </w:r>
     </w:p>
     <w:p>
@@ -6471,26 +6407,10 @@
         </w:numPr>
       </w:pPr>
       <w:r>
-        <w:t xml:space="preserve">Při zpětné </w:t>
-      </w:r>
-      <w:proofErr w:type="spellStart"/>
-      <w:r>
-        <w:t>úprave</w:t>
-      </w:r>
-      <w:proofErr w:type="spellEnd"/>
-      <w:r>
-        <w:t xml:space="preserve"> zakázky </w:t>
-      </w:r>
-      <w:r>
-        <w:t xml:space="preserve">(dříve </w:t>
-      </w:r>
-      <w:proofErr w:type="spellStart"/>
-      <w:r>
-        <w:t>předprojektu</w:t>
-      </w:r>
-      <w:proofErr w:type="spellEnd"/>
-      <w:r>
-        <w:t xml:space="preserve">) </w:t>
+        <w:t xml:space="preserve">Při zpětné úprave zakázky </w:t>
+      </w:r>
+      <w:r>
+        <w:t xml:space="preserve">(dříve předprojektu) </w:t>
       </w:r>
       <w:r>
         <w:t>se špatně vybrala záložka ŠKOLENÍ, namísto PROJEKT</w:t>
@@ -6746,7 +6666,7 @@
                     <pic:cNvPicPr/>
                   </pic:nvPicPr>
                   <pic:blipFill>
-                    <a:blip r:embed="rId38"/>
+                    <a:blip r:embed="rId40"/>
                     <a:stretch>
                       <a:fillRect/>
                     </a:stretch>
@@ -6804,13 +6724,8 @@
         </w:numPr>
       </w:pPr>
       <w:r>
-        <w:t xml:space="preserve">Sloučení projektů a </w:t>
-      </w:r>
-      <w:proofErr w:type="spellStart"/>
-      <w:r>
-        <w:t>předprojektů</w:t>
-      </w:r>
-      <w:proofErr w:type="spellEnd"/>
+        <w:t>Sloučení projektů a předprojektů</w:t>
+      </w:r>
       <w:r>
         <w:br/>
       </w:r>
@@ -6836,7 +6751,7 @@
                     </pic:cNvPicPr>
                   </pic:nvPicPr>
                   <pic:blipFill>
-                    <a:blip r:embed="rId39">
+                    <a:blip r:embed="rId41">
                       <a:extLst>
                         <a:ext uri="{28A0092B-C50C-407E-A947-70E740481C1C}">
                           <a14:useLocalDpi xmlns:a14="http://schemas.microsoft.com/office/drawing/2010/main" val="0"/>
@@ -7144,13 +7059,8 @@
           <w:numId w:val="1"/>
         </w:numPr>
       </w:pPr>
-      <w:proofErr w:type="spellStart"/>
-      <w:r>
-        <w:t>Changelog</w:t>
-      </w:r>
-      <w:proofErr w:type="spellEnd"/>
-      <w:r>
-        <w:t xml:space="preserve"> oddělení verzí každá na separátní stránku</w:t>
+      <w:r>
+        <w:t>Changelog oddělení verzí každá na separátní stránku</w:t>
       </w:r>
     </w:p>
     <w:p>
@@ -7245,15 +7155,7 @@
         </w:numPr>
       </w:pPr>
       <w:r>
-        <w:t xml:space="preserve">Při </w:t>
-      </w:r>
-      <w:proofErr w:type="spellStart"/>
-      <w:r>
-        <w:t>překliknutí</w:t>
-      </w:r>
-      <w:proofErr w:type="spellEnd"/>
-      <w:r>
-        <w:t xml:space="preserve"> ze svačiny na nevyplněný záznam se už správně načítá postranní panel</w:t>
+        <w:t>Při překliknutí ze svačiny na nevyplněný záznam se už správně načítá postranní panel</w:t>
       </w:r>
     </w:p>
     <w:p>
@@ -7355,11 +7257,9 @@
           <w:numId w:val="2"/>
         </w:numPr>
       </w:pPr>
-      <w:proofErr w:type="spellStart"/>
       <w:r>
         <w:t>Updatování</w:t>
       </w:r>
-      <w:proofErr w:type="spellEnd"/>
     </w:p>
     <w:p>
       <w:pPr>
@@ -7678,11 +7578,9 @@
           <w:numId w:val="1"/>
         </w:numPr>
       </w:pPr>
-      <w:proofErr w:type="spellStart"/>
       <w:r>
         <w:t>Changelog</w:t>
       </w:r>
-      <w:proofErr w:type="spellEnd"/>
     </w:p>
     <w:p>
       <w:pPr>
@@ -7713,15 +7611,7 @@
         </w:numPr>
       </w:pPr>
       <w:r>
-        <w:t xml:space="preserve">Nenačítání kalendáře “MĚSÍC” při </w:t>
-      </w:r>
-      <w:proofErr w:type="spellStart"/>
-      <w:r>
-        <w:t>úprave</w:t>
-      </w:r>
-      <w:proofErr w:type="spellEnd"/>
-      <w:r>
-        <w:t xml:space="preserve"> v kalendáři “TÝDEN”</w:t>
+        <w:t>Nenačítání kalendáře “MĚSÍC” při úprave v kalendáři “TÝDEN”</w:t>
       </w:r>
     </w:p>
     <w:p>

</xml_diff>